<commit_message>
Correct FusionVI statistical interpretation
</commit_message>
<xml_diff>
--- a/deliverables/FusionVI_All_Experiments_Technical_Report.docx
+++ b/deliverables/FusionVI_All_Experiments_Technical_Report.docx
@@ -425,7 +425,7 @@
                 <w:rFonts w:ascii="Arial" w:hAnsi="Arial"/>
                 <w:sz w:val="17"/>
               </w:rPr>
-              <w:t>Native FusionVI improved modestly; fixed cross-modal readouts were nearly tied</w:t>
+              <w:t>Protein context + RNA reached 0.670; either latent added no more than 0.003</w:t>
             </w:r>
           </w:p>
         </w:tc>
@@ -511,7 +511,7 @@
                 <w:rFonts w:ascii="Arial" w:hAnsi="Arial"/>
                 <w:sz w:val="17"/>
               </w:rPr>
-              <w:t>RMSLE 1.0605 to 1.0544 with 35% fewer parameters</w:t>
+              <w:t>RMSLE difference -0.0060; seed-level 95% CI crossed zero</w:t>
             </w:r>
           </w:p>
         </w:tc>
@@ -2431,6 +2431,120 @@
           </w:p>
         </w:tc>
       </w:tr>
+      <w:tr>
+        <w:tc>
+          <w:tcPr>
+            <w:tcW w:type="dxa" w:w="4464"/>
+            <w:vAlign w:val="center"/>
+            <w:tcBorders>
+              <w:top w:val="single" w:sz="5" w:color="D9D9D9"/>
+              <w:left w:val="single" w:sz="5" w:color="D9D9D9"/>
+              <w:bottom w:val="single" w:sz="5" w:color="D9D9D9"/>
+              <w:right w:val="single" w:sz="5" w:color="D9D9D9"/>
+              <w:insideH w:val="single" w:sz="5" w:color="D9D9D9"/>
+              <w:insideV w:val="single" w:sz="5" w:color="D9D9D9"/>
+            </w:tcBorders>
+            <w:shd w:fill="FFFFFF"/>
+          </w:tcPr>
+          <w:p>
+            <w:pPr>
+              <w:spacing w:before="60" w:after="60" w:line="240" w:lineRule="auto"/>
+              <w:jc w:val="left"/>
+            </w:pPr>
+            <w:r>
+              <w:rPr>
+                <w:rFonts w:ascii="Arial" w:hAnsi="Arial"/>
+                <w:sz w:val="17"/>
+              </w:rPr>
+              <w:t>Protein context + matching RNA</w:t>
+            </w:r>
+          </w:p>
+        </w:tc>
+        <w:tc>
+          <w:tcPr>
+            <w:tcW w:type="dxa" w:w="1728"/>
+            <w:vAlign w:val="center"/>
+            <w:tcBorders>
+              <w:top w:val="single" w:sz="5" w:color="D9D9D9"/>
+              <w:left w:val="single" w:sz="5" w:color="D9D9D9"/>
+              <w:bottom w:val="single" w:sz="5" w:color="D9D9D9"/>
+              <w:right w:val="single" w:sz="5" w:color="D9D9D9"/>
+              <w:insideH w:val="single" w:sz="5" w:color="D9D9D9"/>
+              <w:insideV w:val="single" w:sz="5" w:color="D9D9D9"/>
+            </w:tcBorders>
+            <w:shd w:fill="FFFFFF"/>
+          </w:tcPr>
+          <w:p>
+            <w:pPr>
+              <w:spacing w:before="60" w:after="60" w:line="240" w:lineRule="auto"/>
+              <w:jc w:val="center"/>
+            </w:pPr>
+            <w:r>
+              <w:rPr>
+                <w:rFonts w:ascii="Arial" w:hAnsi="Arial"/>
+                <w:sz w:val="17"/>
+              </w:rPr>
+              <w:t>0.670</w:t>
+            </w:r>
+          </w:p>
+        </w:tc>
+        <w:tc>
+          <w:tcPr>
+            <w:tcW w:type="dxa" w:w="1728"/>
+            <w:vAlign w:val="center"/>
+            <w:tcBorders>
+              <w:top w:val="single" w:sz="5" w:color="D9D9D9"/>
+              <w:left w:val="single" w:sz="5" w:color="D9D9D9"/>
+              <w:bottom w:val="single" w:sz="5" w:color="D9D9D9"/>
+              <w:right w:val="single" w:sz="5" w:color="D9D9D9"/>
+              <w:insideH w:val="single" w:sz="5" w:color="D9D9D9"/>
+              <w:insideV w:val="single" w:sz="5" w:color="D9D9D9"/>
+            </w:tcBorders>
+            <w:shd w:fill="FFFFFF"/>
+          </w:tcPr>
+          <w:p>
+            <w:pPr>
+              <w:spacing w:before="60" w:after="60" w:line="240" w:lineRule="auto"/>
+              <w:jc w:val="center"/>
+            </w:pPr>
+            <w:r>
+              <w:rPr>
+                <w:rFonts w:ascii="Arial" w:hAnsi="Arial"/>
+                <w:sz w:val="17"/>
+              </w:rPr>
+              <w:t>0.670</w:t>
+            </w:r>
+          </w:p>
+        </w:tc>
+        <w:tc>
+          <w:tcPr>
+            <w:tcW w:type="dxa" w:w="1728"/>
+            <w:vAlign w:val="center"/>
+            <w:tcBorders>
+              <w:top w:val="single" w:sz="5" w:color="D9D9D9"/>
+              <w:left w:val="single" w:sz="5" w:color="D9D9D9"/>
+              <w:bottom w:val="single" w:sz="5" w:color="D9D9D9"/>
+              <w:right w:val="single" w:sz="5" w:color="D9D9D9"/>
+              <w:insideH w:val="single" w:sz="5" w:color="D9D9D9"/>
+              <w:insideV w:val="single" w:sz="5" w:color="D9D9D9"/>
+            </w:tcBorders>
+            <w:shd w:fill="FFFFFF"/>
+          </w:tcPr>
+          <w:p>
+            <w:pPr>
+              <w:spacing w:before="60" w:after="60" w:line="240" w:lineRule="auto"/>
+              <w:jc w:val="center"/>
+            </w:pPr>
+            <w:r>
+              <w:rPr>
+                <w:rFonts w:ascii="Arial" w:hAnsi="Arial"/>
+                <w:sz w:val="17"/>
+              </w:rPr>
+              <w:t>shared baseline</w:t>
+            </w:r>
+          </w:p>
+        </w:tc>
+      </w:tr>
     </w:tbl>
     <w:p>
       <w:pPr>
@@ -2446,12 +2560,12 @@
           <w:b/>
           <w:color w:val="C2410C"/>
         </w:rPr>
-        <w:t>Result  Native FusionVI improved modestly; the fixed cross-modal readouts were effectively tied.</w:t>
+        <w:t>Result  Most cross-mouse performance came from measured protein context, not either latent.</w:t>
       </w:r>
     </w:p>
     <w:p>
       <w:r>
-        <w:t>This corrects an earlier summary that compared FusionVI-X with native totalVI. The fair comparisons are native against native and X-readout against X-readout. Because the dataset contains only two mice, it supports technical transfer rather than a population-level biological claim.</w:t>
+        <w:t>The remaining 106 proteins plus matching transcript reached 0.670. Adding totalVI or FusionVI latents changed mean Spearman by only 0.002 and 0.003. Because the dataset contains only two mice, it supports technical transfer rather than a population-level biological claim.</w:t>
       </w:r>
     </w:p>
     <w:p>
@@ -3024,12 +3138,12 @@
           <w:b/>
           <w:color w:val="C2410C"/>
         </w:rPr>
-        <w:t>Result  FusionVI reduced mean RMSLE by 0.57% with 35.0% fewer parameters.</w:t>
+        <w:t>Result  FusionVI's mean RMSLE was 0.57% lower, but the seed-level interval included zero.</w:t>
       </w:r>
     </w:p>
     <w:p>
       <w:r>
-        <w:t>FusionVI had lower RMSLE for 74 of 110 proteins. The paired protein-level Wilcoxon p-value was 1.04e-05; it is descriptive because proteins and seeds are algorithmic units rather than independent biological cohorts. MAE improved, while rank and linear correlations were slightly lower. The supported claim is lower reconstruction error, not universal metric superiority.</w:t>
+        <w:t>The seed-paired difference was -0.0060 (95% CI -0.0176 to +0.0056; paired t p=0.20; exact p=0.25). Three of four seeds favored FusionVI. The protein-level p=1.04e-05 is descriptive because proteins are repeated outcomes. The 35.0% parameter difference mostly reflects width 128 versus 256 and removal of totalVI's separate library encoder. Same-width, parameter-matched and missingness-aware controls are required to isolate fusion.</w:t>
       </w:r>
     </w:p>
     <w:p>
@@ -3100,7 +3214,7 @@
     </w:p>
     <w:p>
       <w:r>
-        <w:t>The experiments support a narrow and biologically coherent contribution. Separating modality encoders can help when the test condition creates a true modality-availability shift. When other proteins remain available, a donor- or target-safe cross-modal readout often contributes more than the encoder itself. The Papalexi result further shows that multimodal context can rank unseen PD-L1 perturbation effects, while the CMTM6 failure exposes a post-transcriptional boundary.</w:t>
+        <w:t>The experiments support a narrow and biologically coherent contribution. The complete-panel experiment suggests a small candidate benefit, but four seeds and unequal capacity do not yet identify gated fusion as its cause. When other proteins remain available, measured protein context often contributes more than the learned latent. The Papalexi result shows that multimodal context can rank unseen PD-L1 perturbation effects, while the CMTM6 failure exposes a post-transcriptional boundary.</w:t>
       </w:r>
     </w:p>
     <w:p>
@@ -3108,7 +3222,7 @@
         <w:pStyle w:val="ListBullet"/>
       </w:pPr>
       <w:r>
-        <w:t>Positive result: lower full-panel reconstruction error with fewer parameters.</w:t>
+        <w:t>Candidate result: lower mean full-panel reconstruction error, with uncertainty spanning zero.</w:t>
       </w:r>
     </w:p>
     <w:p>
@@ -3178,6 +3292,22 @@
       </w:pPr>
       <w:r>
         <w:t>Complete-panel benchmark: one source-target batch pair and four seeds rather than the paper's 30.</w:t>
+      </w:r>
+    </w:p>
+    <w:p>
+      <w:pPr>
+        <w:pStyle w:val="ListBullet"/>
+      </w:pPr>
+      <w:r>
+        <w:t>The original complete-panel comparison differs in encoder width and library-network design; control arms are running.</w:t>
+      </w:r>
+    </w:p>
+    <w:p>
+      <w:pPr>
+        <w:pStyle w:val="ListBullet"/>
+      </w:pPr>
+      <w:r>
+        <w:t>Seed-level inference is primary; per-protein tests are descriptive repeated-outcome summaries.</w:t>
       </w:r>
     </w:p>
     <w:p>

</xml_diff>

<commit_message>
Update report and presentation
</commit_message>
<xml_diff>
--- a/deliverables/FusionVI_All_Experiments_Technical_Report.docx
+++ b/deliverables/FusionVI_All_Experiments_Technical_Report.docx
@@ -44,7 +44,7 @@
     </w:p>
     <w:p>
       <w:r>
-        <w:t>FusionVI tests whether modality-specific encoding improves recovery of therapeutic surface biomarkers when protein measurements are hidden, discordant with RNA or observed under an unseen perturbation. Four completed experiments cover held-out human donors, held-out CRISPR targets, cross-mouse transfer and the full missing-protein-panel benchmark from the totalVI paper. The evidence is deliberately mixed: FusionVI is useful under a true missing-modality shift and in the PD-L1 perturbation task, while targeted marker studies show that a leakage-safe cross-modal readout often matters more than the encoder. These results support a bounded biomarker-completion and perturbation-ranking contribution.</w:t>
+        <w:t>FusionVI tests whether modality-specific encoding improves recovery of therapeutic surface biomarkers when protein measurements are hidden, discordant with RNA or observed under an unseen perturbation. Four completed experiments cover held-out human donors, held-out CRISPR targets, cross-mouse transfer and the full missing-protein-panel benchmark from the totalVI paper. The evidence is deliberately mixed: multimodal context is useful in the PD-L1 perturbation task, while targeted marker studies show that measured protein context often matters more than the learned latent. The apparent missing-panel benefit is small and still requires capacity controls. These results support a bounded biomarker-completion and perturbation-ranking contribution.</w:t>
       </w:r>
     </w:p>
     <w:p>
@@ -425,7 +425,7 @@
                 <w:rFonts w:ascii="Arial" w:hAnsi="Arial"/>
                 <w:sz w:val="17"/>
               </w:rPr>
-              <w:t>Native FusionVI improved modestly; fixed cross-modal readouts were nearly tied</w:t>
+              <w:t>Protein context + RNA reached 0.670; either latent added no more than 0.003</w:t>
             </w:r>
           </w:p>
         </w:tc>
@@ -511,7 +511,7 @@
                 <w:rFonts w:ascii="Arial" w:hAnsi="Arial"/>
                 <w:sz w:val="17"/>
               </w:rPr>
-              <w:t>RMSLE 1.0605 to 1.0544 with 35% fewer parameters</w:t>
+              <w:t>RMSLE difference -0.0060; seed-level 95% CI crossed zero</w:t>
             </w:r>
           </w:p>
         </w:tc>
@@ -2431,6 +2431,120 @@
           </w:p>
         </w:tc>
       </w:tr>
+      <w:tr>
+        <w:tc>
+          <w:tcPr>
+            <w:tcW w:type="dxa" w:w="4464"/>
+            <w:vAlign w:val="center"/>
+            <w:tcBorders>
+              <w:top w:val="single" w:sz="5" w:color="D9D9D9"/>
+              <w:left w:val="single" w:sz="5" w:color="D9D9D9"/>
+              <w:bottom w:val="single" w:sz="5" w:color="D9D9D9"/>
+              <w:right w:val="single" w:sz="5" w:color="D9D9D9"/>
+              <w:insideH w:val="single" w:sz="5" w:color="D9D9D9"/>
+              <w:insideV w:val="single" w:sz="5" w:color="D9D9D9"/>
+            </w:tcBorders>
+            <w:shd w:fill="FFFFFF"/>
+          </w:tcPr>
+          <w:p>
+            <w:pPr>
+              <w:spacing w:before="60" w:after="60" w:line="240" w:lineRule="auto"/>
+              <w:jc w:val="left"/>
+            </w:pPr>
+            <w:r>
+              <w:rPr>
+                <w:rFonts w:ascii="Arial" w:hAnsi="Arial"/>
+                <w:sz w:val="17"/>
+              </w:rPr>
+              <w:t>Protein context + matching RNA</w:t>
+            </w:r>
+          </w:p>
+        </w:tc>
+        <w:tc>
+          <w:tcPr>
+            <w:tcW w:type="dxa" w:w="1728"/>
+            <w:vAlign w:val="center"/>
+            <w:tcBorders>
+              <w:top w:val="single" w:sz="5" w:color="D9D9D9"/>
+              <w:left w:val="single" w:sz="5" w:color="D9D9D9"/>
+              <w:bottom w:val="single" w:sz="5" w:color="D9D9D9"/>
+              <w:right w:val="single" w:sz="5" w:color="D9D9D9"/>
+              <w:insideH w:val="single" w:sz="5" w:color="D9D9D9"/>
+              <w:insideV w:val="single" w:sz="5" w:color="D9D9D9"/>
+            </w:tcBorders>
+            <w:shd w:fill="FFFFFF"/>
+          </w:tcPr>
+          <w:p>
+            <w:pPr>
+              <w:spacing w:before="60" w:after="60" w:line="240" w:lineRule="auto"/>
+              <w:jc w:val="center"/>
+            </w:pPr>
+            <w:r>
+              <w:rPr>
+                <w:rFonts w:ascii="Arial" w:hAnsi="Arial"/>
+                <w:sz w:val="17"/>
+              </w:rPr>
+              <w:t>0.670</w:t>
+            </w:r>
+          </w:p>
+        </w:tc>
+        <w:tc>
+          <w:tcPr>
+            <w:tcW w:type="dxa" w:w="1728"/>
+            <w:vAlign w:val="center"/>
+            <w:tcBorders>
+              <w:top w:val="single" w:sz="5" w:color="D9D9D9"/>
+              <w:left w:val="single" w:sz="5" w:color="D9D9D9"/>
+              <w:bottom w:val="single" w:sz="5" w:color="D9D9D9"/>
+              <w:right w:val="single" w:sz="5" w:color="D9D9D9"/>
+              <w:insideH w:val="single" w:sz="5" w:color="D9D9D9"/>
+              <w:insideV w:val="single" w:sz="5" w:color="D9D9D9"/>
+            </w:tcBorders>
+            <w:shd w:fill="FFFFFF"/>
+          </w:tcPr>
+          <w:p>
+            <w:pPr>
+              <w:spacing w:before="60" w:after="60" w:line="240" w:lineRule="auto"/>
+              <w:jc w:val="center"/>
+            </w:pPr>
+            <w:r>
+              <w:rPr>
+                <w:rFonts w:ascii="Arial" w:hAnsi="Arial"/>
+                <w:sz w:val="17"/>
+              </w:rPr>
+              <w:t>0.670</w:t>
+            </w:r>
+          </w:p>
+        </w:tc>
+        <w:tc>
+          <w:tcPr>
+            <w:tcW w:type="dxa" w:w="1728"/>
+            <w:vAlign w:val="center"/>
+            <w:tcBorders>
+              <w:top w:val="single" w:sz="5" w:color="D9D9D9"/>
+              <w:left w:val="single" w:sz="5" w:color="D9D9D9"/>
+              <w:bottom w:val="single" w:sz="5" w:color="D9D9D9"/>
+              <w:right w:val="single" w:sz="5" w:color="D9D9D9"/>
+              <w:insideH w:val="single" w:sz="5" w:color="D9D9D9"/>
+              <w:insideV w:val="single" w:sz="5" w:color="D9D9D9"/>
+            </w:tcBorders>
+            <w:shd w:fill="FFFFFF"/>
+          </w:tcPr>
+          <w:p>
+            <w:pPr>
+              <w:spacing w:before="60" w:after="60" w:line="240" w:lineRule="auto"/>
+              <w:jc w:val="center"/>
+            </w:pPr>
+            <w:r>
+              <w:rPr>
+                <w:rFonts w:ascii="Arial" w:hAnsi="Arial"/>
+                <w:sz w:val="17"/>
+              </w:rPr>
+              <w:t>shared baseline</w:t>
+            </w:r>
+          </w:p>
+        </w:tc>
+      </w:tr>
     </w:tbl>
     <w:p>
       <w:pPr>
@@ -2446,12 +2560,12 @@
           <w:b/>
           <w:color w:val="C2410C"/>
         </w:rPr>
-        <w:t>Result  Native FusionVI improved modestly; the fixed cross-modal readouts were effectively tied.</w:t>
+        <w:t>Result  Most cross-mouse performance came from measured protein context, not either latent.</w:t>
       </w:r>
     </w:p>
     <w:p>
       <w:r>
-        <w:t>This corrects an earlier summary that compared FusionVI-X with native totalVI. The fair comparisons are native against native and X-readout against X-readout. Because the dataset contains only two mice, it supports technical transfer rather than a population-level biological claim.</w:t>
+        <w:t>The remaining 106 proteins plus matching transcript reached 0.670. Adding totalVI or FusionVI latents changed mean Spearman by only 0.002 and 0.003. Because the dataset contains only two mice, it supports technical transfer rather than a population-level biological claim.</w:t>
       </w:r>
     </w:p>
     <w:p>
@@ -3024,12 +3138,12 @@
           <w:b/>
           <w:color w:val="C2410C"/>
         </w:rPr>
-        <w:t>Result  FusionVI reduced mean RMSLE by 0.57% with 35.0% fewer parameters.</w:t>
+        <w:t>Result  FusionVI's mean RMSLE was 0.57% lower, but the seed-level interval included zero.</w:t>
       </w:r>
     </w:p>
     <w:p>
       <w:r>
-        <w:t>FusionVI had lower RMSLE for 74 of 110 proteins. The paired protein-level Wilcoxon p-value was 1.04e-05; it is descriptive because proteins and seeds are algorithmic units rather than independent biological cohorts. MAE improved, while rank and linear correlations were slightly lower. The supported claim is lower reconstruction error, not universal metric superiority.</w:t>
+        <w:t>The seed-paired difference was -0.0060 (95% CI -0.0176 to +0.0056; paired t p=0.20; exact p=0.25). Three of four seeds favored FusionVI. The protein-level p=1.04e-05 is descriptive because proteins are repeated outcomes. The 35.0% parameter difference mostly reflects width 128 versus 256 and removal of totalVI's separate library encoder. Same-width, parameter-matched and missingness-aware controls are required to isolate fusion.</w:t>
       </w:r>
     </w:p>
     <w:p>
@@ -3100,7 +3214,7 @@
     </w:p>
     <w:p>
       <w:r>
-        <w:t>The experiments support a narrow and biologically coherent contribution. Separating modality encoders can help when the test condition creates a true modality-availability shift. When other proteins remain available, a donor- or target-safe cross-modal readout often contributes more than the encoder itself. The Papalexi result further shows that multimodal context can rank unseen PD-L1 perturbation effects, while the CMTM6 failure exposes a post-transcriptional boundary.</w:t>
+        <w:t>The experiments support a narrow and biologically coherent contribution. The complete-panel experiment suggests a small candidate benefit, but four seeds and unequal capacity do not yet identify gated fusion as its cause. When other proteins remain available, measured protein context often contributes more than the learned latent. The Papalexi result shows that multimodal context can rank unseen PD-L1 perturbation effects, while the CMTM6 failure exposes a post-transcriptional boundary.</w:t>
       </w:r>
     </w:p>
     <w:p>
@@ -3108,7 +3222,7 @@
         <w:pStyle w:val="ListBullet"/>
       </w:pPr>
       <w:r>
-        <w:t>Positive result: lower full-panel reconstruction error with fewer parameters.</w:t>
+        <w:t>Candidate result: lower mean full-panel reconstruction error, with uncertainty spanning zero.</w:t>
       </w:r>
     </w:p>
     <w:p>
@@ -3178,6 +3292,22 @@
       </w:pPr>
       <w:r>
         <w:t>Complete-panel benchmark: one source-target batch pair and four seeds rather than the paper's 30.</w:t>
+      </w:r>
+    </w:p>
+    <w:p>
+      <w:pPr>
+        <w:pStyle w:val="ListBullet"/>
+      </w:pPr>
+      <w:r>
+        <w:t>The original complete-panel comparison differs in encoder width and library-network design; control arms are running.</w:t>
+      </w:r>
+    </w:p>
+    <w:p>
+      <w:pPr>
+        <w:pStyle w:val="ListBullet"/>
+      </w:pPr>
+      <w:r>
+        <w:t>Seed-level inference is primary; per-protein tests are descriptive repeated-outcome summaries.</w:t>
       </w:r>
     </w:p>
     <w:p>

</xml_diff>

<commit_message>
Repair FusionVI reproducibility and evaluation
</commit_message>
<xml_diff>
--- a/deliverables/FusionVI_All_Experiments_Technical_Report.docx
+++ b/deliverables/FusionVI_All_Experiments_Technical_Report.docx
@@ -44,7 +44,7 @@
     </w:p>
     <w:p>
       <w:r>
-        <w:t>FusionVI tests whether modality-specific encoding improves recovery of therapeutic surface biomarkers when protein measurements are hidden, discordant with RNA or observed under an unseen perturbation. Four completed experiments cover held-out human donors, held-out CRISPR targets, cross-mouse transfer and the full missing-protein-panel benchmark from the totalVI paper. The evidence is deliberately mixed: multimodal context is useful in the PD-L1 perturbation task, while targeted marker studies show that measured protein context often matters more than the learned latent. The apparent missing-panel benefit is small and still requires capacity controls. These results support a bounded biomarker-completion and perturbation-ranking contribution.</w:t>
+        <w:t>FusionVI tests whether modality-specific encoding improves recovery of therapeutic surface biomarkers when protein measurements are hidden, discordant with RNA or observed under an unseen perturbation. Four completed experiments cover held-out human donors, held-out CRISPR targets, cross-mouse transfer and the full missing-protein-panel benchmark from the totalVI paper. The evidence is deliberately mixed: multimodal context is useful in the PD-L1 perturbation task, while targeted marker studies show that measured protein context often matters more than the learned latent. The apparent missing-panel difference is small, and a source-only RNA ridge baseline outperforms both neural models on aggregate RMSLE. These results support a bounded biomarker-completion and perturbation-ranking contribution.</w:t>
       </w:r>
     </w:p>
     <w:p>
@@ -511,7 +511,7 @@
                 <w:rFonts w:ascii="Arial" w:hAnsi="Arial"/>
                 <w:sz w:val="17"/>
               </w:rPr>
-              <w:t>RMSLE difference -0.0060; seed-level 95% CI crossed zero</w:t>
+              <w:t>RNA ridge RMSLE 0.638; both neural models were about 1.06</w:t>
             </w:r>
           </w:p>
         </w:tc>
@@ -1255,7 +1255,7 @@
     </w:p>
     <w:p>
       <w:r>
-        <w:t>Can PD-L1 protein effects be predicted for a perturbation absent from training? The ECCITE-seq screen contains 20,729 IFN-gamma-treated THP-1 cells, 25 perturbation targets, three biological replicates and four surface proteins. Five outer folds held out complete CRISPR targets. Evaluation used 75 target-by-replicate effects.</w:t>
+        <w:t>Given a held-out perturbation cell's RNA and three measured proteins, can its hidden PD-L1 response be recovered? The ECCITE-seq screen contains 20,729 IFN-gamma-treated THP-1 cells, 25 perturbation targets, three biological replicates and four surface proteins. Five outer folds held out complete CRISPR targets. At test time, each cell's RNA and the other three measured proteins remain inputs; only PD-L1 is hidden, and the perturbation-target label is not used. Evaluation used 75 target-by-replicate effects.</w:t>
       </w:r>
     </w:p>
     <w:tbl>
@@ -1982,7 +1982,7 @@
     </w:p>
     <w:p>
       <w:r>
-        <w:t>FusionVI-X reduced median gene-level absolute error by 0.0042 relative to totalVI-X (paired Wilcoxon p=0.042, 25 targets). It recovered expected PD-L1 loss after IFNGR1, IFNGR2, JAK2 and STAT1 perturbation and gain after CUL3 or BRD4 perturbation.</w:t>
+        <w:t>FusionVI-X reduced median per-target PD-L1 effect absolute error by 0.0042 relative to totalVI-X after replicate averaging (paired Wilcoxon p=0.042, 25 targets). A 5,000-sample target-cluster bootstrap estimated FusionVI-X effect Spearman at 0.879 (95% CI 0.728 to 0.967) and its difference from totalVI-X at +0.038 (95% CI +0.011 to +0.083). The MAE-difference interval included zero. It recovered expected PD-L1 loss after IFNGR1, IFNGR2, JAK2 and STAT1 perturbation and gain after CUL3 or BRD4 perturbation.</w:t>
       </w:r>
     </w:p>
     <w:p>
@@ -3147,6 +3147,11 @@
       </w:r>
     </w:p>
     <w:p>
+      <w:r>
+        <w:t>A source-only RNA baseline fit a 128-component SVD and multi-output ridge on D1, selected its penalty on a D1 validation split, and reached mean D2 protein RMSLE 0.6379. This is substantially below totalVI (1.0605) and FusionVI (1.0544). Source-defined marker AUROC was 0.976 for CD4, 0.990 for CD8 and 0.995 for CD19, but mean within-cell-type Spearman was only 0.169. Aggregate marker separation therefore does not imply recovery of subtle within-cell-state variation. Paired modality-dropout arms now test whether supervised RNA-only latents close this gap.</w:t>
+      </w:r>
+    </w:p>
+    <w:p>
       <w:pPr>
         <w:keepNext/>
         <w:jc w:val="center"/>
@@ -3214,7 +3219,7 @@
     </w:p>
     <w:p>
       <w:r>
-        <w:t>The experiments support a narrow and biologically coherent contribution. The complete-panel experiment suggests a small candidate benefit, but four seeds and unequal capacity do not yet identify gated fusion as its cause. When other proteins remain available, measured protein context often contributes more than the learned latent. The Papalexi result shows that multimodal context can rank unseen PD-L1 perturbation effects, while the CMTM6 failure exposes a post-transcriptional boundary.</w:t>
+        <w:t>The experiments support a narrow and biologically coherent contribution. The complete-panel experiment shows a small FusionVI-versus-totalVI difference, but four seeds and unequal capacity do not identify gated fusion as its cause, and an RNA ridge baseline performs substantially better than both. When other proteins remain available, measured protein context often contributes more than the learned latent. The Papalexi result shows that multimodal context can rank unseen PD-L1 perturbation effects, while the CMTM6 failure exposes a post-transcriptional boundary.</w:t>
       </w:r>
     </w:p>
     <w:p>
@@ -3222,7 +3227,7 @@
         <w:pStyle w:val="ListBullet"/>
       </w:pPr>
       <w:r>
-        <w:t>Candidate result: lower mean full-panel reconstruction error, with uncertainty spanning zero.</w:t>
+        <w:t>Negative benchmark result: RNA SVD-ridge outperformed both neural models on full-panel RMSLE.</w:t>
       </w:r>
     </w:p>
     <w:p>
@@ -3323,12 +3328,20 @@
         <w:pStyle w:val="ListBullet"/>
       </w:pPr>
       <w:r>
+        <w:t>Modality-dropout arms and neural-model foreground, cell-type and marker-AUROC analyses are implemented but full runs remain pending.</w:t>
+      </w:r>
+    </w:p>
+    <w:p>
+      <w:pPr>
+        <w:pStyle w:val="ListBullet"/>
+      </w:pPr>
+      <w:r>
         <w:t>Consolidated metrics are stored in results/fusionvi_experiments_summary.json.</w:t>
       </w:r>
     </w:p>
     <w:p>
       <w:r>
-        <w:t>The current full-panel benchmark is reproduced with .\run_paper_benchmark.ps1. Earlier executed experiment outputs remain traceable in repository history; their consolidated metrics and figures are versioned with this report.</w:t>
+        <w:t>The current full-panel benchmark is reproduced with .\run_paper_benchmark.ps1. The original Lawlor and Papalexi training pipelines were not retained, so Experiments 1 and 2 are documented from saved held-out predictions, metrics and figures and are not reproducible from a fresh clone. The versioned Papalexi effect table reproduces the target-cluster bootstrap.</w:t>
       </w:r>
     </w:p>
     <w:p>

</xml_diff>

<commit_message>
Update technical report with corrected evaluation
</commit_message>
<xml_diff>
--- a/deliverables/FusionVI_All_Experiments_Technical_Report.docx
+++ b/deliverables/FusionVI_All_Experiments_Technical_Report.docx
@@ -44,7 +44,7 @@
     </w:p>
     <w:p>
       <w:r>
-        <w:t>FusionVI tests whether modality-specific encoding improves recovery of therapeutic surface biomarkers when protein measurements are hidden, discordant with RNA or observed under an unseen perturbation. Four completed experiments cover held-out human donors, held-out CRISPR targets, cross-mouse transfer and the full missing-protein-panel benchmark from the totalVI paper. The evidence is deliberately mixed: multimodal context is useful in the PD-L1 perturbation task, while targeted marker studies show that measured protein context often matters more than the learned latent. The apparent missing-panel benefit is small and still requires capacity controls. These results support a bounded biomarker-completion and perturbation-ranking contribution.</w:t>
+        <w:t>FusionVI tests whether modality-specific encoding improves recovery of therapeutic surface biomarkers when protein measurements are hidden, discordant with RNA or observed under an unseen perturbation. Four completed experiments cover held-out human donors, held-out CRISPR targets, cross-mouse transfer and the full missing-protein-panel benchmark from the totalVI paper. The evidence is deliberately mixed: multimodal context is useful in the PD-L1 perturbation task, while targeted marker studies show that measured protein context often matters more than the learned latent. The apparent missing-panel difference is small, and a source-only RNA ridge baseline outperforms both neural models on aggregate RMSLE. These results support a bounded biomarker-completion and perturbation-ranking contribution.</w:t>
       </w:r>
     </w:p>
     <w:p>
@@ -511,7 +511,7 @@
                 <w:rFonts w:ascii="Arial" w:hAnsi="Arial"/>
                 <w:sz w:val="17"/>
               </w:rPr>
-              <w:t>RMSLE difference -0.0060; seed-level 95% CI crossed zero</w:t>
+              <w:t>RNA ridge RMSLE 0.638; both neural models were about 1.06</w:t>
             </w:r>
           </w:p>
         </w:tc>
@@ -1255,7 +1255,7 @@
     </w:p>
     <w:p>
       <w:r>
-        <w:t>Can PD-L1 protein effects be predicted for a perturbation absent from training? The ECCITE-seq screen contains 20,729 IFN-gamma-treated THP-1 cells, 25 perturbation targets, three biological replicates and four surface proteins. Five outer folds held out complete CRISPR targets. Evaluation used 75 target-by-replicate effects.</w:t>
+        <w:t>Given a held-out perturbation cell's RNA and three measured proteins, can its hidden PD-L1 response be recovered? The ECCITE-seq screen contains 20,729 IFN-gamma-treated THP-1 cells, 25 perturbation targets, three biological replicates and four surface proteins. Five outer folds held out complete CRISPR targets. At test time, each cell's RNA and the other three measured proteins remain inputs; only PD-L1 is hidden, and the perturbation-target label is not used. Evaluation used 75 target-by-replicate effects.</w:t>
       </w:r>
     </w:p>
     <w:tbl>
@@ -1982,7 +1982,7 @@
     </w:p>
     <w:p>
       <w:r>
-        <w:t>FusionVI-X reduced median gene-level absolute error by 0.0042 relative to totalVI-X (paired Wilcoxon p=0.042, 25 targets). It recovered expected PD-L1 loss after IFNGR1, IFNGR2, JAK2 and STAT1 perturbation and gain after CUL3 or BRD4 perturbation.</w:t>
+        <w:t>FusionVI-X reduced median per-target PD-L1 effect absolute error by 0.0042 relative to totalVI-X after replicate averaging (paired Wilcoxon p=0.042, 25 targets). A 5,000-sample target-cluster bootstrap estimated FusionVI-X effect Spearman at 0.879 (95% CI 0.728 to 0.967) and its difference from totalVI-X at +0.038 (95% CI +0.011 to +0.083). The MAE-difference interval included zero. It recovered expected PD-L1 loss after IFNGR1, IFNGR2, JAK2 and STAT1 perturbation and gain after CUL3 or BRD4 perturbation.</w:t>
       </w:r>
     </w:p>
     <w:p>
@@ -3147,6 +3147,11 @@
       </w:r>
     </w:p>
     <w:p>
+      <w:r>
+        <w:t>A source-only RNA baseline fit a 128-component SVD and multi-output ridge on D1, selected its penalty on a D1 validation split, and reached mean D2 protein RMSLE 0.6379. This is substantially below totalVI (1.0605) and FusionVI (1.0544). Source-defined marker AUROC was 0.976 for CD4, 0.990 for CD8 and 0.995 for CD19, but mean within-cell-type Spearman was only 0.169. Aggregate marker separation therefore does not imply recovery of subtle within-cell-state variation. Paired modality-dropout arms now test whether supervised RNA-only latents close this gap.</w:t>
+      </w:r>
+    </w:p>
+    <w:p>
       <w:pPr>
         <w:keepNext/>
         <w:jc w:val="center"/>
@@ -3214,7 +3219,7 @@
     </w:p>
     <w:p>
       <w:r>
-        <w:t>The experiments support a narrow and biologically coherent contribution. The complete-panel experiment suggests a small candidate benefit, but four seeds and unequal capacity do not yet identify gated fusion as its cause. When other proteins remain available, measured protein context often contributes more than the learned latent. The Papalexi result shows that multimodal context can rank unseen PD-L1 perturbation effects, while the CMTM6 failure exposes a post-transcriptional boundary.</w:t>
+        <w:t>The experiments support a narrow and biologically coherent contribution. The complete-panel experiment shows a small FusionVI-versus-totalVI difference, but four seeds and unequal capacity do not identify gated fusion as its cause, and an RNA ridge baseline performs substantially better than both. When other proteins remain available, measured protein context often contributes more than the learned latent. The Papalexi result shows that multimodal context can rank unseen PD-L1 perturbation effects, while the CMTM6 failure exposes a post-transcriptional boundary.</w:t>
       </w:r>
     </w:p>
     <w:p>
@@ -3222,7 +3227,7 @@
         <w:pStyle w:val="ListBullet"/>
       </w:pPr>
       <w:r>
-        <w:t>Candidate result: lower mean full-panel reconstruction error, with uncertainty spanning zero.</w:t>
+        <w:t>Negative benchmark result: RNA SVD-ridge outperformed both neural models on full-panel RMSLE.</w:t>
       </w:r>
     </w:p>
     <w:p>
@@ -3323,12 +3328,20 @@
         <w:pStyle w:val="ListBullet"/>
       </w:pPr>
       <w:r>
+        <w:t>Modality-dropout arms and neural-model foreground, cell-type and marker-AUROC analyses are implemented but full runs remain pending.</w:t>
+      </w:r>
+    </w:p>
+    <w:p>
+      <w:pPr>
+        <w:pStyle w:val="ListBullet"/>
+      </w:pPr>
+      <w:r>
         <w:t>Consolidated metrics are stored in results/fusionvi_experiments_summary.json.</w:t>
       </w:r>
     </w:p>
     <w:p>
       <w:r>
-        <w:t>The current full-panel benchmark is reproduced with .\run_paper_benchmark.ps1. Earlier executed experiment outputs remain traceable in repository history; their consolidated metrics and figures are versioned with this report.</w:t>
+        <w:t>The current full-panel benchmark is reproduced with .\run_paper_benchmark.ps1. The original Lawlor and Papalexi training pipelines were not retained, so Experiments 1 and 2 are documented from saved held-out predictions, metrics and figures and are not reproducible from a fresh clone. The versioned Papalexi effect table reproduces the target-cluster bootstrap.</w:t>
       </w:r>
     </w:p>
     <w:p>

</xml_diff>

<commit_message>
Finalize 16-seed FusionVI control benchmark
</commit_message>
<xml_diff>
--- a/deliverables/FusionVI_All_Experiments_Technical_Report.docx
+++ b/deliverables/FusionVI_All_Experiments_Technical_Report.docx
@@ -44,7 +44,7 @@
     </w:p>
     <w:p>
       <w:r>
-        <w:t>FusionVI tests whether modality-specific encoding improves recovery of therapeutic surface biomarkers when protein measurements are hidden, discordant with RNA or observed under an unseen perturbation. Four completed experiments cover held-out human donors, held-out CRISPR targets, cross-mouse transfer and the full missing-protein-panel benchmark from the totalVI paper. The evidence is deliberately mixed: multimodal context is useful in the PD-L1 perturbation task, while targeted marker studies show that measured protein context often matters more than the learned latent. The apparent missing-panel difference is small, and a source-only RNA ridge baseline outperforms both neural models on aggregate RMSLE. These results support a bounded biomarker-completion and perturbation-ranking contribution.</w:t>
+        <w:t>FusionVI tests whether modality-specific encoding improves recovery of therapeutic surface biomarkers when protein measurements are hidden, discordant with RNA or observed under an unseen perturbation. Four completed experiments cover held-out human donors, held-out CRISPR targets, cross-mouse transfer and the full missing-protein-panel benchmark from the totalVI paper. The evidence is deliberately mixed: multimodal context is useful in the PD-L1 perturbation task, while targeted marker studies show that measured protein context often matters more than the learned latent. In the complete-panel benchmark, FusionVI retains a small advantage over three matched joint-encoder controls across 16 seeds, although a source-only RNA ridge baseline outperforms every neural model on aggregate RMSLE. These results support a bounded biomarker-completion and perturbation-ranking contribution.</w:t>
       </w:r>
     </w:p>
     <w:p>
@@ -483,7 +483,7 @@
                 <w:rFonts w:ascii="Arial" w:hAnsi="Arial"/>
                 <w:sz w:val="17"/>
               </w:rPr>
-              <w:t>4 paired seeds</w:t>
+              <w:t>16 paired seeds</w:t>
             </w:r>
           </w:p>
         </w:tc>
@@ -511,7 +511,7 @@
                 <w:rFonts w:ascii="Arial" w:hAnsi="Arial"/>
                 <w:sz w:val="17"/>
               </w:rPr>
-              <w:t>RNA ridge RMSLE 0.638; both neural models were about 1.06</w:t>
+              <w:t>FusionVI beat three matched joint encoders; RNA ridge RMSLE was 0.638</w:t>
             </w:r>
           </w:p>
         </w:tc>
@@ -2644,7 +2644,7 @@
     </w:p>
     <w:p>
       <w:r>
-        <w:t>Can RNA recover all 110 surface proteins in a batch where no protein measurements enter training? This experiment follows the totalVI paper's Figure 3 design. SLN111-D1 retained RNA and proteins; the entire D2 panel was hidden and preserved only for evaluation. Decoder, likelihoods, latent size, optimizer, split and prediction procedure were controlled.</w:t>
+        <w:t>Can RNA recover all 110 surface proteins in a batch where no protein measurements enter training? This experiment follows the totalVI paper's Figure 3 design. SLN111-D1 retained RNA and proteins; the entire D2 panel was hidden and preserved only for evaluation. Decoder, likelihoods, latent size, optimizer, split and prediction procedure were controlled. Sixteen paired seeds were run for FusionVI, totalVI and all three Tier 1 controls.</w:t>
       </w:r>
     </w:p>
     <w:tbl>
@@ -2666,7 +2666,7 @@
         </w:trPr>
         <w:tc>
           <w:tcPr>
-            <w:tcW w:type="dxa" w:w="3528"/>
+            <w:tcW w:type="dxa" w:w="2160"/>
             <w:vAlign w:val="center"/>
             <w:tcBorders>
               <w:top w:val="single" w:sz="5" w:color="D9D9D9"/>
@@ -2689,13 +2689,13 @@
                 <w:color w:val="FFFFFF"/>
                 <w:sz w:val="17"/>
               </w:rPr>
-              <w:t>Metric</w:t>
+              <w:t>Model</w:t>
             </w:r>
           </w:p>
         </w:tc>
         <w:tc>
           <w:tcPr>
-            <w:tcW w:type="dxa" w:w="2016"/>
+            <w:tcW w:type="dxa" w:w="3816"/>
             <w:vAlign w:val="center"/>
             <w:tcBorders>
               <w:top w:val="single" w:sz="5" w:color="D9D9D9"/>
@@ -2718,13 +2718,13 @@
                 <w:color w:val="FFFFFF"/>
                 <w:sz w:val="17"/>
               </w:rPr>
-              <w:t>totalVI</w:t>
+              <w:t>Encoder comparison</w:t>
             </w:r>
           </w:p>
         </w:tc>
         <w:tc>
           <w:tcPr>
-            <w:tcW w:type="dxa" w:w="2016"/>
+            <w:tcW w:type="dxa" w:w="1728"/>
             <w:vAlign w:val="center"/>
             <w:tcBorders>
               <w:top w:val="single" w:sz="5" w:color="D9D9D9"/>
@@ -2747,7 +2747,7 @@
                 <w:color w:val="FFFFFF"/>
                 <w:sz w:val="17"/>
               </w:rPr>
-              <w:t>FusionVI</w:t>
+              <w:t>Mean RMSLE</w:t>
             </w:r>
           </w:p>
         </w:tc>
@@ -2776,7 +2776,7 @@
                 <w:color w:val="FFFFFF"/>
                 <w:sz w:val="17"/>
               </w:rPr>
-              <w:t>Difference</w:t>
+              <w:t>Difference vs FusionVI</w:t>
             </w:r>
           </w:p>
         </w:tc>
@@ -2784,7 +2784,7 @@
       <w:tr>
         <w:tc>
           <w:tcPr>
-            <w:tcW w:type="dxa" w:w="3528"/>
+            <w:tcW w:type="dxa" w:w="2160"/>
             <w:vAlign w:val="center"/>
             <w:tcBorders>
               <w:top w:val="single" w:sz="5" w:color="D9D9D9"/>
@@ -2806,13 +2806,13 @@
                 <w:rFonts w:ascii="Arial" w:hAnsi="Arial"/>
                 <w:sz w:val="17"/>
               </w:rPr>
-              <w:t>RMSLE primary</w:t>
+              <w:t>FusionVI</w:t>
             </w:r>
           </w:p>
         </w:tc>
         <w:tc>
           <w:tcPr>
-            <w:tcW w:type="dxa" w:w="2016"/>
+            <w:tcW w:type="dxa" w:w="3816"/>
             <w:vAlign w:val="center"/>
             <w:tcBorders>
               <w:top w:val="single" w:sz="5" w:color="D9D9D9"/>
@@ -2834,13 +2834,13 @@
                 <w:rFonts w:ascii="Arial" w:hAnsi="Arial"/>
                 <w:sz w:val="17"/>
               </w:rPr>
-              <w:t>1.0605</w:t>
+              <w:t>Separate branches and learned gate</w:t>
             </w:r>
           </w:p>
         </w:tc>
         <w:tc>
           <w:tcPr>
-            <w:tcW w:type="dxa" w:w="2016"/>
+            <w:tcW w:type="dxa" w:w="1728"/>
             <w:vAlign w:val="center"/>
             <w:tcBorders>
               <w:top w:val="single" w:sz="5" w:color="D9D9D9"/>
@@ -2862,7 +2862,7 @@
                 <w:rFonts w:ascii="Arial" w:hAnsi="Arial"/>
                 <w:sz w:val="17"/>
               </w:rPr>
-              <w:t>1.0544</w:t>
+              <w:t>1.0539</w:t>
             </w:r>
           </w:p>
         </w:tc>
@@ -2890,7 +2890,7 @@
                 <w:rFonts w:ascii="Arial" w:hAnsi="Arial"/>
                 <w:sz w:val="17"/>
               </w:rPr>
-              <w:t>-0.0060</w:t>
+              <w:t>reference</w:t>
             </w:r>
           </w:p>
         </w:tc>
@@ -2898,7 +2898,7 @@
       <w:tr>
         <w:tc>
           <w:tcPr>
-            <w:tcW w:type="dxa" w:w="3528"/>
+            <w:tcW w:type="dxa" w:w="2160"/>
             <w:vAlign w:val="center"/>
             <w:tcBorders>
               <w:top w:val="single" w:sz="5" w:color="D9D9D9"/>
@@ -2920,13 +2920,13 @@
                 <w:rFonts w:ascii="Arial" w:hAnsi="Arial"/>
                 <w:sz w:val="17"/>
               </w:rPr>
-              <w:t>Proteins with lower RMSLE</w:t>
+              <w:t>totalVI</w:t>
             </w:r>
           </w:p>
         </w:tc>
         <w:tc>
           <w:tcPr>
-            <w:tcW w:type="dxa" w:w="2016"/>
+            <w:tcW w:type="dxa" w:w="3816"/>
             <w:vAlign w:val="center"/>
             <w:tcBorders>
               <w:top w:val="single" w:sz="5" w:color="D9D9D9"/>
@@ -2948,13 +2948,13 @@
                 <w:rFonts w:ascii="Arial" w:hAnsi="Arial"/>
                 <w:sz w:val="17"/>
               </w:rPr>
-              <w:t>—</w:t>
+              <w:t>Published joint encoder, width 256</w:t>
             </w:r>
           </w:p>
         </w:tc>
         <w:tc>
           <w:tcPr>
-            <w:tcW w:type="dxa" w:w="2016"/>
+            <w:tcW w:type="dxa" w:w="1728"/>
             <w:vAlign w:val="center"/>
             <w:tcBorders>
               <w:top w:val="single" w:sz="5" w:color="D9D9D9"/>
@@ -2976,7 +2976,7 @@
                 <w:rFonts w:ascii="Arial" w:hAnsi="Arial"/>
                 <w:sz w:val="17"/>
               </w:rPr>
-              <w:t>74/110</w:t>
+              <w:t>1.0601</w:t>
             </w:r>
           </w:p>
         </w:tc>
@@ -3004,7 +3004,7 @@
                 <w:rFonts w:ascii="Arial" w:hAnsi="Arial"/>
                 <w:sz w:val="17"/>
               </w:rPr>
-              <w:t>—</w:t>
+              <w:t>+0.0062</w:t>
             </w:r>
           </w:p>
         </w:tc>
@@ -3012,7 +3012,7 @@
       <w:tr>
         <w:tc>
           <w:tcPr>
-            <w:tcW w:type="dxa" w:w="3528"/>
+            <w:tcW w:type="dxa" w:w="2160"/>
             <w:vAlign w:val="center"/>
             <w:tcBorders>
               <w:top w:val="single" w:sz="5" w:color="D9D9D9"/>
@@ -3034,13 +3034,13 @@
                 <w:rFonts w:ascii="Arial" w:hAnsi="Arial"/>
                 <w:sz w:val="17"/>
               </w:rPr>
-              <w:t>Trainable parameters</w:t>
+              <w:t>Joint same width</w:t>
             </w:r>
           </w:p>
         </w:tc>
         <w:tc>
           <w:tcPr>
-            <w:tcW w:type="dxa" w:w="2016"/>
+            <w:tcW w:type="dxa" w:w="3816"/>
             <w:vAlign w:val="center"/>
             <w:tcBorders>
               <w:top w:val="single" w:sz="5" w:color="D9D9D9"/>
@@ -3062,13 +3062,13 @@
                 <w:rFonts w:ascii="Arial" w:hAnsi="Arial"/>
                 <w:sz w:val="17"/>
               </w:rPr>
-              <w:t>4,574,975</w:t>
+              <w:t>Width 128</w:t>
             </w:r>
           </w:p>
         </w:tc>
         <w:tc>
           <w:tcPr>
-            <w:tcW w:type="dxa" w:w="2016"/>
+            <w:tcW w:type="dxa" w:w="1728"/>
             <w:vAlign w:val="center"/>
             <w:tcBorders>
               <w:top w:val="single" w:sz="5" w:color="D9D9D9"/>
@@ -3090,7 +3090,7 @@
                 <w:rFonts w:ascii="Arial" w:hAnsi="Arial"/>
                 <w:sz w:val="17"/>
               </w:rPr>
-              <w:t>2,971,904</w:t>
+              <w:t>1.0645</w:t>
             </w:r>
           </w:p>
         </w:tc>
@@ -3118,7 +3118,235 @@
                 <w:rFonts w:ascii="Arial" w:hAnsi="Arial"/>
                 <w:sz w:val="17"/>
               </w:rPr>
-              <w:t>35.0% fewer</w:t>
+              <w:t>+0.0106</w:t>
+            </w:r>
+          </w:p>
+        </w:tc>
+      </w:tr>
+      <w:tr>
+        <w:tc>
+          <w:tcPr>
+            <w:tcW w:type="dxa" w:w="2160"/>
+            <w:vAlign w:val="center"/>
+            <w:tcBorders>
+              <w:top w:val="single" w:sz="5" w:color="D9D9D9"/>
+              <w:left w:val="single" w:sz="5" w:color="D9D9D9"/>
+              <w:bottom w:val="single" w:sz="5" w:color="D9D9D9"/>
+              <w:right w:val="single" w:sz="5" w:color="D9D9D9"/>
+              <w:insideH w:val="single" w:sz="5" w:color="D9D9D9"/>
+              <w:insideV w:val="single" w:sz="5" w:color="D9D9D9"/>
+            </w:tcBorders>
+            <w:shd w:fill="EFF6FF"/>
+          </w:tcPr>
+          <w:p>
+            <w:pPr>
+              <w:spacing w:before="60" w:after="60" w:line="240" w:lineRule="auto"/>
+              <w:jc w:val="left"/>
+            </w:pPr>
+            <w:r>
+              <w:rPr>
+                <w:rFonts w:ascii="Arial" w:hAnsi="Arial"/>
+                <w:sz w:val="17"/>
+              </w:rPr>
+              <w:t>Joint parameter matched</w:t>
+            </w:r>
+          </w:p>
+        </w:tc>
+        <w:tc>
+          <w:tcPr>
+            <w:tcW w:type="dxa" w:w="3816"/>
+            <w:vAlign w:val="center"/>
+            <w:tcBorders>
+              <w:top w:val="single" w:sz="5" w:color="D9D9D9"/>
+              <w:left w:val="single" w:sz="5" w:color="D9D9D9"/>
+              <w:bottom w:val="single" w:sz="5" w:color="D9D9D9"/>
+              <w:right w:val="single" w:sz="5" w:color="D9D9D9"/>
+              <w:insideH w:val="single" w:sz="5" w:color="D9D9D9"/>
+              <w:insideV w:val="single" w:sz="5" w:color="D9D9D9"/>
+            </w:tcBorders>
+            <w:shd w:fill="EFF6FF"/>
+          </w:tcPr>
+          <w:p>
+            <w:pPr>
+              <w:spacing w:before="60" w:after="60" w:line="240" w:lineRule="auto"/>
+              <w:jc w:val="center"/>
+            </w:pPr>
+            <w:r>
+              <w:rPr>
+                <w:rFonts w:ascii="Arial" w:hAnsi="Arial"/>
+                <w:sz w:val="17"/>
+              </w:rPr>
+              <w:t>Width 70</w:t>
+            </w:r>
+          </w:p>
+        </w:tc>
+        <w:tc>
+          <w:tcPr>
+            <w:tcW w:type="dxa" w:w="1728"/>
+            <w:vAlign w:val="center"/>
+            <w:tcBorders>
+              <w:top w:val="single" w:sz="5" w:color="D9D9D9"/>
+              <w:left w:val="single" w:sz="5" w:color="D9D9D9"/>
+              <w:bottom w:val="single" w:sz="5" w:color="D9D9D9"/>
+              <w:right w:val="single" w:sz="5" w:color="D9D9D9"/>
+              <w:insideH w:val="single" w:sz="5" w:color="D9D9D9"/>
+              <w:insideV w:val="single" w:sz="5" w:color="D9D9D9"/>
+            </w:tcBorders>
+            <w:shd w:fill="EFF6FF"/>
+          </w:tcPr>
+          <w:p>
+            <w:pPr>
+              <w:spacing w:before="60" w:after="60" w:line="240" w:lineRule="auto"/>
+              <w:jc w:val="center"/>
+            </w:pPr>
+            <w:r>
+              <w:rPr>
+                <w:rFonts w:ascii="Arial" w:hAnsi="Arial"/>
+                <w:sz w:val="17"/>
+              </w:rPr>
+              <w:t>1.0728</w:t>
+            </w:r>
+          </w:p>
+        </w:tc>
+        <w:tc>
+          <w:tcPr>
+            <w:tcW w:type="dxa" w:w="2088"/>
+            <w:vAlign w:val="center"/>
+            <w:tcBorders>
+              <w:top w:val="single" w:sz="5" w:color="D9D9D9"/>
+              <w:left w:val="single" w:sz="5" w:color="D9D9D9"/>
+              <w:bottom w:val="single" w:sz="5" w:color="D9D9D9"/>
+              <w:right w:val="single" w:sz="5" w:color="D9D9D9"/>
+              <w:insideH w:val="single" w:sz="5" w:color="D9D9D9"/>
+              <w:insideV w:val="single" w:sz="5" w:color="D9D9D9"/>
+            </w:tcBorders>
+            <w:shd w:fill="EFF6FF"/>
+          </w:tcPr>
+          <w:p>
+            <w:pPr>
+              <w:spacing w:before="60" w:after="60" w:line="240" w:lineRule="auto"/>
+              <w:jc w:val="center"/>
+            </w:pPr>
+            <w:r>
+              <w:rPr>
+                <w:rFonts w:ascii="Arial" w:hAnsi="Arial"/>
+                <w:sz w:val="17"/>
+              </w:rPr>
+              <w:t>+0.0189</w:t>
+            </w:r>
+          </w:p>
+        </w:tc>
+      </w:tr>
+      <w:tr>
+        <w:tc>
+          <w:tcPr>
+            <w:tcW w:type="dxa" w:w="2160"/>
+            <w:vAlign w:val="center"/>
+            <w:tcBorders>
+              <w:top w:val="single" w:sz="5" w:color="D9D9D9"/>
+              <w:left w:val="single" w:sz="5" w:color="D9D9D9"/>
+              <w:bottom w:val="single" w:sz="5" w:color="D9D9D9"/>
+              <w:right w:val="single" w:sz="5" w:color="D9D9D9"/>
+              <w:insideH w:val="single" w:sz="5" w:color="D9D9D9"/>
+              <w:insideV w:val="single" w:sz="5" w:color="D9D9D9"/>
+            </w:tcBorders>
+            <w:shd w:fill="FFFFFF"/>
+          </w:tcPr>
+          <w:p>
+            <w:pPr>
+              <w:spacing w:before="60" w:after="60" w:line="240" w:lineRule="auto"/>
+              <w:jc w:val="left"/>
+            </w:pPr>
+            <w:r>
+              <w:rPr>
+                <w:rFonts w:ascii="Arial" w:hAnsi="Arial"/>
+                <w:sz w:val="17"/>
+              </w:rPr>
+              <w:t>Joint plus availability</w:t>
+            </w:r>
+          </w:p>
+        </w:tc>
+        <w:tc>
+          <w:tcPr>
+            <w:tcW w:type="dxa" w:w="3816"/>
+            <w:vAlign w:val="center"/>
+            <w:tcBorders>
+              <w:top w:val="single" w:sz="5" w:color="D9D9D9"/>
+              <w:left w:val="single" w:sz="5" w:color="D9D9D9"/>
+              <w:bottom w:val="single" w:sz="5" w:color="D9D9D9"/>
+              <w:right w:val="single" w:sz="5" w:color="D9D9D9"/>
+              <w:insideH w:val="single" w:sz="5" w:color="D9D9D9"/>
+              <w:insideV w:val="single" w:sz="5" w:color="D9D9D9"/>
+            </w:tcBorders>
+            <w:shd w:fill="FFFFFF"/>
+          </w:tcPr>
+          <w:p>
+            <w:pPr>
+              <w:spacing w:before="60" w:after="60" w:line="240" w:lineRule="auto"/>
+              <w:jc w:val="center"/>
+            </w:pPr>
+            <w:r>
+              <w:rPr>
+                <w:rFonts w:ascii="Arial" w:hAnsi="Arial"/>
+                <w:sz w:val="17"/>
+              </w:rPr>
+              <w:t>Width 128 and panel indicator</w:t>
+            </w:r>
+          </w:p>
+        </w:tc>
+        <w:tc>
+          <w:tcPr>
+            <w:tcW w:type="dxa" w:w="1728"/>
+            <w:vAlign w:val="center"/>
+            <w:tcBorders>
+              <w:top w:val="single" w:sz="5" w:color="D9D9D9"/>
+              <w:left w:val="single" w:sz="5" w:color="D9D9D9"/>
+              <w:bottom w:val="single" w:sz="5" w:color="D9D9D9"/>
+              <w:right w:val="single" w:sz="5" w:color="D9D9D9"/>
+              <w:insideH w:val="single" w:sz="5" w:color="D9D9D9"/>
+              <w:insideV w:val="single" w:sz="5" w:color="D9D9D9"/>
+            </w:tcBorders>
+            <w:shd w:fill="FFFFFF"/>
+          </w:tcPr>
+          <w:p>
+            <w:pPr>
+              <w:spacing w:before="60" w:after="60" w:line="240" w:lineRule="auto"/>
+              <w:jc w:val="center"/>
+            </w:pPr>
+            <w:r>
+              <w:rPr>
+                <w:rFonts w:ascii="Arial" w:hAnsi="Arial"/>
+                <w:sz w:val="17"/>
+              </w:rPr>
+              <w:t>1.0651</w:t>
+            </w:r>
+          </w:p>
+        </w:tc>
+        <w:tc>
+          <w:tcPr>
+            <w:tcW w:type="dxa" w:w="2088"/>
+            <w:vAlign w:val="center"/>
+            <w:tcBorders>
+              <w:top w:val="single" w:sz="5" w:color="D9D9D9"/>
+              <w:left w:val="single" w:sz="5" w:color="D9D9D9"/>
+              <w:bottom w:val="single" w:sz="5" w:color="D9D9D9"/>
+              <w:right w:val="single" w:sz="5" w:color="D9D9D9"/>
+              <w:insideH w:val="single" w:sz="5" w:color="D9D9D9"/>
+              <w:insideV w:val="single" w:sz="5" w:color="D9D9D9"/>
+            </w:tcBorders>
+            <w:shd w:fill="FFFFFF"/>
+          </w:tcPr>
+          <w:p>
+            <w:pPr>
+              <w:spacing w:before="60" w:after="60" w:line="240" w:lineRule="auto"/>
+              <w:jc w:val="center"/>
+            </w:pPr>
+            <w:r>
+              <w:rPr>
+                <w:rFonts w:ascii="Arial" w:hAnsi="Arial"/>
+                <w:sz w:val="17"/>
+              </w:rPr>
+              <w:t>+0.0112</w:t>
             </w:r>
           </w:p>
         </w:tc>
@@ -3138,17 +3366,17 @@
           <w:b/>
           <w:color w:val="C2410C"/>
         </w:rPr>
-        <w:t>Result  FusionVI's mean RMSLE was 0.57% lower, but the seed-level interval included zero.</w:t>
+        <w:t>Result  FusionVI's small advantage survives matched encoder controls across 16 seeds.</w:t>
       </w:r>
     </w:p>
     <w:p>
       <w:r>
-        <w:t>The seed-paired difference was -0.0060 (95% CI -0.0176 to +0.0056; paired t p=0.20; exact p=0.25). Three of four seeds favored FusionVI. The protein-level p=1.04e-05 is descriptive because proteins are repeated outcomes. The 35.0% parameter difference mostly reflects width 128 versus 256 and removal of totalVI's separate library encoder. Same-width, parameter-matched and missingness-aware controls are required to isolate fusion.</w:t>
+        <w:t>Against the same-width joint encoder, FusionVI reduced RMSLE by 0.0106 (95% CI -0.0135 to -0.0077; Holm p=3.4e-06) and won 15/16 seeds. Against the parameter-matched encoder, the reduction was 0.0189 (95% CI -0.0216 to -0.0162; Holm p=7.9e-10) with 16/16 wins. Against the missingness-aware joint encoder, the reduction was 0.0112 (95% CI -0.0143 to -0.0081; Holm p=3.4e-06) with 15/16 wins. The availability indicator alone did not help (difference +0.0006; p=0.51).</w:t>
       </w:r>
     </w:p>
     <w:p>
       <w:r>
-        <w:t>A source-only RNA baseline fit a 128-component SVD and multi-output ridge on D1, selected its penalty on a D1 validation split, and reached mean D2 protein RMSLE 0.6379. This is substantially below totalVI (1.0605) and FusionVI (1.0544). Source-defined marker AUROC was 0.976 for CD4, 0.990 for CD8 and 0.995 for CD19, but mean within-cell-type Spearman was only 0.169. Aggregate marker separation therefore does not imply recovery of subtle within-cell-state variation. Paired modality-dropout arms now test whether supervised RNA-only latents close this gap.</w:t>
+        <w:t>A source-only RNA baseline fit a 128-component SVD and multi-output ridge on D1, selected its penalty on a D1 validation split, and reached mean D2 protein RMSLE 0.6379. This is substantially below every neural model. Source-defined marker AUROC was 0.976 for CD4, 0.990 for CD8 and 0.995 for CD19, but mean within-cell-type Spearman was only 0.169. Aggregate marker separation therefore does not imply recovery of subtle within-cell-state variation. Modality-dropout arms are implemented but were not part of the completed Tier 1 claim.</w:t>
       </w:r>
     </w:p>
     <w:p>
@@ -3159,7 +3387,7 @@
       <w:r>
         <w:drawing>
           <wp:inline xmlns:a="http://schemas.openxmlformats.org/drawingml/2006/main" xmlns:pic="http://schemas.openxmlformats.org/drawingml/2006/picture">
-            <wp:extent cx="6126480" cy="2116420"/>
+            <wp:extent cx="6126480" cy="2365219"/>
             <wp:docPr id="4" name="Picture 4"/>
             <wp:cNvGraphicFramePr>
               <a:graphicFrameLocks noChangeAspect="1"/>
@@ -3168,7 +3396,7 @@
               <a:graphicData uri="http://schemas.openxmlformats.org/drawingml/2006/picture">
                 <pic:pic>
                   <pic:nvPicPr>
-                    <pic:cNvPr id="0" name="paper_benchmark_totalvi_vs_fusionvi.png"/>
+                    <pic:cNvPr id="0" name="control_benchmark.png"/>
                     <pic:cNvPicPr/>
                   </pic:nvPicPr>
                   <pic:blipFill>
@@ -3180,7 +3408,7 @@
                   <pic:spPr>
                     <a:xfrm>
                       <a:off x="0" y="0"/>
-                      <a:ext cx="6126480" cy="2116420"/>
+                      <a:ext cx="6126480" cy="2365219"/>
                     </a:xfrm>
                     <a:prstGeom prst="rect"/>
                   </pic:spPr>
@@ -3201,7 +3429,7 @@
           <w:i/>
           <w:sz w:val="17"/>
         </w:rPr>
-        <w:t>Figure 4. Paired seeds, per-protein RMSLE and paired protein differences.</w:t>
+        <w:t>Figure 4. Seed-paired FusionVI contrasts against the three prespecified Tier 1 joint-encoder controls.</w:t>
       </w:r>
     </w:p>
     <w:p>
@@ -3219,7 +3447,7 @@
     </w:p>
     <w:p>
       <w:r>
-        <w:t>The experiments support a narrow and biologically coherent contribution. The complete-panel experiment shows a small FusionVI-versus-totalVI difference, but four seeds and unequal capacity do not identify gated fusion as its cause, and an RNA ridge baseline performs substantially better than both. When other proteins remain available, measured protein context often contributes more than the learned latent. The Papalexi result shows that multimodal context can rank unseen PD-L1 perturbation effects, while the CMTM6 failure exposes a post-transcriptional boundary.</w:t>
+        <w:t>The experiments support a narrow and biologically coherent contribution. The complete-panel experiment shows a small, reproducible FusionVI advantage over matched joint encoders across 16 paired seeds, while an RNA ridge baseline still performs substantially better on aggregate RMSLE. When other proteins remain available, measured protein context often contributes more than the learned latent. The Papalexi result shows that multimodal context can rank unseen PD-L1 perturbation effects, while the CMTM6 failure exposes a post-transcriptional boundary.</w:t>
       </w:r>
     </w:p>
     <w:p>
@@ -3227,7 +3455,15 @@
         <w:pStyle w:val="ListBullet"/>
       </w:pPr>
       <w:r>
-        <w:t>Negative benchmark result: RNA SVD-ridge outperformed both neural models on full-panel RMSLE.</w:t>
+        <w:t>Controlled benchmark result: FusionVI beat same-width, parameter-matched and missingness-aware joint encoders.</w:t>
+      </w:r>
+    </w:p>
+    <w:p>
+      <w:pPr>
+        <w:pStyle w:val="ListBullet"/>
+      </w:pPr>
+      <w:r>
+        <w:t>Negative benchmark result: RNA SVD-ridge outperformed every neural model on full-panel RMSLE.</w:t>
       </w:r>
     </w:p>
     <w:p>
@@ -3296,7 +3532,7 @@
         <w:pStyle w:val="ListBullet"/>
       </w:pPr>
       <w:r>
-        <w:t>Complete-panel benchmark: one source-target batch pair and four seeds rather than the paper's 30.</w:t>
+        <w:t>Complete-panel benchmark: one source-target batch pair and 16 seeds rather than the paper's 30.</w:t>
       </w:r>
     </w:p>
     <w:p>
@@ -3304,7 +3540,7 @@
         <w:pStyle w:val="ListBullet"/>
       </w:pPr>
       <w:r>
-        <w:t>The original complete-panel comparison differs in encoder width and library-network design; control arms are running.</w:t>
+        <w:t>Same-width, parameter-matched and missingness-aware controls are complete; modality-dropout arms remain pending.</w:t>
       </w:r>
     </w:p>
     <w:p>
@@ -3328,7 +3564,7 @@
         <w:pStyle w:val="ListBullet"/>
       </w:pPr>
       <w:r>
-        <w:t>Modality-dropout arms and neural-model foreground, cell-type and marker-AUROC analyses are implemented but full runs remain pending.</w:t>
+        <w:t>Neural-model foreground, cell-type and marker-AUROC analyses remain pending.</w:t>
       </w:r>
     </w:p>
     <w:p>
@@ -4128,9 +4364,6 @@
     <w:qFormat/>
     <w:rsid w:val="00FC693F"/>
     <w:pPr>
-      <w:pBdr>
-        <w:bottom w:val="single" w:sz="8" w:space="4" w:color="4F81BD" w:themeColor="accent1"/>
-      </w:pBdr>
       <w:spacing w:after="300" w:line="240" w:lineRule="auto"/>
       <w:contextualSpacing/>
     </w:pPr>

</xml_diff>

<commit_message>
Update final technical report document
</commit_message>
<xml_diff>
--- a/deliverables/FusionVI_All_Experiments_Technical_Report.docx
+++ b/deliverables/FusionVI_All_Experiments_Technical_Report.docx
@@ -44,7 +44,7 @@
     </w:p>
     <w:p>
       <w:r>
-        <w:t>FusionVI tests whether modality-specific encoding improves recovery of therapeutic surface biomarkers when protein measurements are hidden, discordant with RNA or observed under an unseen perturbation. Four completed experiments cover held-out human donors, held-out CRISPR targets, cross-mouse transfer and the full missing-protein-panel benchmark from the totalVI paper. The evidence is deliberately mixed: multimodal context is useful in the PD-L1 perturbation task, while targeted marker studies show that measured protein context often matters more than the learned latent. The apparent missing-panel difference is small, and a source-only RNA ridge baseline outperforms both neural models on aggregate RMSLE. These results support a bounded biomarker-completion and perturbation-ranking contribution.</w:t>
+        <w:t>FusionVI tests whether modality-specific encoding improves recovery of therapeutic surface biomarkers when protein measurements are hidden, discordant with RNA or observed under an unseen perturbation. Four completed experiments cover held-out human donors, held-out CRISPR targets, cross-mouse transfer and the full missing-protein-panel benchmark from the totalVI paper. The evidence is deliberately mixed: multimodal context is useful in the PD-L1 perturbation task, while targeted marker studies show that measured protein context often matters more than the learned latent. In the complete-panel benchmark, FusionVI retains a small advantage over three matched joint-encoder controls across 16 seeds, although a source-only RNA ridge baseline outperforms every neural model on aggregate RMSLE. These results support a bounded biomarker-completion and perturbation-ranking contribution.</w:t>
       </w:r>
     </w:p>
     <w:p>
@@ -483,7 +483,7 @@
                 <w:rFonts w:ascii="Arial" w:hAnsi="Arial"/>
                 <w:sz w:val="17"/>
               </w:rPr>
-              <w:t>4 paired seeds</w:t>
+              <w:t>16 paired seeds</w:t>
             </w:r>
           </w:p>
         </w:tc>
@@ -511,7 +511,7 @@
                 <w:rFonts w:ascii="Arial" w:hAnsi="Arial"/>
                 <w:sz w:val="17"/>
               </w:rPr>
-              <w:t>RNA ridge RMSLE 0.638; both neural models were about 1.06</w:t>
+              <w:t>FusionVI beat three matched joint encoders; RNA ridge RMSLE was 0.638</w:t>
             </w:r>
           </w:p>
         </w:tc>
@@ -2644,7 +2644,7 @@
     </w:p>
     <w:p>
       <w:r>
-        <w:t>Can RNA recover all 110 surface proteins in a batch where no protein measurements enter training? This experiment follows the totalVI paper's Figure 3 design. SLN111-D1 retained RNA and proteins; the entire D2 panel was hidden and preserved only for evaluation. Decoder, likelihoods, latent size, optimizer, split and prediction procedure were controlled.</w:t>
+        <w:t>Can RNA recover all 110 surface proteins in a batch where no protein measurements enter training? This experiment follows the totalVI paper's Figure 3 design. SLN111-D1 retained RNA and proteins; the entire D2 panel was hidden and preserved only for evaluation. Decoder, likelihoods, latent size, optimizer, split and prediction procedure were controlled. Sixteen paired seeds were run for FusionVI, totalVI and all three Tier 1 controls.</w:t>
       </w:r>
     </w:p>
     <w:tbl>
@@ -2666,7 +2666,7 @@
         </w:trPr>
         <w:tc>
           <w:tcPr>
-            <w:tcW w:type="dxa" w:w="3528"/>
+            <w:tcW w:type="dxa" w:w="2160"/>
             <w:vAlign w:val="center"/>
             <w:tcBorders>
               <w:top w:val="single" w:sz="5" w:color="D9D9D9"/>
@@ -2689,13 +2689,13 @@
                 <w:color w:val="FFFFFF"/>
                 <w:sz w:val="17"/>
               </w:rPr>
-              <w:t>Metric</w:t>
+              <w:t>Model</w:t>
             </w:r>
           </w:p>
         </w:tc>
         <w:tc>
           <w:tcPr>
-            <w:tcW w:type="dxa" w:w="2016"/>
+            <w:tcW w:type="dxa" w:w="3816"/>
             <w:vAlign w:val="center"/>
             <w:tcBorders>
               <w:top w:val="single" w:sz="5" w:color="D9D9D9"/>
@@ -2718,13 +2718,13 @@
                 <w:color w:val="FFFFFF"/>
                 <w:sz w:val="17"/>
               </w:rPr>
-              <w:t>totalVI</w:t>
+              <w:t>Encoder comparison</w:t>
             </w:r>
           </w:p>
         </w:tc>
         <w:tc>
           <w:tcPr>
-            <w:tcW w:type="dxa" w:w="2016"/>
+            <w:tcW w:type="dxa" w:w="1728"/>
             <w:vAlign w:val="center"/>
             <w:tcBorders>
               <w:top w:val="single" w:sz="5" w:color="D9D9D9"/>
@@ -2747,7 +2747,7 @@
                 <w:color w:val="FFFFFF"/>
                 <w:sz w:val="17"/>
               </w:rPr>
-              <w:t>FusionVI</w:t>
+              <w:t>Mean RMSLE</w:t>
             </w:r>
           </w:p>
         </w:tc>
@@ -2776,7 +2776,7 @@
                 <w:color w:val="FFFFFF"/>
                 <w:sz w:val="17"/>
               </w:rPr>
-              <w:t>Difference</w:t>
+              <w:t>Difference vs FusionVI</w:t>
             </w:r>
           </w:p>
         </w:tc>
@@ -2784,7 +2784,7 @@
       <w:tr>
         <w:tc>
           <w:tcPr>
-            <w:tcW w:type="dxa" w:w="3528"/>
+            <w:tcW w:type="dxa" w:w="2160"/>
             <w:vAlign w:val="center"/>
             <w:tcBorders>
               <w:top w:val="single" w:sz="5" w:color="D9D9D9"/>
@@ -2806,13 +2806,13 @@
                 <w:rFonts w:ascii="Arial" w:hAnsi="Arial"/>
                 <w:sz w:val="17"/>
               </w:rPr>
-              <w:t>RMSLE primary</w:t>
+              <w:t>FusionVI</w:t>
             </w:r>
           </w:p>
         </w:tc>
         <w:tc>
           <w:tcPr>
-            <w:tcW w:type="dxa" w:w="2016"/>
+            <w:tcW w:type="dxa" w:w="3816"/>
             <w:vAlign w:val="center"/>
             <w:tcBorders>
               <w:top w:val="single" w:sz="5" w:color="D9D9D9"/>
@@ -2834,13 +2834,13 @@
                 <w:rFonts w:ascii="Arial" w:hAnsi="Arial"/>
                 <w:sz w:val="17"/>
               </w:rPr>
-              <w:t>1.0605</w:t>
+              <w:t>Separate branches and learned gate</w:t>
             </w:r>
           </w:p>
         </w:tc>
         <w:tc>
           <w:tcPr>
-            <w:tcW w:type="dxa" w:w="2016"/>
+            <w:tcW w:type="dxa" w:w="1728"/>
             <w:vAlign w:val="center"/>
             <w:tcBorders>
               <w:top w:val="single" w:sz="5" w:color="D9D9D9"/>
@@ -2862,7 +2862,7 @@
                 <w:rFonts w:ascii="Arial" w:hAnsi="Arial"/>
                 <w:sz w:val="17"/>
               </w:rPr>
-              <w:t>1.0544</w:t>
+              <w:t>1.0539</w:t>
             </w:r>
           </w:p>
         </w:tc>
@@ -2890,7 +2890,7 @@
                 <w:rFonts w:ascii="Arial" w:hAnsi="Arial"/>
                 <w:sz w:val="17"/>
               </w:rPr>
-              <w:t>-0.0060</w:t>
+              <w:t>reference</w:t>
             </w:r>
           </w:p>
         </w:tc>
@@ -2898,7 +2898,7 @@
       <w:tr>
         <w:tc>
           <w:tcPr>
-            <w:tcW w:type="dxa" w:w="3528"/>
+            <w:tcW w:type="dxa" w:w="2160"/>
             <w:vAlign w:val="center"/>
             <w:tcBorders>
               <w:top w:val="single" w:sz="5" w:color="D9D9D9"/>
@@ -2920,13 +2920,13 @@
                 <w:rFonts w:ascii="Arial" w:hAnsi="Arial"/>
                 <w:sz w:val="17"/>
               </w:rPr>
-              <w:t>Proteins with lower RMSLE</w:t>
+              <w:t>totalVI</w:t>
             </w:r>
           </w:p>
         </w:tc>
         <w:tc>
           <w:tcPr>
-            <w:tcW w:type="dxa" w:w="2016"/>
+            <w:tcW w:type="dxa" w:w="3816"/>
             <w:vAlign w:val="center"/>
             <w:tcBorders>
               <w:top w:val="single" w:sz="5" w:color="D9D9D9"/>
@@ -2948,13 +2948,13 @@
                 <w:rFonts w:ascii="Arial" w:hAnsi="Arial"/>
                 <w:sz w:val="17"/>
               </w:rPr>
-              <w:t>—</w:t>
+              <w:t>Published joint encoder, width 256</w:t>
             </w:r>
           </w:p>
         </w:tc>
         <w:tc>
           <w:tcPr>
-            <w:tcW w:type="dxa" w:w="2016"/>
+            <w:tcW w:type="dxa" w:w="1728"/>
             <w:vAlign w:val="center"/>
             <w:tcBorders>
               <w:top w:val="single" w:sz="5" w:color="D9D9D9"/>
@@ -2976,7 +2976,7 @@
                 <w:rFonts w:ascii="Arial" w:hAnsi="Arial"/>
                 <w:sz w:val="17"/>
               </w:rPr>
-              <w:t>74/110</w:t>
+              <w:t>1.0601</w:t>
             </w:r>
           </w:p>
         </w:tc>
@@ -3004,7 +3004,7 @@
                 <w:rFonts w:ascii="Arial" w:hAnsi="Arial"/>
                 <w:sz w:val="17"/>
               </w:rPr>
-              <w:t>—</w:t>
+              <w:t>+0.0062</w:t>
             </w:r>
           </w:p>
         </w:tc>
@@ -3012,7 +3012,7 @@
       <w:tr>
         <w:tc>
           <w:tcPr>
-            <w:tcW w:type="dxa" w:w="3528"/>
+            <w:tcW w:type="dxa" w:w="2160"/>
             <w:vAlign w:val="center"/>
             <w:tcBorders>
               <w:top w:val="single" w:sz="5" w:color="D9D9D9"/>
@@ -3034,13 +3034,13 @@
                 <w:rFonts w:ascii="Arial" w:hAnsi="Arial"/>
                 <w:sz w:val="17"/>
               </w:rPr>
-              <w:t>Trainable parameters</w:t>
+              <w:t>Joint same width</w:t>
             </w:r>
           </w:p>
         </w:tc>
         <w:tc>
           <w:tcPr>
-            <w:tcW w:type="dxa" w:w="2016"/>
+            <w:tcW w:type="dxa" w:w="3816"/>
             <w:vAlign w:val="center"/>
             <w:tcBorders>
               <w:top w:val="single" w:sz="5" w:color="D9D9D9"/>
@@ -3062,13 +3062,13 @@
                 <w:rFonts w:ascii="Arial" w:hAnsi="Arial"/>
                 <w:sz w:val="17"/>
               </w:rPr>
-              <w:t>4,574,975</w:t>
+              <w:t>Width 128</w:t>
             </w:r>
           </w:p>
         </w:tc>
         <w:tc>
           <w:tcPr>
-            <w:tcW w:type="dxa" w:w="2016"/>
+            <w:tcW w:type="dxa" w:w="1728"/>
             <w:vAlign w:val="center"/>
             <w:tcBorders>
               <w:top w:val="single" w:sz="5" w:color="D9D9D9"/>
@@ -3090,7 +3090,7 @@
                 <w:rFonts w:ascii="Arial" w:hAnsi="Arial"/>
                 <w:sz w:val="17"/>
               </w:rPr>
-              <w:t>2,971,904</w:t>
+              <w:t>1.0645</w:t>
             </w:r>
           </w:p>
         </w:tc>
@@ -3118,7 +3118,235 @@
                 <w:rFonts w:ascii="Arial" w:hAnsi="Arial"/>
                 <w:sz w:val="17"/>
               </w:rPr>
-              <w:t>35.0% fewer</w:t>
+              <w:t>+0.0106</w:t>
+            </w:r>
+          </w:p>
+        </w:tc>
+      </w:tr>
+      <w:tr>
+        <w:tc>
+          <w:tcPr>
+            <w:tcW w:type="dxa" w:w="2160"/>
+            <w:vAlign w:val="center"/>
+            <w:tcBorders>
+              <w:top w:val="single" w:sz="5" w:color="D9D9D9"/>
+              <w:left w:val="single" w:sz="5" w:color="D9D9D9"/>
+              <w:bottom w:val="single" w:sz="5" w:color="D9D9D9"/>
+              <w:right w:val="single" w:sz="5" w:color="D9D9D9"/>
+              <w:insideH w:val="single" w:sz="5" w:color="D9D9D9"/>
+              <w:insideV w:val="single" w:sz="5" w:color="D9D9D9"/>
+            </w:tcBorders>
+            <w:shd w:fill="EFF6FF"/>
+          </w:tcPr>
+          <w:p>
+            <w:pPr>
+              <w:spacing w:before="60" w:after="60" w:line="240" w:lineRule="auto"/>
+              <w:jc w:val="left"/>
+            </w:pPr>
+            <w:r>
+              <w:rPr>
+                <w:rFonts w:ascii="Arial" w:hAnsi="Arial"/>
+                <w:sz w:val="17"/>
+              </w:rPr>
+              <w:t>Joint parameter matched</w:t>
+            </w:r>
+          </w:p>
+        </w:tc>
+        <w:tc>
+          <w:tcPr>
+            <w:tcW w:type="dxa" w:w="3816"/>
+            <w:vAlign w:val="center"/>
+            <w:tcBorders>
+              <w:top w:val="single" w:sz="5" w:color="D9D9D9"/>
+              <w:left w:val="single" w:sz="5" w:color="D9D9D9"/>
+              <w:bottom w:val="single" w:sz="5" w:color="D9D9D9"/>
+              <w:right w:val="single" w:sz="5" w:color="D9D9D9"/>
+              <w:insideH w:val="single" w:sz="5" w:color="D9D9D9"/>
+              <w:insideV w:val="single" w:sz="5" w:color="D9D9D9"/>
+            </w:tcBorders>
+            <w:shd w:fill="EFF6FF"/>
+          </w:tcPr>
+          <w:p>
+            <w:pPr>
+              <w:spacing w:before="60" w:after="60" w:line="240" w:lineRule="auto"/>
+              <w:jc w:val="center"/>
+            </w:pPr>
+            <w:r>
+              <w:rPr>
+                <w:rFonts w:ascii="Arial" w:hAnsi="Arial"/>
+                <w:sz w:val="17"/>
+              </w:rPr>
+              <w:t>Width 70</w:t>
+            </w:r>
+          </w:p>
+        </w:tc>
+        <w:tc>
+          <w:tcPr>
+            <w:tcW w:type="dxa" w:w="1728"/>
+            <w:vAlign w:val="center"/>
+            <w:tcBorders>
+              <w:top w:val="single" w:sz="5" w:color="D9D9D9"/>
+              <w:left w:val="single" w:sz="5" w:color="D9D9D9"/>
+              <w:bottom w:val="single" w:sz="5" w:color="D9D9D9"/>
+              <w:right w:val="single" w:sz="5" w:color="D9D9D9"/>
+              <w:insideH w:val="single" w:sz="5" w:color="D9D9D9"/>
+              <w:insideV w:val="single" w:sz="5" w:color="D9D9D9"/>
+            </w:tcBorders>
+            <w:shd w:fill="EFF6FF"/>
+          </w:tcPr>
+          <w:p>
+            <w:pPr>
+              <w:spacing w:before="60" w:after="60" w:line="240" w:lineRule="auto"/>
+              <w:jc w:val="center"/>
+            </w:pPr>
+            <w:r>
+              <w:rPr>
+                <w:rFonts w:ascii="Arial" w:hAnsi="Arial"/>
+                <w:sz w:val="17"/>
+              </w:rPr>
+              <w:t>1.0728</w:t>
+            </w:r>
+          </w:p>
+        </w:tc>
+        <w:tc>
+          <w:tcPr>
+            <w:tcW w:type="dxa" w:w="2088"/>
+            <w:vAlign w:val="center"/>
+            <w:tcBorders>
+              <w:top w:val="single" w:sz="5" w:color="D9D9D9"/>
+              <w:left w:val="single" w:sz="5" w:color="D9D9D9"/>
+              <w:bottom w:val="single" w:sz="5" w:color="D9D9D9"/>
+              <w:right w:val="single" w:sz="5" w:color="D9D9D9"/>
+              <w:insideH w:val="single" w:sz="5" w:color="D9D9D9"/>
+              <w:insideV w:val="single" w:sz="5" w:color="D9D9D9"/>
+            </w:tcBorders>
+            <w:shd w:fill="EFF6FF"/>
+          </w:tcPr>
+          <w:p>
+            <w:pPr>
+              <w:spacing w:before="60" w:after="60" w:line="240" w:lineRule="auto"/>
+              <w:jc w:val="center"/>
+            </w:pPr>
+            <w:r>
+              <w:rPr>
+                <w:rFonts w:ascii="Arial" w:hAnsi="Arial"/>
+                <w:sz w:val="17"/>
+              </w:rPr>
+              <w:t>+0.0189</w:t>
+            </w:r>
+          </w:p>
+        </w:tc>
+      </w:tr>
+      <w:tr>
+        <w:tc>
+          <w:tcPr>
+            <w:tcW w:type="dxa" w:w="2160"/>
+            <w:vAlign w:val="center"/>
+            <w:tcBorders>
+              <w:top w:val="single" w:sz="5" w:color="D9D9D9"/>
+              <w:left w:val="single" w:sz="5" w:color="D9D9D9"/>
+              <w:bottom w:val="single" w:sz="5" w:color="D9D9D9"/>
+              <w:right w:val="single" w:sz="5" w:color="D9D9D9"/>
+              <w:insideH w:val="single" w:sz="5" w:color="D9D9D9"/>
+              <w:insideV w:val="single" w:sz="5" w:color="D9D9D9"/>
+            </w:tcBorders>
+            <w:shd w:fill="FFFFFF"/>
+          </w:tcPr>
+          <w:p>
+            <w:pPr>
+              <w:spacing w:before="60" w:after="60" w:line="240" w:lineRule="auto"/>
+              <w:jc w:val="left"/>
+            </w:pPr>
+            <w:r>
+              <w:rPr>
+                <w:rFonts w:ascii="Arial" w:hAnsi="Arial"/>
+                <w:sz w:val="17"/>
+              </w:rPr>
+              <w:t>Joint plus availability</w:t>
+            </w:r>
+          </w:p>
+        </w:tc>
+        <w:tc>
+          <w:tcPr>
+            <w:tcW w:type="dxa" w:w="3816"/>
+            <w:vAlign w:val="center"/>
+            <w:tcBorders>
+              <w:top w:val="single" w:sz="5" w:color="D9D9D9"/>
+              <w:left w:val="single" w:sz="5" w:color="D9D9D9"/>
+              <w:bottom w:val="single" w:sz="5" w:color="D9D9D9"/>
+              <w:right w:val="single" w:sz="5" w:color="D9D9D9"/>
+              <w:insideH w:val="single" w:sz="5" w:color="D9D9D9"/>
+              <w:insideV w:val="single" w:sz="5" w:color="D9D9D9"/>
+            </w:tcBorders>
+            <w:shd w:fill="FFFFFF"/>
+          </w:tcPr>
+          <w:p>
+            <w:pPr>
+              <w:spacing w:before="60" w:after="60" w:line="240" w:lineRule="auto"/>
+              <w:jc w:val="center"/>
+            </w:pPr>
+            <w:r>
+              <w:rPr>
+                <w:rFonts w:ascii="Arial" w:hAnsi="Arial"/>
+                <w:sz w:val="17"/>
+              </w:rPr>
+              <w:t>Width 128 and panel indicator</w:t>
+            </w:r>
+          </w:p>
+        </w:tc>
+        <w:tc>
+          <w:tcPr>
+            <w:tcW w:type="dxa" w:w="1728"/>
+            <w:vAlign w:val="center"/>
+            <w:tcBorders>
+              <w:top w:val="single" w:sz="5" w:color="D9D9D9"/>
+              <w:left w:val="single" w:sz="5" w:color="D9D9D9"/>
+              <w:bottom w:val="single" w:sz="5" w:color="D9D9D9"/>
+              <w:right w:val="single" w:sz="5" w:color="D9D9D9"/>
+              <w:insideH w:val="single" w:sz="5" w:color="D9D9D9"/>
+              <w:insideV w:val="single" w:sz="5" w:color="D9D9D9"/>
+            </w:tcBorders>
+            <w:shd w:fill="FFFFFF"/>
+          </w:tcPr>
+          <w:p>
+            <w:pPr>
+              <w:spacing w:before="60" w:after="60" w:line="240" w:lineRule="auto"/>
+              <w:jc w:val="center"/>
+            </w:pPr>
+            <w:r>
+              <w:rPr>
+                <w:rFonts w:ascii="Arial" w:hAnsi="Arial"/>
+                <w:sz w:val="17"/>
+              </w:rPr>
+              <w:t>1.0651</w:t>
+            </w:r>
+          </w:p>
+        </w:tc>
+        <w:tc>
+          <w:tcPr>
+            <w:tcW w:type="dxa" w:w="2088"/>
+            <w:vAlign w:val="center"/>
+            <w:tcBorders>
+              <w:top w:val="single" w:sz="5" w:color="D9D9D9"/>
+              <w:left w:val="single" w:sz="5" w:color="D9D9D9"/>
+              <w:bottom w:val="single" w:sz="5" w:color="D9D9D9"/>
+              <w:right w:val="single" w:sz="5" w:color="D9D9D9"/>
+              <w:insideH w:val="single" w:sz="5" w:color="D9D9D9"/>
+              <w:insideV w:val="single" w:sz="5" w:color="D9D9D9"/>
+            </w:tcBorders>
+            <w:shd w:fill="FFFFFF"/>
+          </w:tcPr>
+          <w:p>
+            <w:pPr>
+              <w:spacing w:before="60" w:after="60" w:line="240" w:lineRule="auto"/>
+              <w:jc w:val="center"/>
+            </w:pPr>
+            <w:r>
+              <w:rPr>
+                <w:rFonts w:ascii="Arial" w:hAnsi="Arial"/>
+                <w:sz w:val="17"/>
+              </w:rPr>
+              <w:t>+0.0112</w:t>
             </w:r>
           </w:p>
         </w:tc>
@@ -3138,17 +3366,17 @@
           <w:b/>
           <w:color w:val="C2410C"/>
         </w:rPr>
-        <w:t>Result  FusionVI's mean RMSLE was 0.57% lower, but the seed-level interval included zero.</w:t>
+        <w:t>Result  FusionVI's small advantage survives matched encoder controls across 16 seeds.</w:t>
       </w:r>
     </w:p>
     <w:p>
       <w:r>
-        <w:t>The seed-paired difference was -0.0060 (95% CI -0.0176 to +0.0056; paired t p=0.20; exact p=0.25). Three of four seeds favored FusionVI. The protein-level p=1.04e-05 is descriptive because proteins are repeated outcomes. The 35.0% parameter difference mostly reflects width 128 versus 256 and removal of totalVI's separate library encoder. Same-width, parameter-matched and missingness-aware controls are required to isolate fusion.</w:t>
+        <w:t>Against the same-width joint encoder, FusionVI reduced RMSLE by 0.0106 (95% CI -0.0135 to -0.0077; Holm p=3.4e-06) and won 15/16 seeds. Against the parameter-matched encoder, the reduction was 0.0189 (95% CI -0.0216 to -0.0162; Holm p=7.9e-10) with 16/16 wins. Against the missingness-aware joint encoder, the reduction was 0.0112 (95% CI -0.0143 to -0.0081; Holm p=3.4e-06) with 15/16 wins. The availability indicator alone did not help (difference +0.0006; p=0.51).</w:t>
       </w:r>
     </w:p>
     <w:p>
       <w:r>
-        <w:t>A source-only RNA baseline fit a 128-component SVD and multi-output ridge on D1, selected its penalty on a D1 validation split, and reached mean D2 protein RMSLE 0.6379. This is substantially below totalVI (1.0605) and FusionVI (1.0544). Source-defined marker AUROC was 0.976 for CD4, 0.990 for CD8 and 0.995 for CD19, but mean within-cell-type Spearman was only 0.169. Aggregate marker separation therefore does not imply recovery of subtle within-cell-state variation. Paired modality-dropout arms now test whether supervised RNA-only latents close this gap.</w:t>
+        <w:t>A source-only RNA baseline fit a 128-component SVD and multi-output ridge on D1, selected its penalty on a D1 validation split, and reached mean D2 protein RMSLE 0.6379. This is substantially below every neural model. Source-defined marker AUROC was 0.976 for CD4, 0.990 for CD8 and 0.995 for CD19, but mean within-cell-type Spearman was only 0.169. Aggregate marker separation therefore does not imply recovery of subtle within-cell-state variation. Modality-dropout arms are implemented but were not part of the completed Tier 1 claim.</w:t>
       </w:r>
     </w:p>
     <w:p>
@@ -3159,7 +3387,7 @@
       <w:r>
         <w:drawing>
           <wp:inline xmlns:a="http://schemas.openxmlformats.org/drawingml/2006/main" xmlns:pic="http://schemas.openxmlformats.org/drawingml/2006/picture">
-            <wp:extent cx="6126480" cy="2116420"/>
+            <wp:extent cx="6126480" cy="2365219"/>
             <wp:docPr id="4" name="Picture 4"/>
             <wp:cNvGraphicFramePr>
               <a:graphicFrameLocks noChangeAspect="1"/>
@@ -3168,7 +3396,7 @@
               <a:graphicData uri="http://schemas.openxmlformats.org/drawingml/2006/picture">
                 <pic:pic>
                   <pic:nvPicPr>
-                    <pic:cNvPr id="0" name="paper_benchmark_totalvi_vs_fusionvi.png"/>
+                    <pic:cNvPr id="0" name="control_benchmark.png"/>
                     <pic:cNvPicPr/>
                   </pic:nvPicPr>
                   <pic:blipFill>
@@ -3180,7 +3408,7 @@
                   <pic:spPr>
                     <a:xfrm>
                       <a:off x="0" y="0"/>
-                      <a:ext cx="6126480" cy="2116420"/>
+                      <a:ext cx="6126480" cy="2365219"/>
                     </a:xfrm>
                     <a:prstGeom prst="rect"/>
                   </pic:spPr>
@@ -3201,7 +3429,7 @@
           <w:i/>
           <w:sz w:val="17"/>
         </w:rPr>
-        <w:t>Figure 4. Paired seeds, per-protein RMSLE and paired protein differences.</w:t>
+        <w:t>Figure 4. Seed-paired FusionVI contrasts against the three prespecified Tier 1 joint-encoder controls.</w:t>
       </w:r>
     </w:p>
     <w:p>
@@ -3219,7 +3447,7 @@
     </w:p>
     <w:p>
       <w:r>
-        <w:t>The experiments support a narrow and biologically coherent contribution. The complete-panel experiment shows a small FusionVI-versus-totalVI difference, but four seeds and unequal capacity do not identify gated fusion as its cause, and an RNA ridge baseline performs substantially better than both. When other proteins remain available, measured protein context often contributes more than the learned latent. The Papalexi result shows that multimodal context can rank unseen PD-L1 perturbation effects, while the CMTM6 failure exposes a post-transcriptional boundary.</w:t>
+        <w:t>The experiments support a narrow and biologically coherent contribution. The complete-panel experiment shows a small, reproducible FusionVI advantage over matched joint encoders across 16 paired seeds, while an RNA ridge baseline still performs substantially better on aggregate RMSLE. When other proteins remain available, measured protein context often contributes more than the learned latent. The Papalexi result shows that multimodal context can rank unseen PD-L1 perturbation effects, while the CMTM6 failure exposes a post-transcriptional boundary.</w:t>
       </w:r>
     </w:p>
     <w:p>
@@ -3227,7 +3455,15 @@
         <w:pStyle w:val="ListBullet"/>
       </w:pPr>
       <w:r>
-        <w:t>Negative benchmark result: RNA SVD-ridge outperformed both neural models on full-panel RMSLE.</w:t>
+        <w:t>Controlled benchmark result: FusionVI beat same-width, parameter-matched and missingness-aware joint encoders.</w:t>
+      </w:r>
+    </w:p>
+    <w:p>
+      <w:pPr>
+        <w:pStyle w:val="ListBullet"/>
+      </w:pPr>
+      <w:r>
+        <w:t>Negative benchmark result: RNA SVD-ridge outperformed every neural model on full-panel RMSLE.</w:t>
       </w:r>
     </w:p>
     <w:p>
@@ -3296,7 +3532,7 @@
         <w:pStyle w:val="ListBullet"/>
       </w:pPr>
       <w:r>
-        <w:t>Complete-panel benchmark: one source-target batch pair and four seeds rather than the paper's 30.</w:t>
+        <w:t>Complete-panel benchmark: one source-target batch pair and 16 seeds rather than the paper's 30.</w:t>
       </w:r>
     </w:p>
     <w:p>
@@ -3304,7 +3540,7 @@
         <w:pStyle w:val="ListBullet"/>
       </w:pPr>
       <w:r>
-        <w:t>The original complete-panel comparison differs in encoder width and library-network design; control arms are running.</w:t>
+        <w:t>Same-width, parameter-matched and missingness-aware controls are complete; modality-dropout arms remain pending.</w:t>
       </w:r>
     </w:p>
     <w:p>
@@ -3328,7 +3564,7 @@
         <w:pStyle w:val="ListBullet"/>
       </w:pPr>
       <w:r>
-        <w:t>Modality-dropout arms and neural-model foreground, cell-type and marker-AUROC analyses are implemented but full runs remain pending.</w:t>
+        <w:t>Neural-model foreground, cell-type and marker-AUROC analyses remain pending.</w:t>
       </w:r>
     </w:p>
     <w:p>
@@ -4128,9 +4364,6 @@
     <w:qFormat/>
     <w:rsid w:val="00FC693F"/>
     <w:pPr>
-      <w:pBdr>
-        <w:bottom w:val="single" w:sz="8" w:space="4" w:color="4F81BD" w:themeColor="accent1"/>
-      </w:pBdr>
       <w:spacing w:after="300" w:line="240" w:lineRule="auto"/>
       <w:contextualSpacing/>
     </w:pPr>

</xml_diff>

<commit_message>
Complete calibrated FusionVI evaluation and deliverables
</commit_message>
<xml_diff>
--- a/deliverables/FusionVI_All_Experiments_Technical_Report.docx
+++ b/deliverables/FusionVI_All_Experiments_Technical_Report.docx
@@ -44,7 +44,7 @@
     </w:p>
     <w:p>
       <w:r>
-        <w:t>FusionVI tests whether modality-specific encoding improves recovery of therapeutic surface biomarkers when protein measurements are hidden, discordant with RNA or observed under an unseen perturbation. Four completed experiments cover held-out human donors, held-out CRISPR targets, cross-mouse transfer and the full missing-protein-panel benchmark from the totalVI paper. The evidence is deliberately mixed: multimodal context is useful in the PD-L1 perturbation task, while targeted marker studies show that measured protein context often matters more than the learned latent. In the complete-panel benchmark, FusionVI retains a small advantage over three matched joint-encoder controls across 16 seeds, although a source-only RNA ridge baseline outperforms every neural model on aggregate RMSLE. These results support a bounded biomarker-completion and perturbation-ranking contribution.</w:t>
+        <w:t>FusionVI tests whether modality-specific encoding improves recovery of therapeutic surface biomarkers when protein measurements are hidden, discordant with RNA or observed under an unseen perturbation. Four completed experiments cover held-out human donors, held-out CRISPR targets, cross-mouse transfer and the full missing-protein-panel benchmark from the totalVI paper. The evidence is deliberately mixed: multimodal context is useful in the PD-L1 perturbation task, while targeted marker studies show that measured protein context often matters more than the learned latent. In the complete-panel benchmark, FusionVI has a small advantage only under the original log1p-of-mean readout. A D1-only calibration removes that advantage, while residual and within-cell-type metrics slightly favour totalVI. These results support a bounded biomarker-completion and perturbation-ranking contribution.</w:t>
       </w:r>
     </w:p>
     <w:p>
@@ -511,7 +511,7 @@
                 <w:rFonts w:ascii="Arial" w:hAnsi="Arial"/>
                 <w:sz w:val="17"/>
               </w:rPr>
-              <w:t>FusionVI beat three matched joint encoders; RNA ridge RMSLE was 0.638</w:t>
+              <w:t>Raw RMSLE lead vanished after D1-only calibration; information metrics did not improve</w:t>
             </w:r>
           </w:p>
         </w:tc>
@@ -1187,7 +1187,7 @@
       <w:r>
         <w:drawing>
           <wp:inline xmlns:a="http://schemas.openxmlformats.org/drawingml/2006/main" xmlns:pic="http://schemas.openxmlformats.org/drawingml/2006/picture">
-            <wp:extent cx="5989320" cy="3825526"/>
+            <wp:extent cx="5989320" cy="3250960"/>
             <wp:docPr id="1" name="Picture 1"/>
             <wp:cNvGraphicFramePr>
               <a:graphicFrameLocks noChangeAspect="1"/>
@@ -1208,7 +1208,7 @@
                   <pic:spPr>
                     <a:xfrm>
                       <a:off x="0" y="0"/>
-                      <a:ext cx="5989320" cy="3825526"/>
+                      <a:ext cx="5989320" cy="3250960"/>
                     </a:xfrm>
                     <a:prstGeom prst="rect"/>
                   </pic:spPr>
@@ -1229,7 +1229,7 @@
           <w:i/>
           <w:sz w:val="17"/>
         </w:rPr>
-        <w:t>Figure 1. Donor-paired native-decoder marker recovery. Large diamonds show means.</w:t>
+        <w:t>Figure 1. Aggregate hidden-marker recovery across 10 donor-held-out folds.</w:t>
       </w:r>
     </w:p>
     <w:p>
@@ -1998,7 +1998,7 @@
       <w:r>
         <w:drawing>
           <wp:inline xmlns:a="http://schemas.openxmlformats.org/drawingml/2006/main" xmlns:pic="http://schemas.openxmlformats.org/drawingml/2006/picture">
-            <wp:extent cx="5989320" cy="2337735"/>
+            <wp:extent cx="5989320" cy="2881335"/>
             <wp:docPr id="2" name="Picture 2"/>
             <wp:cNvGraphicFramePr>
               <a:graphicFrameLocks noChangeAspect="1"/>
@@ -2019,7 +2019,7 @@
                   <pic:spPr>
                     <a:xfrm>
                       <a:off x="0" y="0"/>
-                      <a:ext cx="5989320" cy="2337735"/>
+                      <a:ext cx="5989320" cy="2881335"/>
                     </a:xfrm>
                     <a:prstGeom prst="rect"/>
                   </pic:spPr>
@@ -2576,7 +2576,7 @@
       <w:r>
         <w:drawing>
           <wp:inline xmlns:a="http://schemas.openxmlformats.org/drawingml/2006/main" xmlns:pic="http://schemas.openxmlformats.org/drawingml/2006/picture">
-            <wp:extent cx="6035040" cy="2306127"/>
+            <wp:extent cx="6035040" cy="3275776"/>
             <wp:docPr id="3" name="Picture 3"/>
             <wp:cNvGraphicFramePr>
               <a:graphicFrameLocks noChangeAspect="1"/>
@@ -2597,7 +2597,7 @@
                   <pic:spPr>
                     <a:xfrm>
                       <a:off x="0" y="0"/>
-                      <a:ext cx="6035040" cy="2306127"/>
+                      <a:ext cx="6035040" cy="3275776"/>
                     </a:xfrm>
                     <a:prstGeom prst="rect"/>
                   </pic:spPr>
@@ -3366,7 +3366,7 @@
           <w:b/>
           <w:color w:val="C2410C"/>
         </w:rPr>
-        <w:t>Result  FusionVI's small advantage survives matched encoder controls across 16 seeds.</w:t>
+        <w:t>Result  The original RMSLE lead is principally an output-scale effect.</w:t>
       </w:r>
     </w:p>
     <w:p>
@@ -3376,7 +3376,608 @@
     </w:p>
     <w:p>
       <w:r>
-        <w:t>A source-only RNA baseline fit a 128-component SVD and multi-output ridge on D1, selected its penalty on a D1 validation split, and reached mean D2 protein RMSLE 0.6379. This is substantially below every neural model. Source-defined marker AUROC was 0.976 for CD4, 0.990 for CD8 and 0.995 for CD19, but mean within-cell-type Spearman was only 0.169. Aggregate marker separation therefore does not imply recovery of subtle within-cell-state variation. Modality-dropout arms are implemented but were not part of the completed Tier 1 claim.</w:t>
+        <w:t>Every checkpoint was then re-scored without retraining. Posterior E[log1p y] reduced both models' error, and a per-protein affine calibration fitted only on D1 RNA-only predictions reduced mean RMSLE to 0.5745 for totalVI and 0.5831 for FusionVI. The calibrated difference was +0.0085 (95% CI -0.0003 to +0.0173; Holm p=0.218).</w:t>
+      </w:r>
+    </w:p>
+    <w:tbl>
+      <w:tblPr>
+        <w:tblW w:type="auto" w:w="0"/>
+        <w:jc w:val="center"/>
+        <w:tblLayout w:type="fixed"/>
+        <w:tblLook w:firstColumn="1" w:firstRow="1" w:lastColumn="0" w:lastRow="0" w:noHBand="0" w:noVBand="1" w:val="04A0"/>
+      </w:tblPr>
+      <w:tblGrid>
+        <w:gridCol w:w="2541"/>
+        <w:gridCol w:w="2541"/>
+        <w:gridCol w:w="2541"/>
+        <w:gridCol w:w="2541"/>
+      </w:tblGrid>
+      <w:tr>
+        <w:trPr>
+          <w:tblHeader w:val="true"/>
+        </w:trPr>
+        <w:tc>
+          <w:tcPr>
+            <w:tcW w:type="dxa" w:w="3960"/>
+            <w:vAlign w:val="center"/>
+            <w:tcBorders>
+              <w:top w:val="single" w:sz="5" w:color="D9D9D9"/>
+              <w:left w:val="single" w:sz="5" w:color="D9D9D9"/>
+              <w:bottom w:val="single" w:sz="5" w:color="D9D9D9"/>
+              <w:right w:val="single" w:sz="5" w:color="D9D9D9"/>
+              <w:insideH w:val="single" w:sz="5" w:color="D9D9D9"/>
+              <w:insideV w:val="single" w:sz="5" w:color="D9D9D9"/>
+            </w:tcBorders>
+            <w:shd w:fill="172554"/>
+          </w:tcPr>
+          <w:p>
+            <w:pPr>
+              <w:spacing w:before="60" w:after="60" w:line="240" w:lineRule="auto"/>
+            </w:pPr>
+            <w:r>
+              <w:rPr>
+                <w:rFonts w:ascii="Arial" w:hAnsi="Arial"/>
+                <w:b/>
+                <w:color w:val="FFFFFF"/>
+                <w:sz w:val="17"/>
+              </w:rPr>
+              <w:t>Readout</w:t>
+            </w:r>
+          </w:p>
+        </w:tc>
+        <w:tc>
+          <w:tcPr>
+            <w:tcW w:type="dxa" w:w="1872"/>
+            <w:vAlign w:val="center"/>
+            <w:tcBorders>
+              <w:top w:val="single" w:sz="5" w:color="D9D9D9"/>
+              <w:left w:val="single" w:sz="5" w:color="D9D9D9"/>
+              <w:bottom w:val="single" w:sz="5" w:color="D9D9D9"/>
+              <w:right w:val="single" w:sz="5" w:color="D9D9D9"/>
+              <w:insideH w:val="single" w:sz="5" w:color="D9D9D9"/>
+              <w:insideV w:val="single" w:sz="5" w:color="D9D9D9"/>
+            </w:tcBorders>
+            <w:shd w:fill="172554"/>
+          </w:tcPr>
+          <w:p>
+            <w:pPr>
+              <w:spacing w:before="60" w:after="60" w:line="240" w:lineRule="auto"/>
+            </w:pPr>
+            <w:r>
+              <w:rPr>
+                <w:rFonts w:ascii="Arial" w:hAnsi="Arial"/>
+                <w:b/>
+                <w:color w:val="FFFFFF"/>
+                <w:sz w:val="17"/>
+              </w:rPr>
+              <w:t>totalVI</w:t>
+            </w:r>
+          </w:p>
+        </w:tc>
+        <w:tc>
+          <w:tcPr>
+            <w:tcW w:type="dxa" w:w="1872"/>
+            <w:vAlign w:val="center"/>
+            <w:tcBorders>
+              <w:top w:val="single" w:sz="5" w:color="D9D9D9"/>
+              <w:left w:val="single" w:sz="5" w:color="D9D9D9"/>
+              <w:bottom w:val="single" w:sz="5" w:color="D9D9D9"/>
+              <w:right w:val="single" w:sz="5" w:color="D9D9D9"/>
+              <w:insideH w:val="single" w:sz="5" w:color="D9D9D9"/>
+              <w:insideV w:val="single" w:sz="5" w:color="D9D9D9"/>
+            </w:tcBorders>
+            <w:shd w:fill="172554"/>
+          </w:tcPr>
+          <w:p>
+            <w:pPr>
+              <w:spacing w:before="60" w:after="60" w:line="240" w:lineRule="auto"/>
+            </w:pPr>
+            <w:r>
+              <w:rPr>
+                <w:rFonts w:ascii="Arial" w:hAnsi="Arial"/>
+                <w:b/>
+                <w:color w:val="FFFFFF"/>
+                <w:sz w:val="17"/>
+              </w:rPr>
+              <w:t>FusionVI</w:t>
+            </w:r>
+          </w:p>
+        </w:tc>
+        <w:tc>
+          <w:tcPr>
+            <w:tcW w:type="dxa" w:w="2448"/>
+            <w:vAlign w:val="center"/>
+            <w:tcBorders>
+              <w:top w:val="single" w:sz="5" w:color="D9D9D9"/>
+              <w:left w:val="single" w:sz="5" w:color="D9D9D9"/>
+              <w:bottom w:val="single" w:sz="5" w:color="D9D9D9"/>
+              <w:right w:val="single" w:sz="5" w:color="D9D9D9"/>
+              <w:insideH w:val="single" w:sz="5" w:color="D9D9D9"/>
+              <w:insideV w:val="single" w:sz="5" w:color="D9D9D9"/>
+            </w:tcBorders>
+            <w:shd w:fill="172554"/>
+          </w:tcPr>
+          <w:p>
+            <w:pPr>
+              <w:spacing w:before="60" w:after="60" w:line="240" w:lineRule="auto"/>
+            </w:pPr>
+            <w:r>
+              <w:rPr>
+                <w:rFonts w:ascii="Arial" w:hAnsi="Arial"/>
+                <w:b/>
+                <w:color w:val="FFFFFF"/>
+                <w:sz w:val="17"/>
+              </w:rPr>
+              <w:t>FusionVI − totalVI</w:t>
+            </w:r>
+          </w:p>
+        </w:tc>
+      </w:tr>
+      <w:tr>
+        <w:tc>
+          <w:tcPr>
+            <w:tcW w:type="dxa" w:w="3960"/>
+            <w:vAlign w:val="center"/>
+            <w:tcBorders>
+              <w:top w:val="single" w:sz="5" w:color="D9D9D9"/>
+              <w:left w:val="single" w:sz="5" w:color="D9D9D9"/>
+              <w:bottom w:val="single" w:sz="5" w:color="D9D9D9"/>
+              <w:right w:val="single" w:sz="5" w:color="D9D9D9"/>
+              <w:insideH w:val="single" w:sz="5" w:color="D9D9D9"/>
+              <w:insideV w:val="single" w:sz="5" w:color="D9D9D9"/>
+            </w:tcBorders>
+            <w:shd w:fill="FFFFFF"/>
+          </w:tcPr>
+          <w:p>
+            <w:pPr>
+              <w:spacing w:before="60" w:after="60" w:line="240" w:lineRule="auto"/>
+              <w:jc w:val="left"/>
+            </w:pPr>
+            <w:r>
+              <w:rPr>
+                <w:rFonts w:ascii="Arial" w:hAnsi="Arial"/>
+                <w:sz w:val="17"/>
+              </w:rPr>
+              <w:t>Original log1p(E[y])</w:t>
+            </w:r>
+          </w:p>
+        </w:tc>
+        <w:tc>
+          <w:tcPr>
+            <w:tcW w:type="dxa" w:w="1872"/>
+            <w:vAlign w:val="center"/>
+            <w:tcBorders>
+              <w:top w:val="single" w:sz="5" w:color="D9D9D9"/>
+              <w:left w:val="single" w:sz="5" w:color="D9D9D9"/>
+              <w:bottom w:val="single" w:sz="5" w:color="D9D9D9"/>
+              <w:right w:val="single" w:sz="5" w:color="D9D9D9"/>
+              <w:insideH w:val="single" w:sz="5" w:color="D9D9D9"/>
+              <w:insideV w:val="single" w:sz="5" w:color="D9D9D9"/>
+            </w:tcBorders>
+            <w:shd w:fill="FFFFFF"/>
+          </w:tcPr>
+          <w:p>
+            <w:pPr>
+              <w:spacing w:before="60" w:after="60" w:line="240" w:lineRule="auto"/>
+              <w:jc w:val="center"/>
+            </w:pPr>
+            <w:r>
+              <w:rPr>
+                <w:rFonts w:ascii="Arial" w:hAnsi="Arial"/>
+                <w:sz w:val="17"/>
+              </w:rPr>
+              <w:t>1.0600</w:t>
+            </w:r>
+          </w:p>
+        </w:tc>
+        <w:tc>
+          <w:tcPr>
+            <w:tcW w:type="dxa" w:w="1872"/>
+            <w:vAlign w:val="center"/>
+            <w:tcBorders>
+              <w:top w:val="single" w:sz="5" w:color="D9D9D9"/>
+              <w:left w:val="single" w:sz="5" w:color="D9D9D9"/>
+              <w:bottom w:val="single" w:sz="5" w:color="D9D9D9"/>
+              <w:right w:val="single" w:sz="5" w:color="D9D9D9"/>
+              <w:insideH w:val="single" w:sz="5" w:color="D9D9D9"/>
+              <w:insideV w:val="single" w:sz="5" w:color="D9D9D9"/>
+            </w:tcBorders>
+            <w:shd w:fill="FFFFFF"/>
+          </w:tcPr>
+          <w:p>
+            <w:pPr>
+              <w:spacing w:before="60" w:after="60" w:line="240" w:lineRule="auto"/>
+              <w:jc w:val="center"/>
+            </w:pPr>
+            <w:r>
+              <w:rPr>
+                <w:rFonts w:ascii="Arial" w:hAnsi="Arial"/>
+                <w:sz w:val="17"/>
+              </w:rPr>
+              <w:t>1.0538</w:t>
+            </w:r>
+          </w:p>
+        </w:tc>
+        <w:tc>
+          <w:tcPr>
+            <w:tcW w:type="dxa" w:w="2448"/>
+            <w:vAlign w:val="center"/>
+            <w:tcBorders>
+              <w:top w:val="single" w:sz="5" w:color="D9D9D9"/>
+              <w:left w:val="single" w:sz="5" w:color="D9D9D9"/>
+              <w:bottom w:val="single" w:sz="5" w:color="D9D9D9"/>
+              <w:right w:val="single" w:sz="5" w:color="D9D9D9"/>
+              <w:insideH w:val="single" w:sz="5" w:color="D9D9D9"/>
+              <w:insideV w:val="single" w:sz="5" w:color="D9D9D9"/>
+            </w:tcBorders>
+            <w:shd w:fill="FFFFFF"/>
+          </w:tcPr>
+          <w:p>
+            <w:pPr>
+              <w:spacing w:before="60" w:after="60" w:line="240" w:lineRule="auto"/>
+              <w:jc w:val="center"/>
+            </w:pPr>
+            <w:r>
+              <w:rPr>
+                <w:rFonts w:ascii="Arial" w:hAnsi="Arial"/>
+                <w:sz w:val="17"/>
+              </w:rPr>
+              <w:t>-0.0062</w:t>
+            </w:r>
+          </w:p>
+        </w:tc>
+      </w:tr>
+      <w:tr>
+        <w:tc>
+          <w:tcPr>
+            <w:tcW w:type="dxa" w:w="3960"/>
+            <w:vAlign w:val="center"/>
+            <w:tcBorders>
+              <w:top w:val="single" w:sz="5" w:color="D9D9D9"/>
+              <w:left w:val="single" w:sz="5" w:color="D9D9D9"/>
+              <w:bottom w:val="single" w:sz="5" w:color="D9D9D9"/>
+              <w:right w:val="single" w:sz="5" w:color="D9D9D9"/>
+              <w:insideH w:val="single" w:sz="5" w:color="D9D9D9"/>
+              <w:insideV w:val="single" w:sz="5" w:color="D9D9D9"/>
+            </w:tcBorders>
+            <w:shd w:fill="EFF6FF"/>
+          </w:tcPr>
+          <w:p>
+            <w:pPr>
+              <w:spacing w:before="60" w:after="60" w:line="240" w:lineRule="auto"/>
+              <w:jc w:val="left"/>
+            </w:pPr>
+            <w:r>
+              <w:rPr>
+                <w:rFonts w:ascii="Arial" w:hAnsi="Arial"/>
+                <w:sz w:val="17"/>
+              </w:rPr>
+              <w:t>Posterior E[log1p y]</w:t>
+            </w:r>
+          </w:p>
+        </w:tc>
+        <w:tc>
+          <w:tcPr>
+            <w:tcW w:type="dxa" w:w="1872"/>
+            <w:vAlign w:val="center"/>
+            <w:tcBorders>
+              <w:top w:val="single" w:sz="5" w:color="D9D9D9"/>
+              <w:left w:val="single" w:sz="5" w:color="D9D9D9"/>
+              <w:bottom w:val="single" w:sz="5" w:color="D9D9D9"/>
+              <w:right w:val="single" w:sz="5" w:color="D9D9D9"/>
+              <w:insideH w:val="single" w:sz="5" w:color="D9D9D9"/>
+              <w:insideV w:val="single" w:sz="5" w:color="D9D9D9"/>
+            </w:tcBorders>
+            <w:shd w:fill="EFF6FF"/>
+          </w:tcPr>
+          <w:p>
+            <w:pPr>
+              <w:spacing w:before="60" w:after="60" w:line="240" w:lineRule="auto"/>
+              <w:jc w:val="center"/>
+            </w:pPr>
+            <w:r>
+              <w:rPr>
+                <w:rFonts w:ascii="Arial" w:hAnsi="Arial"/>
+                <w:sz w:val="17"/>
+              </w:rPr>
+              <w:t>0.9616</w:t>
+            </w:r>
+          </w:p>
+        </w:tc>
+        <w:tc>
+          <w:tcPr>
+            <w:tcW w:type="dxa" w:w="1872"/>
+            <w:vAlign w:val="center"/>
+            <w:tcBorders>
+              <w:top w:val="single" w:sz="5" w:color="D9D9D9"/>
+              <w:left w:val="single" w:sz="5" w:color="D9D9D9"/>
+              <w:bottom w:val="single" w:sz="5" w:color="D9D9D9"/>
+              <w:right w:val="single" w:sz="5" w:color="D9D9D9"/>
+              <w:insideH w:val="single" w:sz="5" w:color="D9D9D9"/>
+              <w:insideV w:val="single" w:sz="5" w:color="D9D9D9"/>
+            </w:tcBorders>
+            <w:shd w:fill="EFF6FF"/>
+          </w:tcPr>
+          <w:p>
+            <w:pPr>
+              <w:spacing w:before="60" w:after="60" w:line="240" w:lineRule="auto"/>
+              <w:jc w:val="center"/>
+            </w:pPr>
+            <w:r>
+              <w:rPr>
+                <w:rFonts w:ascii="Arial" w:hAnsi="Arial"/>
+                <w:sz w:val="17"/>
+              </w:rPr>
+              <w:t>0.9569</w:t>
+            </w:r>
+          </w:p>
+        </w:tc>
+        <w:tc>
+          <w:tcPr>
+            <w:tcW w:type="dxa" w:w="2448"/>
+            <w:vAlign w:val="center"/>
+            <w:tcBorders>
+              <w:top w:val="single" w:sz="5" w:color="D9D9D9"/>
+              <w:left w:val="single" w:sz="5" w:color="D9D9D9"/>
+              <w:bottom w:val="single" w:sz="5" w:color="D9D9D9"/>
+              <w:right w:val="single" w:sz="5" w:color="D9D9D9"/>
+              <w:insideH w:val="single" w:sz="5" w:color="D9D9D9"/>
+              <w:insideV w:val="single" w:sz="5" w:color="D9D9D9"/>
+            </w:tcBorders>
+            <w:shd w:fill="EFF6FF"/>
+          </w:tcPr>
+          <w:p>
+            <w:pPr>
+              <w:spacing w:before="60" w:after="60" w:line="240" w:lineRule="auto"/>
+              <w:jc w:val="center"/>
+            </w:pPr>
+            <w:r>
+              <w:rPr>
+                <w:rFonts w:ascii="Arial" w:hAnsi="Arial"/>
+                <w:sz w:val="17"/>
+              </w:rPr>
+              <w:t>-0.0047</w:t>
+            </w:r>
+          </w:p>
+        </w:tc>
+      </w:tr>
+      <w:tr>
+        <w:tc>
+          <w:tcPr>
+            <w:tcW w:type="dxa" w:w="3960"/>
+            <w:vAlign w:val="center"/>
+            <w:tcBorders>
+              <w:top w:val="single" w:sz="5" w:color="D9D9D9"/>
+              <w:left w:val="single" w:sz="5" w:color="D9D9D9"/>
+              <w:bottom w:val="single" w:sz="5" w:color="D9D9D9"/>
+              <w:right w:val="single" w:sz="5" w:color="D9D9D9"/>
+              <w:insideH w:val="single" w:sz="5" w:color="D9D9D9"/>
+              <w:insideV w:val="single" w:sz="5" w:color="D9D9D9"/>
+            </w:tcBorders>
+            <w:shd w:fill="FFFFFF"/>
+          </w:tcPr>
+          <w:p>
+            <w:pPr>
+              <w:spacing w:before="60" w:after="60" w:line="240" w:lineRule="auto"/>
+              <w:jc w:val="left"/>
+            </w:pPr>
+            <w:r>
+              <w:rPr>
+                <w:rFonts w:ascii="Arial" w:hAnsi="Arial"/>
+                <w:sz w:val="17"/>
+              </w:rPr>
+              <w:t>D1-only calibrated</w:t>
+            </w:r>
+          </w:p>
+        </w:tc>
+        <w:tc>
+          <w:tcPr>
+            <w:tcW w:type="dxa" w:w="1872"/>
+            <w:vAlign w:val="center"/>
+            <w:tcBorders>
+              <w:top w:val="single" w:sz="5" w:color="D9D9D9"/>
+              <w:left w:val="single" w:sz="5" w:color="D9D9D9"/>
+              <w:bottom w:val="single" w:sz="5" w:color="D9D9D9"/>
+              <w:right w:val="single" w:sz="5" w:color="D9D9D9"/>
+              <w:insideH w:val="single" w:sz="5" w:color="D9D9D9"/>
+              <w:insideV w:val="single" w:sz="5" w:color="D9D9D9"/>
+            </w:tcBorders>
+            <w:shd w:fill="FFFFFF"/>
+          </w:tcPr>
+          <w:p>
+            <w:pPr>
+              <w:spacing w:before="60" w:after="60" w:line="240" w:lineRule="auto"/>
+              <w:jc w:val="center"/>
+            </w:pPr>
+            <w:r>
+              <w:rPr>
+                <w:rFonts w:ascii="Arial" w:hAnsi="Arial"/>
+                <w:sz w:val="17"/>
+              </w:rPr>
+              <w:t>0.5745</w:t>
+            </w:r>
+          </w:p>
+        </w:tc>
+        <w:tc>
+          <w:tcPr>
+            <w:tcW w:type="dxa" w:w="1872"/>
+            <w:vAlign w:val="center"/>
+            <w:tcBorders>
+              <w:top w:val="single" w:sz="5" w:color="D9D9D9"/>
+              <w:left w:val="single" w:sz="5" w:color="D9D9D9"/>
+              <w:bottom w:val="single" w:sz="5" w:color="D9D9D9"/>
+              <w:right w:val="single" w:sz="5" w:color="D9D9D9"/>
+              <w:insideH w:val="single" w:sz="5" w:color="D9D9D9"/>
+              <w:insideV w:val="single" w:sz="5" w:color="D9D9D9"/>
+            </w:tcBorders>
+            <w:shd w:fill="FFFFFF"/>
+          </w:tcPr>
+          <w:p>
+            <w:pPr>
+              <w:spacing w:before="60" w:after="60" w:line="240" w:lineRule="auto"/>
+              <w:jc w:val="center"/>
+            </w:pPr>
+            <w:r>
+              <w:rPr>
+                <w:rFonts w:ascii="Arial" w:hAnsi="Arial"/>
+                <w:sz w:val="17"/>
+              </w:rPr>
+              <w:t>0.5831</w:t>
+            </w:r>
+          </w:p>
+        </w:tc>
+        <w:tc>
+          <w:tcPr>
+            <w:tcW w:type="dxa" w:w="2448"/>
+            <w:vAlign w:val="center"/>
+            <w:tcBorders>
+              <w:top w:val="single" w:sz="5" w:color="D9D9D9"/>
+              <w:left w:val="single" w:sz="5" w:color="D9D9D9"/>
+              <w:bottom w:val="single" w:sz="5" w:color="D9D9D9"/>
+              <w:right w:val="single" w:sz="5" w:color="D9D9D9"/>
+              <w:insideH w:val="single" w:sz="5" w:color="D9D9D9"/>
+              <w:insideV w:val="single" w:sz="5" w:color="D9D9D9"/>
+            </w:tcBorders>
+            <w:shd w:fill="FFFFFF"/>
+          </w:tcPr>
+          <w:p>
+            <w:pPr>
+              <w:spacing w:before="60" w:after="60" w:line="240" w:lineRule="auto"/>
+              <w:jc w:val="center"/>
+            </w:pPr>
+            <w:r>
+              <w:rPr>
+                <w:rFonts w:ascii="Arial" w:hAnsi="Arial"/>
+                <w:sz w:val="17"/>
+              </w:rPr>
+              <w:t>+0.0085</w:t>
+            </w:r>
+          </w:p>
+        </w:tc>
+      </w:tr>
+      <w:tr>
+        <w:tc>
+          <w:tcPr>
+            <w:tcW w:type="dxa" w:w="3960"/>
+            <w:vAlign w:val="center"/>
+            <w:tcBorders>
+              <w:top w:val="single" w:sz="5" w:color="D9D9D9"/>
+              <w:left w:val="single" w:sz="5" w:color="D9D9D9"/>
+              <w:bottom w:val="single" w:sz="5" w:color="D9D9D9"/>
+              <w:right w:val="single" w:sz="5" w:color="D9D9D9"/>
+              <w:insideH w:val="single" w:sz="5" w:color="D9D9D9"/>
+              <w:insideV w:val="single" w:sz="5" w:color="D9D9D9"/>
+            </w:tcBorders>
+            <w:shd w:fill="EFF6FF"/>
+          </w:tcPr>
+          <w:p>
+            <w:pPr>
+              <w:spacing w:before="60" w:after="60" w:line="240" w:lineRule="auto"/>
+              <w:jc w:val="left"/>
+            </w:pPr>
+            <w:r>
+              <w:rPr>
+                <w:rFonts w:ascii="Arial" w:hAnsi="Arial"/>
+                <w:sz w:val="17"/>
+              </w:rPr>
+              <w:t>RNA SVD-ridge</w:t>
+            </w:r>
+          </w:p>
+        </w:tc>
+        <w:tc>
+          <w:tcPr>
+            <w:tcW w:type="dxa" w:w="1872"/>
+            <w:vAlign w:val="center"/>
+            <w:tcBorders>
+              <w:top w:val="single" w:sz="5" w:color="D9D9D9"/>
+              <w:left w:val="single" w:sz="5" w:color="D9D9D9"/>
+              <w:bottom w:val="single" w:sz="5" w:color="D9D9D9"/>
+              <w:right w:val="single" w:sz="5" w:color="D9D9D9"/>
+              <w:insideH w:val="single" w:sz="5" w:color="D9D9D9"/>
+              <w:insideV w:val="single" w:sz="5" w:color="D9D9D9"/>
+            </w:tcBorders>
+            <w:shd w:fill="EFF6FF"/>
+          </w:tcPr>
+          <w:p>
+            <w:pPr>
+              <w:spacing w:before="60" w:after="60" w:line="240" w:lineRule="auto"/>
+              <w:jc w:val="center"/>
+            </w:pPr>
+            <w:r>
+              <w:rPr>
+                <w:rFonts w:ascii="Arial" w:hAnsi="Arial"/>
+                <w:sz w:val="17"/>
+              </w:rPr>
+              <w:t>0.6373</w:t>
+            </w:r>
+          </w:p>
+        </w:tc>
+        <w:tc>
+          <w:tcPr>
+            <w:tcW w:type="dxa" w:w="1872"/>
+            <w:vAlign w:val="center"/>
+            <w:tcBorders>
+              <w:top w:val="single" w:sz="5" w:color="D9D9D9"/>
+              <w:left w:val="single" w:sz="5" w:color="D9D9D9"/>
+              <w:bottom w:val="single" w:sz="5" w:color="D9D9D9"/>
+              <w:right w:val="single" w:sz="5" w:color="D9D9D9"/>
+              <w:insideH w:val="single" w:sz="5" w:color="D9D9D9"/>
+              <w:insideV w:val="single" w:sz="5" w:color="D9D9D9"/>
+            </w:tcBorders>
+            <w:shd w:fill="EFF6FF"/>
+          </w:tcPr>
+          <w:p>
+            <w:pPr>
+              <w:spacing w:before="60" w:after="60" w:line="240" w:lineRule="auto"/>
+              <w:jc w:val="center"/>
+            </w:pPr>
+            <w:r>
+              <w:rPr>
+                <w:rFonts w:ascii="Arial" w:hAnsi="Arial"/>
+                <w:sz w:val="17"/>
+              </w:rPr>
+              <w:t>—</w:t>
+            </w:r>
+          </w:p>
+        </w:tc>
+        <w:tc>
+          <w:tcPr>
+            <w:tcW w:type="dxa" w:w="2448"/>
+            <w:vAlign w:val="center"/>
+            <w:tcBorders>
+              <w:top w:val="single" w:sz="5" w:color="D9D9D9"/>
+              <w:left w:val="single" w:sz="5" w:color="D9D9D9"/>
+              <w:bottom w:val="single" w:sz="5" w:color="D9D9D9"/>
+              <w:right w:val="single" w:sz="5" w:color="D9D9D9"/>
+              <w:insideH w:val="single" w:sz="5" w:color="D9D9D9"/>
+              <w:insideV w:val="single" w:sz="5" w:color="D9D9D9"/>
+            </w:tcBorders>
+            <w:shd w:fill="EFF6FF"/>
+          </w:tcPr>
+          <w:p>
+            <w:pPr>
+              <w:spacing w:before="60" w:after="60" w:line="240" w:lineRule="auto"/>
+              <w:jc w:val="center"/>
+            </w:pPr>
+            <w:r>
+              <w:rPr>
+                <w:rFonts w:ascii="Arial" w:hAnsi="Arial"/>
+                <w:sz w:val="17"/>
+              </w:rPr>
+              <w:t>—</w:t>
+            </w:r>
+          </w:p>
+        </w:tc>
+      </w:tr>
+    </w:tbl>
+    <w:p>
+      <w:pPr>
+        <w:spacing w:after="20"/>
+      </w:pPr>
+    </w:p>
+    <w:p>
+      <w:r>
+        <w:t>FusionVI's calibrated residual error was higher by +0.0065. Mean within-cell-type Spearman was 0.1640 for FusionVI versus 0.1681 for totalVI; marker AUROC was approximately 0.99 for both. The widened RNA ridge reached 0.6373 RMSLE, so calibrated neural predictions actually outperformed it on aggregate error. The earlier ridge gap was therefore also largely a scale effect.</w:t>
       </w:r>
     </w:p>
     <w:p>
@@ -3387,7 +3988,7 @@
       <w:r>
         <w:drawing>
           <wp:inline xmlns:a="http://schemas.openxmlformats.org/drawingml/2006/main" xmlns:pic="http://schemas.openxmlformats.org/drawingml/2006/picture">
-            <wp:extent cx="6126480" cy="2365219"/>
+            <wp:extent cx="6126480" cy="2059946"/>
             <wp:docPr id="4" name="Picture 4"/>
             <wp:cNvGraphicFramePr>
               <a:graphicFrameLocks noChangeAspect="1"/>
@@ -3396,7 +3997,7 @@
               <a:graphicData uri="http://schemas.openxmlformats.org/drawingml/2006/picture">
                 <pic:pic>
                   <pic:nvPicPr>
-                    <pic:cNvPr id="0" name="control_benchmark.png"/>
+                    <pic:cNvPr id="0" name="calibration_benchmark.png"/>
                     <pic:cNvPicPr/>
                   </pic:nvPicPr>
                   <pic:blipFill>
@@ -3408,7 +4009,7 @@
                   <pic:spPr>
                     <a:xfrm>
                       <a:off x="0" y="0"/>
-                      <a:ext cx="6126480" cy="2365219"/>
+                      <a:ext cx="6126480" cy="2059946"/>
                     </a:xfrm>
                     <a:prstGeom prst="rect"/>
                   </pic:spPr>
@@ -3429,12 +4030,7 @@
           <w:i/>
           <w:sz w:val="17"/>
         </w:rPr>
-        <w:t>Figure 4. Seed-paired FusionVI contrasts against the three prespecified Tier 1 joint-encoder controls.</w:t>
-      </w:r>
-    </w:p>
-    <w:p>
-      <w:r>
-        <w:br w:type="page"/>
+        <w:t>Figure 4. Scale-matched complete-panel evaluation across 16 paired seeds.</w:t>
       </w:r>
     </w:p>
     <w:p>
@@ -3447,7 +4043,7 @@
     </w:p>
     <w:p>
       <w:r>
-        <w:t>The experiments support a narrow and biologically coherent contribution. The complete-panel experiment shows a small, reproducible FusionVI advantage over matched joint encoders across 16 paired seeds, while an RNA ridge baseline still performs substantially better on aggregate RMSLE. When other proteins remain available, measured protein context often contributes more than the learned latent. The Papalexi result shows that multimodal context can rank unseen PD-L1 perturbation effects, while the CMTM6 failure exposes a post-transcriptional boundary.</w:t>
+        <w:t>The experiments support a narrow and biologically coherent contribution. The complete-panel experiment shows that FusionVI's original RMSLE lead is mainly calibration, while scale-free and residual metrics do not support stronger biological recovery. When other proteins remain available, measured protein context often contributes more than the learned latent. The Papalexi result shows that multimodal context can rank unseen PD-L1 perturbation effects, while the CMTM6 failure exposes a post-transcriptional boundary.</w:t>
       </w:r>
     </w:p>
     <w:p>
@@ -3455,7 +4051,7 @@
         <w:pStyle w:val="ListBullet"/>
       </w:pPr>
       <w:r>
-        <w:t>Controlled benchmark result: FusionVI beat same-width, parameter-matched and missingness-aware joint encoders.</w:t>
+        <w:t>Controlled benchmark result: the raw FusionVI RMSLE lead disappears after D1-only calibration.</w:t>
       </w:r>
     </w:p>
     <w:p>
@@ -3463,7 +4059,7 @@
         <w:pStyle w:val="ListBullet"/>
       </w:pPr>
       <w:r>
-        <w:t>Negative benchmark result: RNA SVD-ridge outperformed every neural model on full-panel RMSLE.</w:t>
+        <w:t>Scale diagnosis: calibration improves both neural models below the RNA ridge aggregate RMSLE.</w:t>
       </w:r>
     </w:p>
     <w:p>
@@ -3564,7 +4160,7 @@
         <w:pStyle w:val="ListBullet"/>
       </w:pPr>
       <w:r>
-        <w:t>Neural-model foreground, cell-type and marker-AUROC analyses remain pending.</w:t>
+        <w:t>Overall, within-cell-type and CD4/CD8/CD19 AUROC metrics are complete for all Tier 0/1 arms; modality-dropout arms remain pending.</w:t>
       </w:r>
     </w:p>
     <w:p>
@@ -3572,7 +4168,7 @@
         <w:pStyle w:val="ListBullet"/>
       </w:pPr>
       <w:r>
-        <w:t>Consolidated metrics are stored in results/fusionvi_experiments_summary.json.</w:t>
+        <w:t>Calibration outputs are stored in results/calibration_summary.csv and calibration_contrasts.csv.</w:t>
       </w:r>
     </w:p>
     <w:p>

</xml_diff>

<commit_message>
Freeze missing-modality follow-up protocol
</commit_message>
<xml_diff>
--- a/deliverables/FusionVI_All_Experiments_Technical_Report.docx
+++ b/deliverables/FusionVI_All_Experiments_Technical_Report.docx
@@ -20,7 +20,7 @@
           <w:color w:val="172554"/>
           <w:sz w:val="31"/>
         </w:rPr>
-        <w:t>Technical report covering four biomarker recovery and perturbation transfer studies</w:t>
+        <w:t>Technical report covering five biomarker recovery and perturbation transfer studies</w:t>
       </w:r>
     </w:p>
     <w:p>
@@ -44,7 +44,7 @@
     </w:p>
     <w:p>
       <w:r>
-        <w:t>FusionVI tests whether modality-specific encoding improves recovery of therapeutic surface biomarkers when protein measurements are hidden, discordant with RNA or observed under an unseen perturbation. Four completed experiments cover held-out human donors, held-out CRISPR targets, cross-mouse transfer and the full missing-protein-panel benchmark from the totalVI paper. The evidence is deliberately mixed: multimodal context is useful in the PD-L1 perturbation task, while targeted marker studies show that measured protein context often matters more than the learned latent. In the complete-panel benchmark, FusionVI has a small advantage only under the original log1p-of-mean readout. A D1-only calibration removes that advantage, while residual and within-cell-type metrics slightly favour totalVI. These results support a bounded biomarker-completion and perturbation-ranking contribution.</w:t>
+        <w:t>FusionVI tests whether modality-specific encoding improves recovery of therapeutic surface biomarkers when protein measurements are hidden, discordant with RNA or observed under an unseen perturbation. Five completed experiments cover held-out human donors, held-out CRISPR targets, cross-mouse transfer and the full missing-protein-panel benchmark from the totalVI paper. The evidence is deliberately mixed: multimodal context is useful in the PD-L1 perturbation task, while targeted marker studies show that measured protein context often matters more than the learned latent. In the complete-panel benchmark, likelihood-consistent totalVI outperforms FusionVI on RMSLE and within-cell-type ranking; the earlier apparent advantage came from an efficiency-omitting helper readout. In the original-paper SLN206 partial-panel benchmark, where 110 proteins remain observed and 97 are hidden in the target mouse, FusionVI improves global and within-cell-type ranking over a same-width totalVI control in all four frozen seeds, although calibrated RMSLE is tied and a linear RNA-plus-panel baseline remains stronger. These results support a bounded biomarker-completion and perturbation-ranking contribution.</w:t>
       </w:r>
     </w:p>
     <w:p>
@@ -511,7 +511,93 @@
                 <w:rFonts w:ascii="Arial" w:hAnsi="Arial"/>
                 <w:sz w:val="17"/>
               </w:rPr>
-              <w:t>Raw RMSLE lead vanished after D1-only calibration; information metrics did not improve</w:t>
+              <w:t>FusionVI did not beat likelihood-consistent totalVI on RMSLE or within-cell-type ranking</w:t>
+            </w:r>
+          </w:p>
+        </w:tc>
+      </w:tr>
+      <w:tr>
+        <w:tc>
+          <w:tcPr>
+            <w:tcW w:type="dxa" w:w="2232"/>
+            <w:vAlign w:val="center"/>
+            <w:tcBorders>
+              <w:top w:val="single" w:sz="5" w:color="D9D9D9"/>
+              <w:left w:val="single" w:sz="5" w:color="D9D9D9"/>
+              <w:bottom w:val="single" w:sz="5" w:color="D9D9D9"/>
+              <w:right w:val="single" w:sz="5" w:color="D9D9D9"/>
+              <w:insideH w:val="single" w:sz="5" w:color="D9D9D9"/>
+              <w:insideV w:val="single" w:sz="5" w:color="D9D9D9"/>
+            </w:tcBorders>
+            <w:shd w:fill="FFFFFF"/>
+          </w:tcPr>
+          <w:p>
+            <w:pPr>
+              <w:spacing w:before="60" w:after="60" w:line="240" w:lineRule="auto"/>
+              <w:jc w:val="left"/>
+            </w:pPr>
+            <w:r>
+              <w:rPr>
+                <w:rFonts w:ascii="Arial" w:hAnsi="Arial"/>
+                <w:sz w:val="17"/>
+              </w:rPr>
+              <w:t>SLN206 partial panel</w:t>
+            </w:r>
+          </w:p>
+        </w:tc>
+        <w:tc>
+          <w:tcPr>
+            <w:tcW w:type="dxa" w:w="1944"/>
+            <w:vAlign w:val="center"/>
+            <w:tcBorders>
+              <w:top w:val="single" w:sz="5" w:color="D9D9D9"/>
+              <w:left w:val="single" w:sz="5" w:color="D9D9D9"/>
+              <w:bottom w:val="single" w:sz="5" w:color="D9D9D9"/>
+              <w:right w:val="single" w:sz="5" w:color="D9D9D9"/>
+              <w:insideH w:val="single" w:sz="5" w:color="D9D9D9"/>
+              <w:insideV w:val="single" w:sz="5" w:color="D9D9D9"/>
+            </w:tcBorders>
+            <w:shd w:fill="FFFFFF"/>
+          </w:tcPr>
+          <w:p>
+            <w:pPr>
+              <w:spacing w:before="60" w:after="60" w:line="240" w:lineRule="auto"/>
+              <w:jc w:val="center"/>
+            </w:pPr>
+            <w:r>
+              <w:rPr>
+                <w:rFonts w:ascii="Arial" w:hAnsi="Arial"/>
+                <w:sz w:val="17"/>
+              </w:rPr>
+              <w:t>4 frozen paired seeds</w:t>
+            </w:r>
+          </w:p>
+        </w:tc>
+        <w:tc>
+          <w:tcPr>
+            <w:tcW w:type="dxa" w:w="5544"/>
+            <w:vAlign w:val="center"/>
+            <w:tcBorders>
+              <w:top w:val="single" w:sz="5" w:color="D9D9D9"/>
+              <w:left w:val="single" w:sz="5" w:color="D9D9D9"/>
+              <w:bottom w:val="single" w:sz="5" w:color="D9D9D9"/>
+              <w:right w:val="single" w:sz="5" w:color="D9D9D9"/>
+              <w:insideH w:val="single" w:sz="5" w:color="D9D9D9"/>
+              <w:insideV w:val="single" w:sz="5" w:color="D9D9D9"/>
+            </w:tcBorders>
+            <w:shd w:fill="FFFFFF"/>
+          </w:tcPr>
+          <w:p>
+            <w:pPr>
+              <w:spacing w:before="60" w:after="60" w:line="240" w:lineRule="auto"/>
+              <w:jc w:val="center"/>
+            </w:pPr>
+            <w:r>
+              <w:rPr>
+                <w:rFonts w:ascii="Arial" w:hAnsi="Arial"/>
+                <w:sz w:val="17"/>
+              </w:rPr>
+              <w:t>FusionVI improved ranking over same-width totalVI; calibrated RMSLE tied and ridge remained stronger</w:t>
             </w:r>
           </w:p>
         </w:tc>
@@ -538,11 +624,6 @@
     <w:p>
       <w:r>
         <w:t>Experiments 1 to 3 also evaluated FusionVI-X, a nested cross-modal readout using the latent state, remaining measured proteins and a prespecified matching transcript. The identical readout applied to totalVI is totalVI-X. Native-decoder and X-readout results are reported separately so the encoder contribution is not confused with the supervised readout.</w:t>
-      </w:r>
-    </w:p>
-    <w:p>
-      <w:r>
-        <w:br w:type="page"/>
       </w:r>
     </w:p>
     <w:p>
@@ -2647,6 +2728,11 @@
         <w:t>Can RNA recover all 110 surface proteins in a batch where no protein measurements enter training? This experiment follows the totalVI paper's Figure 3 design. SLN111-D1 retained RNA and proteins; the entire D2 panel was hidden and preserved only for evaluation. Decoder, likelihoods, latent size, optimizer, split and prediction procedure were controlled. Sixteen paired seeds were run for FusionVI, totalVI and all three Tier 1 controls.</w:t>
       </w:r>
     </w:p>
+    <w:p>
+      <w:r>
+        <w:t>The primary readout is the likelihood-consistent expected count from py_norm_, including each checkpoint's learned protein efficiency. The efficiency-omitting helper output is retained only as a historical audit.</w:t>
+      </w:r>
+    </w:p>
     <w:tbl>
       <w:tblPr>
         <w:tblW w:type="auto" w:w="0"/>
@@ -2666,7 +2752,7 @@
         </w:trPr>
         <w:tc>
           <w:tcPr>
-            <w:tcW w:type="dxa" w:w="2160"/>
+            <w:tcW w:type="dxa" w:w="3384"/>
             <w:vAlign w:val="center"/>
             <w:tcBorders>
               <w:top w:val="single" w:sz="5" w:color="D9D9D9"/>
@@ -2689,42 +2775,13 @@
                 <w:color w:val="FFFFFF"/>
                 <w:sz w:val="17"/>
               </w:rPr>
-              <w:t>Model</w:t>
+              <w:t>Encoder</w:t>
             </w:r>
           </w:p>
         </w:tc>
         <w:tc>
           <w:tcPr>
-            <w:tcW w:type="dxa" w:w="3816"/>
-            <w:vAlign w:val="center"/>
-            <w:tcBorders>
-              <w:top w:val="single" w:sz="5" w:color="D9D9D9"/>
-              <w:left w:val="single" w:sz="5" w:color="D9D9D9"/>
-              <w:bottom w:val="single" w:sz="5" w:color="D9D9D9"/>
-              <w:right w:val="single" w:sz="5" w:color="D9D9D9"/>
-              <w:insideH w:val="single" w:sz="5" w:color="D9D9D9"/>
-              <w:insideV w:val="single" w:sz="5" w:color="D9D9D9"/>
-            </w:tcBorders>
-            <w:shd w:fill="172554"/>
-          </w:tcPr>
-          <w:p>
-            <w:pPr>
-              <w:spacing w:before="60" w:after="60" w:line="240" w:lineRule="auto"/>
-            </w:pPr>
-            <w:r>
-              <w:rPr>
-                <w:rFonts w:ascii="Arial" w:hAnsi="Arial"/>
-                <w:b/>
-                <w:color w:val="FFFFFF"/>
-                <w:sz w:val="17"/>
-              </w:rPr>
-              <w:t>Encoder comparison</w:t>
-            </w:r>
-          </w:p>
-        </w:tc>
-        <w:tc>
-          <w:tcPr>
-            <w:tcW w:type="dxa" w:w="1728"/>
+            <w:tcW w:type="dxa" w:w="1944"/>
             <w:vAlign w:val="center"/>
             <w:tcBorders>
               <w:top w:val="single" w:sz="5" w:color="D9D9D9"/>
@@ -2776,7 +2833,36 @@
                 <w:color w:val="FFFFFF"/>
                 <w:sz w:val="17"/>
               </w:rPr>
-              <w:t>Difference vs FusionVI</w:t>
+              <w:t>Overall Spearman</w:t>
+            </w:r>
+          </w:p>
+        </w:tc>
+        <w:tc>
+          <w:tcPr>
+            <w:tcW w:type="dxa" w:w="2520"/>
+            <w:vAlign w:val="center"/>
+            <w:tcBorders>
+              <w:top w:val="single" w:sz="5" w:color="D9D9D9"/>
+              <w:left w:val="single" w:sz="5" w:color="D9D9D9"/>
+              <w:bottom w:val="single" w:sz="5" w:color="D9D9D9"/>
+              <w:right w:val="single" w:sz="5" w:color="D9D9D9"/>
+              <w:insideH w:val="single" w:sz="5" w:color="D9D9D9"/>
+              <w:insideV w:val="single" w:sz="5" w:color="D9D9D9"/>
+            </w:tcBorders>
+            <w:shd w:fill="172554"/>
+          </w:tcPr>
+          <w:p>
+            <w:pPr>
+              <w:spacing w:before="60" w:after="60" w:line="240" w:lineRule="auto"/>
+            </w:pPr>
+            <w:r>
+              <w:rPr>
+                <w:rFonts w:ascii="Arial" w:hAnsi="Arial"/>
+                <w:b/>
+                <w:color w:val="FFFFFF"/>
+                <w:sz w:val="17"/>
+              </w:rPr>
+              <w:t>Within-cell-type Spearman</w:t>
             </w:r>
           </w:p>
         </w:tc>
@@ -2784,7 +2870,7 @@
       <w:tr>
         <w:tc>
           <w:tcPr>
-            <w:tcW w:type="dxa" w:w="2160"/>
+            <w:tcW w:type="dxa" w:w="3384"/>
             <w:vAlign w:val="center"/>
             <w:tcBorders>
               <w:top w:val="single" w:sz="5" w:color="D9D9D9"/>
@@ -2806,13 +2892,13 @@
                 <w:rFonts w:ascii="Arial" w:hAnsi="Arial"/>
                 <w:sz w:val="17"/>
               </w:rPr>
-              <w:t>FusionVI</w:t>
+              <w:t>Published totalVI</w:t>
             </w:r>
           </w:p>
         </w:tc>
         <w:tc>
           <w:tcPr>
-            <w:tcW w:type="dxa" w:w="3816"/>
+            <w:tcW w:type="dxa" w:w="1944"/>
             <w:vAlign w:val="center"/>
             <w:tcBorders>
               <w:top w:val="single" w:sz="5" w:color="D9D9D9"/>
@@ -2834,35 +2920,7 @@
                 <w:rFonts w:ascii="Arial" w:hAnsi="Arial"/>
                 <w:sz w:val="17"/>
               </w:rPr>
-              <w:t>Separate branches and learned gate</w:t>
-            </w:r>
-          </w:p>
-        </w:tc>
-        <w:tc>
-          <w:tcPr>
-            <w:tcW w:type="dxa" w:w="1728"/>
-            <w:vAlign w:val="center"/>
-            <w:tcBorders>
-              <w:top w:val="single" w:sz="5" w:color="D9D9D9"/>
-              <w:left w:val="single" w:sz="5" w:color="D9D9D9"/>
-              <w:bottom w:val="single" w:sz="5" w:color="D9D9D9"/>
-              <w:right w:val="single" w:sz="5" w:color="D9D9D9"/>
-              <w:insideH w:val="single" w:sz="5" w:color="D9D9D9"/>
-              <w:insideV w:val="single" w:sz="5" w:color="D9D9D9"/>
-            </w:tcBorders>
-            <w:shd w:fill="FFFFFF"/>
-          </w:tcPr>
-          <w:p>
-            <w:pPr>
-              <w:spacing w:before="60" w:after="60" w:line="240" w:lineRule="auto"/>
-              <w:jc w:val="center"/>
-            </w:pPr>
-            <w:r>
-              <w:rPr>
-                <w:rFonts w:ascii="Arial" w:hAnsi="Arial"/>
-                <w:sz w:val="17"/>
-              </w:rPr>
-              <w:t>1.0539</w:t>
+              <w:t>0.5650</w:t>
             </w:r>
           </w:p>
         </w:tc>
@@ -2890,7 +2948,35 @@
                 <w:rFonts w:ascii="Arial" w:hAnsi="Arial"/>
                 <w:sz w:val="17"/>
               </w:rPr>
-              <w:t>reference</w:t>
+              <w:t>0.3262</w:t>
+            </w:r>
+          </w:p>
+        </w:tc>
+        <w:tc>
+          <w:tcPr>
+            <w:tcW w:type="dxa" w:w="2520"/>
+            <w:vAlign w:val="center"/>
+            <w:tcBorders>
+              <w:top w:val="single" w:sz="5" w:color="D9D9D9"/>
+              <w:left w:val="single" w:sz="5" w:color="D9D9D9"/>
+              <w:bottom w:val="single" w:sz="5" w:color="D9D9D9"/>
+              <w:right w:val="single" w:sz="5" w:color="D9D9D9"/>
+              <w:insideH w:val="single" w:sz="5" w:color="D9D9D9"/>
+              <w:insideV w:val="single" w:sz="5" w:color="D9D9D9"/>
+            </w:tcBorders>
+            <w:shd w:fill="FFFFFF"/>
+          </w:tcPr>
+          <w:p>
+            <w:pPr>
+              <w:spacing w:before="60" w:after="60" w:line="240" w:lineRule="auto"/>
+              <w:jc w:val="center"/>
+            </w:pPr>
+            <w:r>
+              <w:rPr>
+                <w:rFonts w:ascii="Arial" w:hAnsi="Arial"/>
+                <w:sz w:val="17"/>
+              </w:rPr>
+              <w:t>0.1681</w:t>
             </w:r>
           </w:p>
         </w:tc>
@@ -2898,7 +2984,7 @@
       <w:tr>
         <w:tc>
           <w:tcPr>
-            <w:tcW w:type="dxa" w:w="2160"/>
+            <w:tcW w:type="dxa" w:w="3384"/>
             <w:vAlign w:val="center"/>
             <w:tcBorders>
               <w:top w:val="single" w:sz="5" w:color="D9D9D9"/>
@@ -2920,13 +3006,13 @@
                 <w:rFonts w:ascii="Arial" w:hAnsi="Arial"/>
                 <w:sz w:val="17"/>
               </w:rPr>
-              <w:t>totalVI</w:t>
+              <w:t>Joint same width</w:t>
             </w:r>
           </w:p>
         </w:tc>
         <w:tc>
           <w:tcPr>
-            <w:tcW w:type="dxa" w:w="3816"/>
+            <w:tcW w:type="dxa" w:w="1944"/>
             <w:vAlign w:val="center"/>
             <w:tcBorders>
               <w:top w:val="single" w:sz="5" w:color="D9D9D9"/>
@@ -2948,35 +3034,7 @@
                 <w:rFonts w:ascii="Arial" w:hAnsi="Arial"/>
                 <w:sz w:val="17"/>
               </w:rPr>
-              <w:t>Published joint encoder, width 256</w:t>
-            </w:r>
-          </w:p>
-        </w:tc>
-        <w:tc>
-          <w:tcPr>
-            <w:tcW w:type="dxa" w:w="1728"/>
-            <w:vAlign w:val="center"/>
-            <w:tcBorders>
-              <w:top w:val="single" w:sz="5" w:color="D9D9D9"/>
-              <w:left w:val="single" w:sz="5" w:color="D9D9D9"/>
-              <w:bottom w:val="single" w:sz="5" w:color="D9D9D9"/>
-              <w:right w:val="single" w:sz="5" w:color="D9D9D9"/>
-              <w:insideH w:val="single" w:sz="5" w:color="D9D9D9"/>
-              <w:insideV w:val="single" w:sz="5" w:color="D9D9D9"/>
-            </w:tcBorders>
-            <w:shd w:fill="EFF6FF"/>
-          </w:tcPr>
-          <w:p>
-            <w:pPr>
-              <w:spacing w:before="60" w:after="60" w:line="240" w:lineRule="auto"/>
-              <w:jc w:val="center"/>
-            </w:pPr>
-            <w:r>
-              <w:rPr>
-                <w:rFonts w:ascii="Arial" w:hAnsi="Arial"/>
-                <w:sz w:val="17"/>
-              </w:rPr>
-              <w:t>1.0601</w:t>
+              <w:t>0.5660</w:t>
             </w:r>
           </w:p>
         </w:tc>
@@ -3004,7 +3062,35 @@
                 <w:rFonts w:ascii="Arial" w:hAnsi="Arial"/>
                 <w:sz w:val="17"/>
               </w:rPr>
-              <w:t>+0.0062</w:t>
+              <w:t>0.3294</w:t>
+            </w:r>
+          </w:p>
+        </w:tc>
+        <w:tc>
+          <w:tcPr>
+            <w:tcW w:type="dxa" w:w="2520"/>
+            <w:vAlign w:val="center"/>
+            <w:tcBorders>
+              <w:top w:val="single" w:sz="5" w:color="D9D9D9"/>
+              <w:left w:val="single" w:sz="5" w:color="D9D9D9"/>
+              <w:bottom w:val="single" w:sz="5" w:color="D9D9D9"/>
+              <w:right w:val="single" w:sz="5" w:color="D9D9D9"/>
+              <w:insideH w:val="single" w:sz="5" w:color="D9D9D9"/>
+              <w:insideV w:val="single" w:sz="5" w:color="D9D9D9"/>
+            </w:tcBorders>
+            <w:shd w:fill="EFF6FF"/>
+          </w:tcPr>
+          <w:p>
+            <w:pPr>
+              <w:spacing w:before="60" w:after="60" w:line="240" w:lineRule="auto"/>
+              <w:jc w:val="center"/>
+            </w:pPr>
+            <w:r>
+              <w:rPr>
+                <w:rFonts w:ascii="Arial" w:hAnsi="Arial"/>
+                <w:sz w:val="17"/>
+              </w:rPr>
+              <w:t>0.1686</w:t>
             </w:r>
           </w:p>
         </w:tc>
@@ -3012,7 +3098,7 @@
       <w:tr>
         <w:tc>
           <w:tcPr>
-            <w:tcW w:type="dxa" w:w="2160"/>
+            <w:tcW w:type="dxa" w:w="3384"/>
             <w:vAlign w:val="center"/>
             <w:tcBorders>
               <w:top w:val="single" w:sz="5" w:color="D9D9D9"/>
@@ -3034,13 +3120,13 @@
                 <w:rFonts w:ascii="Arial" w:hAnsi="Arial"/>
                 <w:sz w:val="17"/>
               </w:rPr>
-              <w:t>Joint same width</w:t>
+              <w:t>Joint plus availability</w:t>
             </w:r>
           </w:p>
         </w:tc>
         <w:tc>
           <w:tcPr>
-            <w:tcW w:type="dxa" w:w="3816"/>
+            <w:tcW w:type="dxa" w:w="1944"/>
             <w:vAlign w:val="center"/>
             <w:tcBorders>
               <w:top w:val="single" w:sz="5" w:color="D9D9D9"/>
@@ -3062,35 +3148,7 @@
                 <w:rFonts w:ascii="Arial" w:hAnsi="Arial"/>
                 <w:sz w:val="17"/>
               </w:rPr>
-              <w:t>Width 128</w:t>
-            </w:r>
-          </w:p>
-        </w:tc>
-        <w:tc>
-          <w:tcPr>
-            <w:tcW w:type="dxa" w:w="1728"/>
-            <w:vAlign w:val="center"/>
-            <w:tcBorders>
-              <w:top w:val="single" w:sz="5" w:color="D9D9D9"/>
-              <w:left w:val="single" w:sz="5" w:color="D9D9D9"/>
-              <w:bottom w:val="single" w:sz="5" w:color="D9D9D9"/>
-              <w:right w:val="single" w:sz="5" w:color="D9D9D9"/>
-              <w:insideH w:val="single" w:sz="5" w:color="D9D9D9"/>
-              <w:insideV w:val="single" w:sz="5" w:color="D9D9D9"/>
-            </w:tcBorders>
-            <w:shd w:fill="FFFFFF"/>
-          </w:tcPr>
-          <w:p>
-            <w:pPr>
-              <w:spacing w:before="60" w:after="60" w:line="240" w:lineRule="auto"/>
-              <w:jc w:val="center"/>
-            </w:pPr>
-            <w:r>
-              <w:rPr>
-                <w:rFonts w:ascii="Arial" w:hAnsi="Arial"/>
-                <w:sz w:val="17"/>
-              </w:rPr>
-              <w:t>1.0645</w:t>
+              <w:t>0.5662</w:t>
             </w:r>
           </w:p>
         </w:tc>
@@ -3118,7 +3176,35 @@
                 <w:rFonts w:ascii="Arial" w:hAnsi="Arial"/>
                 <w:sz w:val="17"/>
               </w:rPr>
-              <w:t>+0.0106</w:t>
+              <w:t>0.3296</w:t>
+            </w:r>
+          </w:p>
+        </w:tc>
+        <w:tc>
+          <w:tcPr>
+            <w:tcW w:type="dxa" w:w="2520"/>
+            <w:vAlign w:val="center"/>
+            <w:tcBorders>
+              <w:top w:val="single" w:sz="5" w:color="D9D9D9"/>
+              <w:left w:val="single" w:sz="5" w:color="D9D9D9"/>
+              <w:bottom w:val="single" w:sz="5" w:color="D9D9D9"/>
+              <w:right w:val="single" w:sz="5" w:color="D9D9D9"/>
+              <w:insideH w:val="single" w:sz="5" w:color="D9D9D9"/>
+              <w:insideV w:val="single" w:sz="5" w:color="D9D9D9"/>
+            </w:tcBorders>
+            <w:shd w:fill="FFFFFF"/>
+          </w:tcPr>
+          <w:p>
+            <w:pPr>
+              <w:spacing w:before="60" w:after="60" w:line="240" w:lineRule="auto"/>
+              <w:jc w:val="center"/>
+            </w:pPr>
+            <w:r>
+              <w:rPr>
+                <w:rFonts w:ascii="Arial" w:hAnsi="Arial"/>
+                <w:sz w:val="17"/>
+              </w:rPr>
+              <w:t>0.1673</w:t>
             </w:r>
           </w:p>
         </w:tc>
@@ -3126,7 +3212,7 @@
       <w:tr>
         <w:tc>
           <w:tcPr>
-            <w:tcW w:type="dxa" w:w="2160"/>
+            <w:tcW w:type="dxa" w:w="3384"/>
             <w:vAlign w:val="center"/>
             <w:tcBorders>
               <w:top w:val="single" w:sz="5" w:color="D9D9D9"/>
@@ -3148,13 +3234,13 @@
                 <w:rFonts w:ascii="Arial" w:hAnsi="Arial"/>
                 <w:sz w:val="17"/>
               </w:rPr>
-              <w:t>Joint parameter matched</w:t>
+              <w:t>FusionVI</w:t>
             </w:r>
           </w:p>
         </w:tc>
         <w:tc>
           <w:tcPr>
-            <w:tcW w:type="dxa" w:w="3816"/>
+            <w:tcW w:type="dxa" w:w="1944"/>
             <w:vAlign w:val="center"/>
             <w:tcBorders>
               <w:top w:val="single" w:sz="5" w:color="D9D9D9"/>
@@ -3176,35 +3262,7 @@
                 <w:rFonts w:ascii="Arial" w:hAnsi="Arial"/>
                 <w:sz w:val="17"/>
               </w:rPr>
-              <w:t>Width 70</w:t>
-            </w:r>
-          </w:p>
-        </w:tc>
-        <w:tc>
-          <w:tcPr>
-            <w:tcW w:type="dxa" w:w="1728"/>
-            <w:vAlign w:val="center"/>
-            <w:tcBorders>
-              <w:top w:val="single" w:sz="5" w:color="D9D9D9"/>
-              <w:left w:val="single" w:sz="5" w:color="D9D9D9"/>
-              <w:bottom w:val="single" w:sz="5" w:color="D9D9D9"/>
-              <w:right w:val="single" w:sz="5" w:color="D9D9D9"/>
-              <w:insideH w:val="single" w:sz="5" w:color="D9D9D9"/>
-              <w:insideV w:val="single" w:sz="5" w:color="D9D9D9"/>
-            </w:tcBorders>
-            <w:shd w:fill="EFF6FF"/>
-          </w:tcPr>
-          <w:p>
-            <w:pPr>
-              <w:spacing w:before="60" w:after="60" w:line="240" w:lineRule="auto"/>
-              <w:jc w:val="center"/>
-            </w:pPr>
-            <w:r>
-              <w:rPr>
-                <w:rFonts w:ascii="Arial" w:hAnsi="Arial"/>
-                <w:sz w:val="17"/>
-              </w:rPr>
-              <w:t>1.0728</w:t>
+              <w:t>0.5678</w:t>
             </w:r>
           </w:p>
         </w:tc>
@@ -3232,7 +3290,35 @@
                 <w:rFonts w:ascii="Arial" w:hAnsi="Arial"/>
                 <w:sz w:val="17"/>
               </w:rPr>
-              <w:t>+0.0189</w:t>
+              <w:t>0.3256</w:t>
+            </w:r>
+          </w:p>
+        </w:tc>
+        <w:tc>
+          <w:tcPr>
+            <w:tcW w:type="dxa" w:w="2520"/>
+            <w:vAlign w:val="center"/>
+            <w:tcBorders>
+              <w:top w:val="single" w:sz="5" w:color="D9D9D9"/>
+              <w:left w:val="single" w:sz="5" w:color="D9D9D9"/>
+              <w:bottom w:val="single" w:sz="5" w:color="D9D9D9"/>
+              <w:right w:val="single" w:sz="5" w:color="D9D9D9"/>
+              <w:insideH w:val="single" w:sz="5" w:color="D9D9D9"/>
+              <w:insideV w:val="single" w:sz="5" w:color="D9D9D9"/>
+            </w:tcBorders>
+            <w:shd w:fill="EFF6FF"/>
+          </w:tcPr>
+          <w:p>
+            <w:pPr>
+              <w:spacing w:before="60" w:after="60" w:line="240" w:lineRule="auto"/>
+              <w:jc w:val="center"/>
+            </w:pPr>
+            <w:r>
+              <w:rPr>
+                <w:rFonts w:ascii="Arial" w:hAnsi="Arial"/>
+                <w:sz w:val="17"/>
+              </w:rPr>
+              <w:t>0.1639</w:t>
             </w:r>
           </w:p>
         </w:tc>
@@ -3240,7 +3326,7 @@
       <w:tr>
         <w:tc>
           <w:tcPr>
-            <w:tcW w:type="dxa" w:w="2160"/>
+            <w:tcW w:type="dxa" w:w="3384"/>
             <w:vAlign w:val="center"/>
             <w:tcBorders>
               <w:top w:val="single" w:sz="5" w:color="D9D9D9"/>
@@ -3262,13 +3348,13 @@
                 <w:rFonts w:ascii="Arial" w:hAnsi="Arial"/>
                 <w:sz w:val="17"/>
               </w:rPr>
-              <w:t>Joint plus availability</w:t>
+              <w:t>Joint parameter matched</w:t>
             </w:r>
           </w:p>
         </w:tc>
         <w:tc>
           <w:tcPr>
-            <w:tcW w:type="dxa" w:w="3816"/>
+            <w:tcW w:type="dxa" w:w="1944"/>
             <w:vAlign w:val="center"/>
             <w:tcBorders>
               <w:top w:val="single" w:sz="5" w:color="D9D9D9"/>
@@ -3290,35 +3376,7 @@
                 <w:rFonts w:ascii="Arial" w:hAnsi="Arial"/>
                 <w:sz w:val="17"/>
               </w:rPr>
-              <w:t>Width 128 and panel indicator</w:t>
-            </w:r>
-          </w:p>
-        </w:tc>
-        <w:tc>
-          <w:tcPr>
-            <w:tcW w:type="dxa" w:w="1728"/>
-            <w:vAlign w:val="center"/>
-            <w:tcBorders>
-              <w:top w:val="single" w:sz="5" w:color="D9D9D9"/>
-              <w:left w:val="single" w:sz="5" w:color="D9D9D9"/>
-              <w:bottom w:val="single" w:sz="5" w:color="D9D9D9"/>
-              <w:right w:val="single" w:sz="5" w:color="D9D9D9"/>
-              <w:insideH w:val="single" w:sz="5" w:color="D9D9D9"/>
-              <w:insideV w:val="single" w:sz="5" w:color="D9D9D9"/>
-            </w:tcBorders>
-            <w:shd w:fill="FFFFFF"/>
-          </w:tcPr>
-          <w:p>
-            <w:pPr>
-              <w:spacing w:before="60" w:after="60" w:line="240" w:lineRule="auto"/>
-              <w:jc w:val="center"/>
-            </w:pPr>
-            <w:r>
-              <w:rPr>
-                <w:rFonts w:ascii="Arial" w:hAnsi="Arial"/>
-                <w:sz w:val="17"/>
-              </w:rPr>
-              <w:t>1.0651</w:t>
+              <w:t>0.5698</w:t>
             </w:r>
           </w:p>
         </w:tc>
@@ -3346,205 +3404,13 @@
                 <w:rFonts w:ascii="Arial" w:hAnsi="Arial"/>
                 <w:sz w:val="17"/>
               </w:rPr>
-              <w:t>+0.0112</w:t>
-            </w:r>
-          </w:p>
-        </w:tc>
-      </w:tr>
-    </w:tbl>
-    <w:p>
-      <w:pPr>
-        <w:spacing w:after="20"/>
-      </w:pPr>
-    </w:p>
-    <w:p>
-      <w:pPr>
-        <w:spacing w:after="140"/>
-      </w:pPr>
-      <w:r>
-        <w:rPr>
-          <w:b/>
-          <w:color w:val="C2410C"/>
-        </w:rPr>
-        <w:t>Result  The original RMSLE lead is principally an output-scale effect.</w:t>
-      </w:r>
-    </w:p>
-    <w:p>
-      <w:r>
-        <w:t>Against the same-width joint encoder, FusionVI reduced RMSLE by 0.0106 (95% CI -0.0135 to -0.0077; Holm p=3.4e-06) and won 15/16 seeds. Against the parameter-matched encoder, the reduction was 0.0189 (95% CI -0.0216 to -0.0162; Holm p=7.9e-10) with 16/16 wins. Against the missingness-aware joint encoder, the reduction was 0.0112 (95% CI -0.0143 to -0.0081; Holm p=3.4e-06) with 15/16 wins. The availability indicator alone did not help (difference +0.0006; p=0.51).</w:t>
-      </w:r>
-    </w:p>
-    <w:p>
-      <w:r>
-        <w:t>Every checkpoint was then re-scored without retraining. Posterior E[log1p y] reduced both models' error, and a per-protein affine calibration fitted only on D1 RNA-only predictions reduced mean RMSLE to 0.5745 for totalVI and 0.5831 for FusionVI. The calibrated difference was +0.0085 (95% CI -0.0003 to +0.0173; Holm p=0.218).</w:t>
-      </w:r>
-    </w:p>
-    <w:tbl>
-      <w:tblPr>
-        <w:tblW w:type="auto" w:w="0"/>
-        <w:jc w:val="center"/>
-        <w:tblLayout w:type="fixed"/>
-        <w:tblLook w:firstColumn="1" w:firstRow="1" w:lastColumn="0" w:lastRow="0" w:noHBand="0" w:noVBand="1" w:val="04A0"/>
-      </w:tblPr>
-      <w:tblGrid>
-        <w:gridCol w:w="2541"/>
-        <w:gridCol w:w="2541"/>
-        <w:gridCol w:w="2541"/>
-        <w:gridCol w:w="2541"/>
-      </w:tblGrid>
-      <w:tr>
-        <w:trPr>
-          <w:tblHeader w:val="true"/>
-        </w:trPr>
-        <w:tc>
-          <w:tcPr>
-            <w:tcW w:type="dxa" w:w="3960"/>
-            <w:vAlign w:val="center"/>
-            <w:tcBorders>
-              <w:top w:val="single" w:sz="5" w:color="D9D9D9"/>
-              <w:left w:val="single" w:sz="5" w:color="D9D9D9"/>
-              <w:bottom w:val="single" w:sz="5" w:color="D9D9D9"/>
-              <w:right w:val="single" w:sz="5" w:color="D9D9D9"/>
-              <w:insideH w:val="single" w:sz="5" w:color="D9D9D9"/>
-              <w:insideV w:val="single" w:sz="5" w:color="D9D9D9"/>
-            </w:tcBorders>
-            <w:shd w:fill="172554"/>
-          </w:tcPr>
-          <w:p>
-            <w:pPr>
-              <w:spacing w:before="60" w:after="60" w:line="240" w:lineRule="auto"/>
-            </w:pPr>
-            <w:r>
-              <w:rPr>
-                <w:rFonts w:ascii="Arial" w:hAnsi="Arial"/>
-                <w:b/>
-                <w:color w:val="FFFFFF"/>
-                <w:sz w:val="17"/>
-              </w:rPr>
-              <w:t>Readout</w:t>
+              <w:t>0.3287</w:t>
             </w:r>
           </w:p>
         </w:tc>
         <w:tc>
           <w:tcPr>
-            <w:tcW w:type="dxa" w:w="1872"/>
-            <w:vAlign w:val="center"/>
-            <w:tcBorders>
-              <w:top w:val="single" w:sz="5" w:color="D9D9D9"/>
-              <w:left w:val="single" w:sz="5" w:color="D9D9D9"/>
-              <w:bottom w:val="single" w:sz="5" w:color="D9D9D9"/>
-              <w:right w:val="single" w:sz="5" w:color="D9D9D9"/>
-              <w:insideH w:val="single" w:sz="5" w:color="D9D9D9"/>
-              <w:insideV w:val="single" w:sz="5" w:color="D9D9D9"/>
-            </w:tcBorders>
-            <w:shd w:fill="172554"/>
-          </w:tcPr>
-          <w:p>
-            <w:pPr>
-              <w:spacing w:before="60" w:after="60" w:line="240" w:lineRule="auto"/>
-            </w:pPr>
-            <w:r>
-              <w:rPr>
-                <w:rFonts w:ascii="Arial" w:hAnsi="Arial"/>
-                <w:b/>
-                <w:color w:val="FFFFFF"/>
-                <w:sz w:val="17"/>
-              </w:rPr>
-              <w:t>totalVI</w:t>
-            </w:r>
-          </w:p>
-        </w:tc>
-        <w:tc>
-          <w:tcPr>
-            <w:tcW w:type="dxa" w:w="1872"/>
-            <w:vAlign w:val="center"/>
-            <w:tcBorders>
-              <w:top w:val="single" w:sz="5" w:color="D9D9D9"/>
-              <w:left w:val="single" w:sz="5" w:color="D9D9D9"/>
-              <w:bottom w:val="single" w:sz="5" w:color="D9D9D9"/>
-              <w:right w:val="single" w:sz="5" w:color="D9D9D9"/>
-              <w:insideH w:val="single" w:sz="5" w:color="D9D9D9"/>
-              <w:insideV w:val="single" w:sz="5" w:color="D9D9D9"/>
-            </w:tcBorders>
-            <w:shd w:fill="172554"/>
-          </w:tcPr>
-          <w:p>
-            <w:pPr>
-              <w:spacing w:before="60" w:after="60" w:line="240" w:lineRule="auto"/>
-            </w:pPr>
-            <w:r>
-              <w:rPr>
-                <w:rFonts w:ascii="Arial" w:hAnsi="Arial"/>
-                <w:b/>
-                <w:color w:val="FFFFFF"/>
-                <w:sz w:val="17"/>
-              </w:rPr>
-              <w:t>FusionVI</w:t>
-            </w:r>
-          </w:p>
-        </w:tc>
-        <w:tc>
-          <w:tcPr>
-            <w:tcW w:type="dxa" w:w="2448"/>
-            <w:vAlign w:val="center"/>
-            <w:tcBorders>
-              <w:top w:val="single" w:sz="5" w:color="D9D9D9"/>
-              <w:left w:val="single" w:sz="5" w:color="D9D9D9"/>
-              <w:bottom w:val="single" w:sz="5" w:color="D9D9D9"/>
-              <w:right w:val="single" w:sz="5" w:color="D9D9D9"/>
-              <w:insideH w:val="single" w:sz="5" w:color="D9D9D9"/>
-              <w:insideV w:val="single" w:sz="5" w:color="D9D9D9"/>
-            </w:tcBorders>
-            <w:shd w:fill="172554"/>
-          </w:tcPr>
-          <w:p>
-            <w:pPr>
-              <w:spacing w:before="60" w:after="60" w:line="240" w:lineRule="auto"/>
-            </w:pPr>
-            <w:r>
-              <w:rPr>
-                <w:rFonts w:ascii="Arial" w:hAnsi="Arial"/>
-                <w:b/>
-                <w:color w:val="FFFFFF"/>
-                <w:sz w:val="17"/>
-              </w:rPr>
-              <w:t>FusionVI − totalVI</w:t>
-            </w:r>
-          </w:p>
-        </w:tc>
-      </w:tr>
-      <w:tr>
-        <w:tc>
-          <w:tcPr>
-            <w:tcW w:type="dxa" w:w="3960"/>
-            <w:vAlign w:val="center"/>
-            <w:tcBorders>
-              <w:top w:val="single" w:sz="5" w:color="D9D9D9"/>
-              <w:left w:val="single" w:sz="5" w:color="D9D9D9"/>
-              <w:bottom w:val="single" w:sz="5" w:color="D9D9D9"/>
-              <w:right w:val="single" w:sz="5" w:color="D9D9D9"/>
-              <w:insideH w:val="single" w:sz="5" w:color="D9D9D9"/>
-              <w:insideV w:val="single" w:sz="5" w:color="D9D9D9"/>
-            </w:tcBorders>
-            <w:shd w:fill="FFFFFF"/>
-          </w:tcPr>
-          <w:p>
-            <w:pPr>
-              <w:spacing w:before="60" w:after="60" w:line="240" w:lineRule="auto"/>
-              <w:jc w:val="left"/>
-            </w:pPr>
-            <w:r>
-              <w:rPr>
-                <w:rFonts w:ascii="Arial" w:hAnsi="Arial"/>
-                <w:sz w:val="17"/>
-              </w:rPr>
-              <w:t>Original log1p(E[y])</w:t>
-            </w:r>
-          </w:p>
-        </w:tc>
-        <w:tc>
-          <w:tcPr>
-            <w:tcW w:type="dxa" w:w="1872"/>
+            <w:tcW w:type="dxa" w:w="2520"/>
             <w:vAlign w:val="center"/>
             <w:tcBorders>
               <w:top w:val="single" w:sz="5" w:color="D9D9D9"/>
@@ -3566,405 +3432,7 @@
                 <w:rFonts w:ascii="Arial" w:hAnsi="Arial"/>
                 <w:sz w:val="17"/>
               </w:rPr>
-              <w:t>1.0600</w:t>
-            </w:r>
-          </w:p>
-        </w:tc>
-        <w:tc>
-          <w:tcPr>
-            <w:tcW w:type="dxa" w:w="1872"/>
-            <w:vAlign w:val="center"/>
-            <w:tcBorders>
-              <w:top w:val="single" w:sz="5" w:color="D9D9D9"/>
-              <w:left w:val="single" w:sz="5" w:color="D9D9D9"/>
-              <w:bottom w:val="single" w:sz="5" w:color="D9D9D9"/>
-              <w:right w:val="single" w:sz="5" w:color="D9D9D9"/>
-              <w:insideH w:val="single" w:sz="5" w:color="D9D9D9"/>
-              <w:insideV w:val="single" w:sz="5" w:color="D9D9D9"/>
-            </w:tcBorders>
-            <w:shd w:fill="FFFFFF"/>
-          </w:tcPr>
-          <w:p>
-            <w:pPr>
-              <w:spacing w:before="60" w:after="60" w:line="240" w:lineRule="auto"/>
-              <w:jc w:val="center"/>
-            </w:pPr>
-            <w:r>
-              <w:rPr>
-                <w:rFonts w:ascii="Arial" w:hAnsi="Arial"/>
-                <w:sz w:val="17"/>
-              </w:rPr>
-              <w:t>1.0538</w:t>
-            </w:r>
-          </w:p>
-        </w:tc>
-        <w:tc>
-          <w:tcPr>
-            <w:tcW w:type="dxa" w:w="2448"/>
-            <w:vAlign w:val="center"/>
-            <w:tcBorders>
-              <w:top w:val="single" w:sz="5" w:color="D9D9D9"/>
-              <w:left w:val="single" w:sz="5" w:color="D9D9D9"/>
-              <w:bottom w:val="single" w:sz="5" w:color="D9D9D9"/>
-              <w:right w:val="single" w:sz="5" w:color="D9D9D9"/>
-              <w:insideH w:val="single" w:sz="5" w:color="D9D9D9"/>
-              <w:insideV w:val="single" w:sz="5" w:color="D9D9D9"/>
-            </w:tcBorders>
-            <w:shd w:fill="FFFFFF"/>
-          </w:tcPr>
-          <w:p>
-            <w:pPr>
-              <w:spacing w:before="60" w:after="60" w:line="240" w:lineRule="auto"/>
-              <w:jc w:val="center"/>
-            </w:pPr>
-            <w:r>
-              <w:rPr>
-                <w:rFonts w:ascii="Arial" w:hAnsi="Arial"/>
-                <w:sz w:val="17"/>
-              </w:rPr>
-              <w:t>-0.0062</w:t>
-            </w:r>
-          </w:p>
-        </w:tc>
-      </w:tr>
-      <w:tr>
-        <w:tc>
-          <w:tcPr>
-            <w:tcW w:type="dxa" w:w="3960"/>
-            <w:vAlign w:val="center"/>
-            <w:tcBorders>
-              <w:top w:val="single" w:sz="5" w:color="D9D9D9"/>
-              <w:left w:val="single" w:sz="5" w:color="D9D9D9"/>
-              <w:bottom w:val="single" w:sz="5" w:color="D9D9D9"/>
-              <w:right w:val="single" w:sz="5" w:color="D9D9D9"/>
-              <w:insideH w:val="single" w:sz="5" w:color="D9D9D9"/>
-              <w:insideV w:val="single" w:sz="5" w:color="D9D9D9"/>
-            </w:tcBorders>
-            <w:shd w:fill="EFF6FF"/>
-          </w:tcPr>
-          <w:p>
-            <w:pPr>
-              <w:spacing w:before="60" w:after="60" w:line="240" w:lineRule="auto"/>
-              <w:jc w:val="left"/>
-            </w:pPr>
-            <w:r>
-              <w:rPr>
-                <w:rFonts w:ascii="Arial" w:hAnsi="Arial"/>
-                <w:sz w:val="17"/>
-              </w:rPr>
-              <w:t>Posterior E[log1p y]</w:t>
-            </w:r>
-          </w:p>
-        </w:tc>
-        <w:tc>
-          <w:tcPr>
-            <w:tcW w:type="dxa" w:w="1872"/>
-            <w:vAlign w:val="center"/>
-            <w:tcBorders>
-              <w:top w:val="single" w:sz="5" w:color="D9D9D9"/>
-              <w:left w:val="single" w:sz="5" w:color="D9D9D9"/>
-              <w:bottom w:val="single" w:sz="5" w:color="D9D9D9"/>
-              <w:right w:val="single" w:sz="5" w:color="D9D9D9"/>
-              <w:insideH w:val="single" w:sz="5" w:color="D9D9D9"/>
-              <w:insideV w:val="single" w:sz="5" w:color="D9D9D9"/>
-            </w:tcBorders>
-            <w:shd w:fill="EFF6FF"/>
-          </w:tcPr>
-          <w:p>
-            <w:pPr>
-              <w:spacing w:before="60" w:after="60" w:line="240" w:lineRule="auto"/>
-              <w:jc w:val="center"/>
-            </w:pPr>
-            <w:r>
-              <w:rPr>
-                <w:rFonts w:ascii="Arial" w:hAnsi="Arial"/>
-                <w:sz w:val="17"/>
-              </w:rPr>
-              <w:t>0.9616</w:t>
-            </w:r>
-          </w:p>
-        </w:tc>
-        <w:tc>
-          <w:tcPr>
-            <w:tcW w:type="dxa" w:w="1872"/>
-            <w:vAlign w:val="center"/>
-            <w:tcBorders>
-              <w:top w:val="single" w:sz="5" w:color="D9D9D9"/>
-              <w:left w:val="single" w:sz="5" w:color="D9D9D9"/>
-              <w:bottom w:val="single" w:sz="5" w:color="D9D9D9"/>
-              <w:right w:val="single" w:sz="5" w:color="D9D9D9"/>
-              <w:insideH w:val="single" w:sz="5" w:color="D9D9D9"/>
-              <w:insideV w:val="single" w:sz="5" w:color="D9D9D9"/>
-            </w:tcBorders>
-            <w:shd w:fill="EFF6FF"/>
-          </w:tcPr>
-          <w:p>
-            <w:pPr>
-              <w:spacing w:before="60" w:after="60" w:line="240" w:lineRule="auto"/>
-              <w:jc w:val="center"/>
-            </w:pPr>
-            <w:r>
-              <w:rPr>
-                <w:rFonts w:ascii="Arial" w:hAnsi="Arial"/>
-                <w:sz w:val="17"/>
-              </w:rPr>
-              <w:t>0.9569</w:t>
-            </w:r>
-          </w:p>
-        </w:tc>
-        <w:tc>
-          <w:tcPr>
-            <w:tcW w:type="dxa" w:w="2448"/>
-            <w:vAlign w:val="center"/>
-            <w:tcBorders>
-              <w:top w:val="single" w:sz="5" w:color="D9D9D9"/>
-              <w:left w:val="single" w:sz="5" w:color="D9D9D9"/>
-              <w:bottom w:val="single" w:sz="5" w:color="D9D9D9"/>
-              <w:right w:val="single" w:sz="5" w:color="D9D9D9"/>
-              <w:insideH w:val="single" w:sz="5" w:color="D9D9D9"/>
-              <w:insideV w:val="single" w:sz="5" w:color="D9D9D9"/>
-            </w:tcBorders>
-            <w:shd w:fill="EFF6FF"/>
-          </w:tcPr>
-          <w:p>
-            <w:pPr>
-              <w:spacing w:before="60" w:after="60" w:line="240" w:lineRule="auto"/>
-              <w:jc w:val="center"/>
-            </w:pPr>
-            <w:r>
-              <w:rPr>
-                <w:rFonts w:ascii="Arial" w:hAnsi="Arial"/>
-                <w:sz w:val="17"/>
-              </w:rPr>
-              <w:t>-0.0047</w:t>
-            </w:r>
-          </w:p>
-        </w:tc>
-      </w:tr>
-      <w:tr>
-        <w:tc>
-          <w:tcPr>
-            <w:tcW w:type="dxa" w:w="3960"/>
-            <w:vAlign w:val="center"/>
-            <w:tcBorders>
-              <w:top w:val="single" w:sz="5" w:color="D9D9D9"/>
-              <w:left w:val="single" w:sz="5" w:color="D9D9D9"/>
-              <w:bottom w:val="single" w:sz="5" w:color="D9D9D9"/>
-              <w:right w:val="single" w:sz="5" w:color="D9D9D9"/>
-              <w:insideH w:val="single" w:sz="5" w:color="D9D9D9"/>
-              <w:insideV w:val="single" w:sz="5" w:color="D9D9D9"/>
-            </w:tcBorders>
-            <w:shd w:fill="FFFFFF"/>
-          </w:tcPr>
-          <w:p>
-            <w:pPr>
-              <w:spacing w:before="60" w:after="60" w:line="240" w:lineRule="auto"/>
-              <w:jc w:val="left"/>
-            </w:pPr>
-            <w:r>
-              <w:rPr>
-                <w:rFonts w:ascii="Arial" w:hAnsi="Arial"/>
-                <w:sz w:val="17"/>
-              </w:rPr>
-              <w:t>D1-only calibrated</w:t>
-            </w:r>
-          </w:p>
-        </w:tc>
-        <w:tc>
-          <w:tcPr>
-            <w:tcW w:type="dxa" w:w="1872"/>
-            <w:vAlign w:val="center"/>
-            <w:tcBorders>
-              <w:top w:val="single" w:sz="5" w:color="D9D9D9"/>
-              <w:left w:val="single" w:sz="5" w:color="D9D9D9"/>
-              <w:bottom w:val="single" w:sz="5" w:color="D9D9D9"/>
-              <w:right w:val="single" w:sz="5" w:color="D9D9D9"/>
-              <w:insideH w:val="single" w:sz="5" w:color="D9D9D9"/>
-              <w:insideV w:val="single" w:sz="5" w:color="D9D9D9"/>
-            </w:tcBorders>
-            <w:shd w:fill="FFFFFF"/>
-          </w:tcPr>
-          <w:p>
-            <w:pPr>
-              <w:spacing w:before="60" w:after="60" w:line="240" w:lineRule="auto"/>
-              <w:jc w:val="center"/>
-            </w:pPr>
-            <w:r>
-              <w:rPr>
-                <w:rFonts w:ascii="Arial" w:hAnsi="Arial"/>
-                <w:sz w:val="17"/>
-              </w:rPr>
-              <w:t>0.5745</w:t>
-            </w:r>
-          </w:p>
-        </w:tc>
-        <w:tc>
-          <w:tcPr>
-            <w:tcW w:type="dxa" w:w="1872"/>
-            <w:vAlign w:val="center"/>
-            <w:tcBorders>
-              <w:top w:val="single" w:sz="5" w:color="D9D9D9"/>
-              <w:left w:val="single" w:sz="5" w:color="D9D9D9"/>
-              <w:bottom w:val="single" w:sz="5" w:color="D9D9D9"/>
-              <w:right w:val="single" w:sz="5" w:color="D9D9D9"/>
-              <w:insideH w:val="single" w:sz="5" w:color="D9D9D9"/>
-              <w:insideV w:val="single" w:sz="5" w:color="D9D9D9"/>
-            </w:tcBorders>
-            <w:shd w:fill="FFFFFF"/>
-          </w:tcPr>
-          <w:p>
-            <w:pPr>
-              <w:spacing w:before="60" w:after="60" w:line="240" w:lineRule="auto"/>
-              <w:jc w:val="center"/>
-            </w:pPr>
-            <w:r>
-              <w:rPr>
-                <w:rFonts w:ascii="Arial" w:hAnsi="Arial"/>
-                <w:sz w:val="17"/>
-              </w:rPr>
-              <w:t>0.5831</w:t>
-            </w:r>
-          </w:p>
-        </w:tc>
-        <w:tc>
-          <w:tcPr>
-            <w:tcW w:type="dxa" w:w="2448"/>
-            <w:vAlign w:val="center"/>
-            <w:tcBorders>
-              <w:top w:val="single" w:sz="5" w:color="D9D9D9"/>
-              <w:left w:val="single" w:sz="5" w:color="D9D9D9"/>
-              <w:bottom w:val="single" w:sz="5" w:color="D9D9D9"/>
-              <w:right w:val="single" w:sz="5" w:color="D9D9D9"/>
-              <w:insideH w:val="single" w:sz="5" w:color="D9D9D9"/>
-              <w:insideV w:val="single" w:sz="5" w:color="D9D9D9"/>
-            </w:tcBorders>
-            <w:shd w:fill="FFFFFF"/>
-          </w:tcPr>
-          <w:p>
-            <w:pPr>
-              <w:spacing w:before="60" w:after="60" w:line="240" w:lineRule="auto"/>
-              <w:jc w:val="center"/>
-            </w:pPr>
-            <w:r>
-              <w:rPr>
-                <w:rFonts w:ascii="Arial" w:hAnsi="Arial"/>
-                <w:sz w:val="17"/>
-              </w:rPr>
-              <w:t>+0.0085</w:t>
-            </w:r>
-          </w:p>
-        </w:tc>
-      </w:tr>
-      <w:tr>
-        <w:tc>
-          <w:tcPr>
-            <w:tcW w:type="dxa" w:w="3960"/>
-            <w:vAlign w:val="center"/>
-            <w:tcBorders>
-              <w:top w:val="single" w:sz="5" w:color="D9D9D9"/>
-              <w:left w:val="single" w:sz="5" w:color="D9D9D9"/>
-              <w:bottom w:val="single" w:sz="5" w:color="D9D9D9"/>
-              <w:right w:val="single" w:sz="5" w:color="D9D9D9"/>
-              <w:insideH w:val="single" w:sz="5" w:color="D9D9D9"/>
-              <w:insideV w:val="single" w:sz="5" w:color="D9D9D9"/>
-            </w:tcBorders>
-            <w:shd w:fill="EFF6FF"/>
-          </w:tcPr>
-          <w:p>
-            <w:pPr>
-              <w:spacing w:before="60" w:after="60" w:line="240" w:lineRule="auto"/>
-              <w:jc w:val="left"/>
-            </w:pPr>
-            <w:r>
-              <w:rPr>
-                <w:rFonts w:ascii="Arial" w:hAnsi="Arial"/>
-                <w:sz w:val="17"/>
-              </w:rPr>
-              <w:t>RNA SVD-ridge</w:t>
-            </w:r>
-          </w:p>
-        </w:tc>
-        <w:tc>
-          <w:tcPr>
-            <w:tcW w:type="dxa" w:w="1872"/>
-            <w:vAlign w:val="center"/>
-            <w:tcBorders>
-              <w:top w:val="single" w:sz="5" w:color="D9D9D9"/>
-              <w:left w:val="single" w:sz="5" w:color="D9D9D9"/>
-              <w:bottom w:val="single" w:sz="5" w:color="D9D9D9"/>
-              <w:right w:val="single" w:sz="5" w:color="D9D9D9"/>
-              <w:insideH w:val="single" w:sz="5" w:color="D9D9D9"/>
-              <w:insideV w:val="single" w:sz="5" w:color="D9D9D9"/>
-            </w:tcBorders>
-            <w:shd w:fill="EFF6FF"/>
-          </w:tcPr>
-          <w:p>
-            <w:pPr>
-              <w:spacing w:before="60" w:after="60" w:line="240" w:lineRule="auto"/>
-              <w:jc w:val="center"/>
-            </w:pPr>
-            <w:r>
-              <w:rPr>
-                <w:rFonts w:ascii="Arial" w:hAnsi="Arial"/>
-                <w:sz w:val="17"/>
-              </w:rPr>
-              <w:t>0.6373</w:t>
-            </w:r>
-          </w:p>
-        </w:tc>
-        <w:tc>
-          <w:tcPr>
-            <w:tcW w:type="dxa" w:w="1872"/>
-            <w:vAlign w:val="center"/>
-            <w:tcBorders>
-              <w:top w:val="single" w:sz="5" w:color="D9D9D9"/>
-              <w:left w:val="single" w:sz="5" w:color="D9D9D9"/>
-              <w:bottom w:val="single" w:sz="5" w:color="D9D9D9"/>
-              <w:right w:val="single" w:sz="5" w:color="D9D9D9"/>
-              <w:insideH w:val="single" w:sz="5" w:color="D9D9D9"/>
-              <w:insideV w:val="single" w:sz="5" w:color="D9D9D9"/>
-            </w:tcBorders>
-            <w:shd w:fill="EFF6FF"/>
-          </w:tcPr>
-          <w:p>
-            <w:pPr>
-              <w:spacing w:before="60" w:after="60" w:line="240" w:lineRule="auto"/>
-              <w:jc w:val="center"/>
-            </w:pPr>
-            <w:r>
-              <w:rPr>
-                <w:rFonts w:ascii="Arial" w:hAnsi="Arial"/>
-                <w:sz w:val="17"/>
-              </w:rPr>
-              <w:t>—</w:t>
-            </w:r>
-          </w:p>
-        </w:tc>
-        <w:tc>
-          <w:tcPr>
-            <w:tcW w:type="dxa" w:w="2448"/>
-            <w:vAlign w:val="center"/>
-            <w:tcBorders>
-              <w:top w:val="single" w:sz="5" w:color="D9D9D9"/>
-              <w:left w:val="single" w:sz="5" w:color="D9D9D9"/>
-              <w:bottom w:val="single" w:sz="5" w:color="D9D9D9"/>
-              <w:right w:val="single" w:sz="5" w:color="D9D9D9"/>
-              <w:insideH w:val="single" w:sz="5" w:color="D9D9D9"/>
-              <w:insideV w:val="single" w:sz="5" w:color="D9D9D9"/>
-            </w:tcBorders>
-            <w:shd w:fill="EFF6FF"/>
-          </w:tcPr>
-          <w:p>
-            <w:pPr>
-              <w:spacing w:before="60" w:after="60" w:line="240" w:lineRule="auto"/>
-              <w:jc w:val="center"/>
-            </w:pPr>
-            <w:r>
-              <w:rPr>
-                <w:rFonts w:ascii="Arial" w:hAnsi="Arial"/>
-                <w:sz w:val="17"/>
-              </w:rPr>
-              <w:t>—</w:t>
+              <w:t>0.1593</w:t>
             </w:r>
           </w:p>
         </w:tc>
@@ -3976,8 +3444,25 @@
       </w:pPr>
     </w:p>
     <w:p>
+      <w:pPr>
+        <w:spacing w:after="140"/>
+      </w:pPr>
       <w:r>
-        <w:t>FusionVI's calibrated residual error was higher by +0.0065. Mean within-cell-type Spearman was 0.1640 for FusionVI versus 0.1681 for totalVI; marker AUROC was approximately 0.99 for both. The widened RNA ridge reached 0.6373 RMSLE, so calibrated neural predictions actually outperformed it on aggregate error. The earlier ridge gap was therefore also largely a scale effect.</w:t>
+        <w:rPr>
+          <w:b/>
+          <w:color w:val="C2410C"/>
+        </w:rPr>
+        <w:t>Result  FusionVI did not improve the likelihood-consistent paper benchmark.</w:t>
+      </w:r>
+    </w:p>
+    <w:p>
+      <w:r>
+        <w:t>FusionVI was worse than published totalVI by +0.0027 RMSLE (95% CI +0.0020 to +0.0035; 1/16 seed wins; Holm p=2.6e-06). It was worse than the same-width control by +0.0018 and the availability-aware control by +0.0015. It beat only the smaller parameter-matched control by 0.0021. The availability indicator itself did not help: its difference versus the same-width control was +0.0002 (Holm p=0.531).</w:t>
+      </w:r>
+    </w:p>
+    <w:p>
+      <w:r>
+        <w:t>FusionVI's within-cell-type Spearman was 0.1639, compared with 0.1681 for published totalVI (difference -0.0042; Holm p=0.00018). The D1 affine head worsened RMSLE after efficiency restoration: totalVI changed from 0.5650 to 0.5743, and FusionVI changed from 0.5678 to 0.5829.</w:t>
       </w:r>
     </w:p>
     <w:p>
@@ -3997,7 +3482,7 @@
               <a:graphicData uri="http://schemas.openxmlformats.org/drawingml/2006/picture">
                 <pic:pic>
                   <pic:nvPicPr>
-                    <pic:cNvPr id="0" name="calibration_benchmark.png"/>
+                    <pic:cNvPr id="0" name="calibration_benchmark_likelihood_correct.png"/>
                     <pic:cNvPicPr/>
                   </pic:nvPicPr>
                   <pic:blipFill>
@@ -4030,7 +3515,704 @@
           <w:i/>
           <w:sz w:val="17"/>
         </w:rPr>
-        <w:t>Figure 4. Scale-matched complete-panel evaluation across 16 paired seeds.</w:t>
+        <w:t>Figure 4. Likelihood-consistent complete-panel evaluation across 16 paired seeds.</w:t>
+      </w:r>
+    </w:p>
+    <w:p>
+      <w:r>
+        <w:br w:type="page"/>
+      </w:r>
+    </w:p>
+    <w:p>
+      <w:pPr>
+        <w:pStyle w:val="Heading1"/>
+      </w:pPr>
+      <w:r>
+        <w:t>Experiment 5 original totalVI partial panel transfer</w:t>
+      </w:r>
+    </w:p>
+    <w:p>
+      <w:pPr>
+        <w:pStyle w:val="Heading2"/>
+      </w:pPr>
+      <w:r>
+        <w:t>Biological question and design</w:t>
+      </w:r>
+    </w:p>
+    <w:p>
+      <w:r>
+        <w:t>Can a model use an observed surface-protein panel to recover additional therapeutic biomarkers in an unseen animal? The official SLN206 object from the totalVI study contains 207 proteins. In the target batch D2, the 110 proteins shared with the source panel remain available, while the other 97 proteins are hidden and scored against their measured values. This partial-panel design activates FusionVI's protein branch and tests cross-mouse biomarker completion rather than complete reconstruction from RNA alone. The model choice and analysis plan were frozen on source-only development splits before D2 was evaluated. FusionVI and a same-width totalVI control were then trained for seeds 2026 to 2029 under the same 500-epoch budget. Calibration was fitted only on source cells routed through the corresponding missing-target pattern. Experiment 5 is unaffected by the Experiment 4 readout correction: positive per-protein efficiency scaling cannot change its Spearman metrics, and its D1 affine calibration absorbs the constant scale.</w:t>
+      </w:r>
+    </w:p>
+    <w:tbl>
+      <w:tblPr>
+        <w:tblW w:type="auto" w:w="0"/>
+        <w:jc w:val="center"/>
+        <w:tblLayout w:type="fixed"/>
+        <w:tblLook w:firstColumn="1" w:firstRow="1" w:lastColumn="0" w:lastRow="0" w:noHBand="0" w:noVBand="1" w:val="04A0"/>
+      </w:tblPr>
+      <w:tblGrid>
+        <w:gridCol w:w="2541"/>
+        <w:gridCol w:w="2541"/>
+        <w:gridCol w:w="2541"/>
+        <w:gridCol w:w="2541"/>
+      </w:tblGrid>
+      <w:tr>
+        <w:trPr>
+          <w:tblHeader w:val="true"/>
+        </w:trPr>
+        <w:tc>
+          <w:tcPr>
+            <w:tcW w:type="dxa" w:w="3528"/>
+            <w:vAlign w:val="center"/>
+            <w:tcBorders>
+              <w:top w:val="single" w:sz="5" w:color="D9D9D9"/>
+              <w:left w:val="single" w:sz="5" w:color="D9D9D9"/>
+              <w:bottom w:val="single" w:sz="5" w:color="D9D9D9"/>
+              <w:right w:val="single" w:sz="5" w:color="D9D9D9"/>
+              <w:insideH w:val="single" w:sz="5" w:color="D9D9D9"/>
+              <w:insideV w:val="single" w:sz="5" w:color="D9D9D9"/>
+            </w:tcBorders>
+            <w:shd w:fill="172554"/>
+          </w:tcPr>
+          <w:p>
+            <w:pPr>
+              <w:spacing w:before="60" w:after="60" w:line="240" w:lineRule="auto"/>
+            </w:pPr>
+            <w:r>
+              <w:rPr>
+                <w:rFonts w:ascii="Arial" w:hAnsi="Arial"/>
+                <w:b/>
+                <w:color w:val="FFFFFF"/>
+                <w:sz w:val="17"/>
+              </w:rPr>
+              <w:t>Model</w:t>
+            </w:r>
+          </w:p>
+        </w:tc>
+        <w:tc>
+          <w:tcPr>
+            <w:tcW w:type="dxa" w:w="2088"/>
+            <w:vAlign w:val="center"/>
+            <w:tcBorders>
+              <w:top w:val="single" w:sz="5" w:color="D9D9D9"/>
+              <w:left w:val="single" w:sz="5" w:color="D9D9D9"/>
+              <w:bottom w:val="single" w:sz="5" w:color="D9D9D9"/>
+              <w:right w:val="single" w:sz="5" w:color="D9D9D9"/>
+              <w:insideH w:val="single" w:sz="5" w:color="D9D9D9"/>
+              <w:insideV w:val="single" w:sz="5" w:color="D9D9D9"/>
+            </w:tcBorders>
+            <w:shd w:fill="172554"/>
+          </w:tcPr>
+          <w:p>
+            <w:pPr>
+              <w:spacing w:before="60" w:after="60" w:line="240" w:lineRule="auto"/>
+            </w:pPr>
+            <w:r>
+              <w:rPr>
+                <w:rFonts w:ascii="Arial" w:hAnsi="Arial"/>
+                <w:b/>
+                <w:color w:val="FFFFFF"/>
+                <w:sz w:val="17"/>
+              </w:rPr>
+              <w:t>Calibrated RMSLE</w:t>
+            </w:r>
+          </w:p>
+        </w:tc>
+        <w:tc>
+          <w:tcPr>
+            <w:tcW w:type="dxa" w:w="2088"/>
+            <w:vAlign w:val="center"/>
+            <w:tcBorders>
+              <w:top w:val="single" w:sz="5" w:color="D9D9D9"/>
+              <w:left w:val="single" w:sz="5" w:color="D9D9D9"/>
+              <w:bottom w:val="single" w:sz="5" w:color="D9D9D9"/>
+              <w:right w:val="single" w:sz="5" w:color="D9D9D9"/>
+              <w:insideH w:val="single" w:sz="5" w:color="D9D9D9"/>
+              <w:insideV w:val="single" w:sz="5" w:color="D9D9D9"/>
+            </w:tcBorders>
+            <w:shd w:fill="172554"/>
+          </w:tcPr>
+          <w:p>
+            <w:pPr>
+              <w:spacing w:before="60" w:after="60" w:line="240" w:lineRule="auto"/>
+            </w:pPr>
+            <w:r>
+              <w:rPr>
+                <w:rFonts w:ascii="Arial" w:hAnsi="Arial"/>
+                <w:b/>
+                <w:color w:val="FFFFFF"/>
+                <w:sz w:val="17"/>
+              </w:rPr>
+              <w:t>Global Spearman</w:t>
+            </w:r>
+          </w:p>
+        </w:tc>
+        <w:tc>
+          <w:tcPr>
+            <w:tcW w:type="dxa" w:w="2592"/>
+            <w:vAlign w:val="center"/>
+            <w:tcBorders>
+              <w:top w:val="single" w:sz="5" w:color="D9D9D9"/>
+              <w:left w:val="single" w:sz="5" w:color="D9D9D9"/>
+              <w:bottom w:val="single" w:sz="5" w:color="D9D9D9"/>
+              <w:right w:val="single" w:sz="5" w:color="D9D9D9"/>
+              <w:insideH w:val="single" w:sz="5" w:color="D9D9D9"/>
+              <w:insideV w:val="single" w:sz="5" w:color="D9D9D9"/>
+            </w:tcBorders>
+            <w:shd w:fill="172554"/>
+          </w:tcPr>
+          <w:p>
+            <w:pPr>
+              <w:spacing w:before="60" w:after="60" w:line="240" w:lineRule="auto"/>
+            </w:pPr>
+            <w:r>
+              <w:rPr>
+                <w:rFonts w:ascii="Arial" w:hAnsi="Arial"/>
+                <w:b/>
+                <w:color w:val="FFFFFF"/>
+                <w:sz w:val="17"/>
+              </w:rPr>
+              <w:t>Within-cell-type Spearman</w:t>
+            </w:r>
+          </w:p>
+        </w:tc>
+      </w:tr>
+      <w:tr>
+        <w:tc>
+          <w:tcPr>
+            <w:tcW w:type="dxa" w:w="3528"/>
+            <w:vAlign w:val="center"/>
+            <w:tcBorders>
+              <w:top w:val="single" w:sz="5" w:color="D9D9D9"/>
+              <w:left w:val="single" w:sz="5" w:color="D9D9D9"/>
+              <w:bottom w:val="single" w:sz="5" w:color="D9D9D9"/>
+              <w:right w:val="single" w:sz="5" w:color="D9D9D9"/>
+              <w:insideH w:val="single" w:sz="5" w:color="D9D9D9"/>
+              <w:insideV w:val="single" w:sz="5" w:color="D9D9D9"/>
+            </w:tcBorders>
+            <w:shd w:fill="FFFFFF"/>
+          </w:tcPr>
+          <w:p>
+            <w:pPr>
+              <w:spacing w:before="60" w:after="60" w:line="240" w:lineRule="auto"/>
+              <w:jc w:val="left"/>
+            </w:pPr>
+            <w:r>
+              <w:rPr>
+                <w:rFonts w:ascii="Arial" w:hAnsi="Arial"/>
+                <w:sz w:val="17"/>
+              </w:rPr>
+              <w:t>FusionVI</w:t>
+            </w:r>
+          </w:p>
+        </w:tc>
+        <w:tc>
+          <w:tcPr>
+            <w:tcW w:type="dxa" w:w="2088"/>
+            <w:vAlign w:val="center"/>
+            <w:tcBorders>
+              <w:top w:val="single" w:sz="5" w:color="D9D9D9"/>
+              <w:left w:val="single" w:sz="5" w:color="D9D9D9"/>
+              <w:bottom w:val="single" w:sz="5" w:color="D9D9D9"/>
+              <w:right w:val="single" w:sz="5" w:color="D9D9D9"/>
+              <w:insideH w:val="single" w:sz="5" w:color="D9D9D9"/>
+              <w:insideV w:val="single" w:sz="5" w:color="D9D9D9"/>
+            </w:tcBorders>
+            <w:shd w:fill="FFFFFF"/>
+          </w:tcPr>
+          <w:p>
+            <w:pPr>
+              <w:spacing w:before="60" w:after="60" w:line="240" w:lineRule="auto"/>
+              <w:jc w:val="center"/>
+            </w:pPr>
+            <w:r>
+              <w:rPr>
+                <w:rFonts w:ascii="Arial" w:hAnsi="Arial"/>
+                <w:sz w:val="17"/>
+              </w:rPr>
+              <w:t>0.5145</w:t>
+            </w:r>
+          </w:p>
+        </w:tc>
+        <w:tc>
+          <w:tcPr>
+            <w:tcW w:type="dxa" w:w="2088"/>
+            <w:vAlign w:val="center"/>
+            <w:tcBorders>
+              <w:top w:val="single" w:sz="5" w:color="D9D9D9"/>
+              <w:left w:val="single" w:sz="5" w:color="D9D9D9"/>
+              <w:bottom w:val="single" w:sz="5" w:color="D9D9D9"/>
+              <w:right w:val="single" w:sz="5" w:color="D9D9D9"/>
+              <w:insideH w:val="single" w:sz="5" w:color="D9D9D9"/>
+              <w:insideV w:val="single" w:sz="5" w:color="D9D9D9"/>
+            </w:tcBorders>
+            <w:shd w:fill="FFFFFF"/>
+          </w:tcPr>
+          <w:p>
+            <w:pPr>
+              <w:spacing w:before="60" w:after="60" w:line="240" w:lineRule="auto"/>
+              <w:jc w:val="center"/>
+            </w:pPr>
+            <w:r>
+              <w:rPr>
+                <w:rFonts w:ascii="Arial" w:hAnsi="Arial"/>
+                <w:sz w:val="17"/>
+              </w:rPr>
+              <w:t>0.2270</w:t>
+            </w:r>
+          </w:p>
+        </w:tc>
+        <w:tc>
+          <w:tcPr>
+            <w:tcW w:type="dxa" w:w="2592"/>
+            <w:vAlign w:val="center"/>
+            <w:tcBorders>
+              <w:top w:val="single" w:sz="5" w:color="D9D9D9"/>
+              <w:left w:val="single" w:sz="5" w:color="D9D9D9"/>
+              <w:bottom w:val="single" w:sz="5" w:color="D9D9D9"/>
+              <w:right w:val="single" w:sz="5" w:color="D9D9D9"/>
+              <w:insideH w:val="single" w:sz="5" w:color="D9D9D9"/>
+              <w:insideV w:val="single" w:sz="5" w:color="D9D9D9"/>
+            </w:tcBorders>
+            <w:shd w:fill="FFFFFF"/>
+          </w:tcPr>
+          <w:p>
+            <w:pPr>
+              <w:spacing w:before="60" w:after="60" w:line="240" w:lineRule="auto"/>
+              <w:jc w:val="center"/>
+            </w:pPr>
+            <w:r>
+              <w:rPr>
+                <w:rFonts w:ascii="Arial" w:hAnsi="Arial"/>
+                <w:sz w:val="17"/>
+              </w:rPr>
+              <w:t>0.1498</w:t>
+            </w:r>
+          </w:p>
+        </w:tc>
+      </w:tr>
+      <w:tr>
+        <w:tc>
+          <w:tcPr>
+            <w:tcW w:type="dxa" w:w="3528"/>
+            <w:vAlign w:val="center"/>
+            <w:tcBorders>
+              <w:top w:val="single" w:sz="5" w:color="D9D9D9"/>
+              <w:left w:val="single" w:sz="5" w:color="D9D9D9"/>
+              <w:bottom w:val="single" w:sz="5" w:color="D9D9D9"/>
+              <w:right w:val="single" w:sz="5" w:color="D9D9D9"/>
+              <w:insideH w:val="single" w:sz="5" w:color="D9D9D9"/>
+              <w:insideV w:val="single" w:sz="5" w:color="D9D9D9"/>
+            </w:tcBorders>
+            <w:shd w:fill="EFF6FF"/>
+          </w:tcPr>
+          <w:p>
+            <w:pPr>
+              <w:spacing w:before="60" w:after="60" w:line="240" w:lineRule="auto"/>
+              <w:jc w:val="left"/>
+            </w:pPr>
+            <w:r>
+              <w:rPr>
+                <w:rFonts w:ascii="Arial" w:hAnsi="Arial"/>
+                <w:sz w:val="17"/>
+              </w:rPr>
+              <w:t>Same-width totalVI</w:t>
+            </w:r>
+          </w:p>
+        </w:tc>
+        <w:tc>
+          <w:tcPr>
+            <w:tcW w:type="dxa" w:w="2088"/>
+            <w:vAlign w:val="center"/>
+            <w:tcBorders>
+              <w:top w:val="single" w:sz="5" w:color="D9D9D9"/>
+              <w:left w:val="single" w:sz="5" w:color="D9D9D9"/>
+              <w:bottom w:val="single" w:sz="5" w:color="D9D9D9"/>
+              <w:right w:val="single" w:sz="5" w:color="D9D9D9"/>
+              <w:insideH w:val="single" w:sz="5" w:color="D9D9D9"/>
+              <w:insideV w:val="single" w:sz="5" w:color="D9D9D9"/>
+            </w:tcBorders>
+            <w:shd w:fill="EFF6FF"/>
+          </w:tcPr>
+          <w:p>
+            <w:pPr>
+              <w:spacing w:before="60" w:after="60" w:line="240" w:lineRule="auto"/>
+              <w:jc w:val="center"/>
+            </w:pPr>
+            <w:r>
+              <w:rPr>
+                <w:rFonts w:ascii="Arial" w:hAnsi="Arial"/>
+                <w:sz w:val="17"/>
+              </w:rPr>
+              <w:t>0.5144</w:t>
+            </w:r>
+          </w:p>
+        </w:tc>
+        <w:tc>
+          <w:tcPr>
+            <w:tcW w:type="dxa" w:w="2088"/>
+            <w:vAlign w:val="center"/>
+            <w:tcBorders>
+              <w:top w:val="single" w:sz="5" w:color="D9D9D9"/>
+              <w:left w:val="single" w:sz="5" w:color="D9D9D9"/>
+              <w:bottom w:val="single" w:sz="5" w:color="D9D9D9"/>
+              <w:right w:val="single" w:sz="5" w:color="D9D9D9"/>
+              <w:insideH w:val="single" w:sz="5" w:color="D9D9D9"/>
+              <w:insideV w:val="single" w:sz="5" w:color="D9D9D9"/>
+            </w:tcBorders>
+            <w:shd w:fill="EFF6FF"/>
+          </w:tcPr>
+          <w:p>
+            <w:pPr>
+              <w:spacing w:before="60" w:after="60" w:line="240" w:lineRule="auto"/>
+              <w:jc w:val="center"/>
+            </w:pPr>
+            <w:r>
+              <w:rPr>
+                <w:rFonts w:ascii="Arial" w:hAnsi="Arial"/>
+                <w:sz w:val="17"/>
+              </w:rPr>
+              <w:t>0.2226</w:t>
+            </w:r>
+          </w:p>
+        </w:tc>
+        <w:tc>
+          <w:tcPr>
+            <w:tcW w:type="dxa" w:w="2592"/>
+            <w:vAlign w:val="center"/>
+            <w:tcBorders>
+              <w:top w:val="single" w:sz="5" w:color="D9D9D9"/>
+              <w:left w:val="single" w:sz="5" w:color="D9D9D9"/>
+              <w:bottom w:val="single" w:sz="5" w:color="D9D9D9"/>
+              <w:right w:val="single" w:sz="5" w:color="D9D9D9"/>
+              <w:insideH w:val="single" w:sz="5" w:color="D9D9D9"/>
+              <w:insideV w:val="single" w:sz="5" w:color="D9D9D9"/>
+            </w:tcBorders>
+            <w:shd w:fill="EFF6FF"/>
+          </w:tcPr>
+          <w:p>
+            <w:pPr>
+              <w:spacing w:before="60" w:after="60" w:line="240" w:lineRule="auto"/>
+              <w:jc w:val="center"/>
+            </w:pPr>
+            <w:r>
+              <w:rPr>
+                <w:rFonts w:ascii="Arial" w:hAnsi="Arial"/>
+                <w:sz w:val="17"/>
+              </w:rPr>
+              <w:t>0.1424</w:t>
+            </w:r>
+          </w:p>
+        </w:tc>
+      </w:tr>
+      <w:tr>
+        <w:tc>
+          <w:tcPr>
+            <w:tcW w:type="dxa" w:w="3528"/>
+            <w:vAlign w:val="center"/>
+            <w:tcBorders>
+              <w:top w:val="single" w:sz="5" w:color="D9D9D9"/>
+              <w:left w:val="single" w:sz="5" w:color="D9D9D9"/>
+              <w:bottom w:val="single" w:sz="5" w:color="D9D9D9"/>
+              <w:right w:val="single" w:sz="5" w:color="D9D9D9"/>
+              <w:insideH w:val="single" w:sz="5" w:color="D9D9D9"/>
+              <w:insideV w:val="single" w:sz="5" w:color="D9D9D9"/>
+            </w:tcBorders>
+            <w:shd w:fill="FFFFFF"/>
+          </w:tcPr>
+          <w:p>
+            <w:pPr>
+              <w:spacing w:before="60" w:after="60" w:line="240" w:lineRule="auto"/>
+              <w:jc w:val="left"/>
+            </w:pPr>
+            <w:r>
+              <w:rPr>
+                <w:rFonts w:ascii="Arial" w:hAnsi="Arial"/>
+                <w:sz w:val="17"/>
+              </w:rPr>
+              <w:t>RNA plus observed-panel ridge</w:t>
+            </w:r>
+          </w:p>
+        </w:tc>
+        <w:tc>
+          <w:tcPr>
+            <w:tcW w:type="dxa" w:w="2088"/>
+            <w:vAlign w:val="center"/>
+            <w:tcBorders>
+              <w:top w:val="single" w:sz="5" w:color="D9D9D9"/>
+              <w:left w:val="single" w:sz="5" w:color="D9D9D9"/>
+              <w:bottom w:val="single" w:sz="5" w:color="D9D9D9"/>
+              <w:right w:val="single" w:sz="5" w:color="D9D9D9"/>
+              <w:insideH w:val="single" w:sz="5" w:color="D9D9D9"/>
+              <w:insideV w:val="single" w:sz="5" w:color="D9D9D9"/>
+            </w:tcBorders>
+            <w:shd w:fill="FFFFFF"/>
+          </w:tcPr>
+          <w:p>
+            <w:pPr>
+              <w:spacing w:before="60" w:after="60" w:line="240" w:lineRule="auto"/>
+              <w:jc w:val="center"/>
+            </w:pPr>
+            <w:r>
+              <w:rPr>
+                <w:rFonts w:ascii="Arial" w:hAnsi="Arial"/>
+                <w:sz w:val="17"/>
+              </w:rPr>
+              <w:t>0.5093</w:t>
+            </w:r>
+          </w:p>
+        </w:tc>
+        <w:tc>
+          <w:tcPr>
+            <w:tcW w:type="dxa" w:w="2088"/>
+            <w:vAlign w:val="center"/>
+            <w:tcBorders>
+              <w:top w:val="single" w:sz="5" w:color="D9D9D9"/>
+              <w:left w:val="single" w:sz="5" w:color="D9D9D9"/>
+              <w:bottom w:val="single" w:sz="5" w:color="D9D9D9"/>
+              <w:right w:val="single" w:sz="5" w:color="D9D9D9"/>
+              <w:insideH w:val="single" w:sz="5" w:color="D9D9D9"/>
+              <w:insideV w:val="single" w:sz="5" w:color="D9D9D9"/>
+            </w:tcBorders>
+            <w:shd w:fill="FFFFFF"/>
+          </w:tcPr>
+          <w:p>
+            <w:pPr>
+              <w:spacing w:before="60" w:after="60" w:line="240" w:lineRule="auto"/>
+              <w:jc w:val="center"/>
+            </w:pPr>
+            <w:r>
+              <w:rPr>
+                <w:rFonts w:ascii="Arial" w:hAnsi="Arial"/>
+                <w:sz w:val="17"/>
+              </w:rPr>
+              <w:t>0.2689</w:t>
+            </w:r>
+          </w:p>
+        </w:tc>
+        <w:tc>
+          <w:tcPr>
+            <w:tcW w:type="dxa" w:w="2592"/>
+            <w:vAlign w:val="center"/>
+            <w:tcBorders>
+              <w:top w:val="single" w:sz="5" w:color="D9D9D9"/>
+              <w:left w:val="single" w:sz="5" w:color="D9D9D9"/>
+              <w:bottom w:val="single" w:sz="5" w:color="D9D9D9"/>
+              <w:right w:val="single" w:sz="5" w:color="D9D9D9"/>
+              <w:insideH w:val="single" w:sz="5" w:color="D9D9D9"/>
+              <w:insideV w:val="single" w:sz="5" w:color="D9D9D9"/>
+            </w:tcBorders>
+            <w:shd w:fill="FFFFFF"/>
+          </w:tcPr>
+          <w:p>
+            <w:pPr>
+              <w:spacing w:before="60" w:after="60" w:line="240" w:lineRule="auto"/>
+              <w:jc w:val="center"/>
+            </w:pPr>
+            <w:r>
+              <w:rPr>
+                <w:rFonts w:ascii="Arial" w:hAnsi="Arial"/>
+                <w:sz w:val="17"/>
+              </w:rPr>
+              <w:t>0.2036</w:t>
+            </w:r>
+          </w:p>
+        </w:tc>
+      </w:tr>
+      <w:tr>
+        <w:tc>
+          <w:tcPr>
+            <w:tcW w:type="dxa" w:w="3528"/>
+            <w:vAlign w:val="center"/>
+            <w:tcBorders>
+              <w:top w:val="single" w:sz="5" w:color="D9D9D9"/>
+              <w:left w:val="single" w:sz="5" w:color="D9D9D9"/>
+              <w:bottom w:val="single" w:sz="5" w:color="D9D9D9"/>
+              <w:right w:val="single" w:sz="5" w:color="D9D9D9"/>
+              <w:insideH w:val="single" w:sz="5" w:color="D9D9D9"/>
+              <w:insideV w:val="single" w:sz="5" w:color="D9D9D9"/>
+            </w:tcBorders>
+            <w:shd w:fill="EFF6FF"/>
+          </w:tcPr>
+          <w:p>
+            <w:pPr>
+              <w:spacing w:before="60" w:after="60" w:line="240" w:lineRule="auto"/>
+              <w:jc w:val="left"/>
+            </w:pPr>
+            <w:r>
+              <w:rPr>
+                <w:rFonts w:ascii="Arial" w:hAnsi="Arial"/>
+                <w:sz w:val="17"/>
+              </w:rPr>
+              <w:t>RNA-only ridge</w:t>
+            </w:r>
+          </w:p>
+        </w:tc>
+        <w:tc>
+          <w:tcPr>
+            <w:tcW w:type="dxa" w:w="2088"/>
+            <w:vAlign w:val="center"/>
+            <w:tcBorders>
+              <w:top w:val="single" w:sz="5" w:color="D9D9D9"/>
+              <w:left w:val="single" w:sz="5" w:color="D9D9D9"/>
+              <w:bottom w:val="single" w:sz="5" w:color="D9D9D9"/>
+              <w:right w:val="single" w:sz="5" w:color="D9D9D9"/>
+              <w:insideH w:val="single" w:sz="5" w:color="D9D9D9"/>
+              <w:insideV w:val="single" w:sz="5" w:color="D9D9D9"/>
+            </w:tcBorders>
+            <w:shd w:fill="EFF6FF"/>
+          </w:tcPr>
+          <w:p>
+            <w:pPr>
+              <w:spacing w:before="60" w:after="60" w:line="240" w:lineRule="auto"/>
+              <w:jc w:val="center"/>
+            </w:pPr>
+            <w:r>
+              <w:rPr>
+                <w:rFonts w:ascii="Arial" w:hAnsi="Arial"/>
+                <w:sz w:val="17"/>
+              </w:rPr>
+              <w:t>0.5231</w:t>
+            </w:r>
+          </w:p>
+        </w:tc>
+        <w:tc>
+          <w:tcPr>
+            <w:tcW w:type="dxa" w:w="2088"/>
+            <w:vAlign w:val="center"/>
+            <w:tcBorders>
+              <w:top w:val="single" w:sz="5" w:color="D9D9D9"/>
+              <w:left w:val="single" w:sz="5" w:color="D9D9D9"/>
+              <w:bottom w:val="single" w:sz="5" w:color="D9D9D9"/>
+              <w:right w:val="single" w:sz="5" w:color="D9D9D9"/>
+              <w:insideH w:val="single" w:sz="5" w:color="D9D9D9"/>
+              <w:insideV w:val="single" w:sz="5" w:color="D9D9D9"/>
+            </w:tcBorders>
+            <w:shd w:fill="EFF6FF"/>
+          </w:tcPr>
+          <w:p>
+            <w:pPr>
+              <w:spacing w:before="60" w:after="60" w:line="240" w:lineRule="auto"/>
+              <w:jc w:val="center"/>
+            </w:pPr>
+            <w:r>
+              <w:rPr>
+                <w:rFonts w:ascii="Arial" w:hAnsi="Arial"/>
+                <w:sz w:val="17"/>
+              </w:rPr>
+              <w:t>0.1838</w:t>
+            </w:r>
+          </w:p>
+        </w:tc>
+        <w:tc>
+          <w:tcPr>
+            <w:tcW w:type="dxa" w:w="2592"/>
+            <w:vAlign w:val="center"/>
+            <w:tcBorders>
+              <w:top w:val="single" w:sz="5" w:color="D9D9D9"/>
+              <w:left w:val="single" w:sz="5" w:color="D9D9D9"/>
+              <w:bottom w:val="single" w:sz="5" w:color="D9D9D9"/>
+              <w:right w:val="single" w:sz="5" w:color="D9D9D9"/>
+              <w:insideH w:val="single" w:sz="5" w:color="D9D9D9"/>
+              <w:insideV w:val="single" w:sz="5" w:color="D9D9D9"/>
+            </w:tcBorders>
+            <w:shd w:fill="EFF6FF"/>
+          </w:tcPr>
+          <w:p>
+            <w:pPr>
+              <w:spacing w:before="60" w:after="60" w:line="240" w:lineRule="auto"/>
+              <w:jc w:val="center"/>
+            </w:pPr>
+            <w:r>
+              <w:rPr>
+                <w:rFonts w:ascii="Arial" w:hAnsi="Arial"/>
+                <w:sz w:val="17"/>
+              </w:rPr>
+              <w:t>0.0828</w:t>
+            </w:r>
+          </w:p>
+        </w:tc>
+      </w:tr>
+    </w:tbl>
+    <w:p>
+      <w:pPr>
+        <w:spacing w:after="20"/>
+      </w:pPr>
+    </w:p>
+    <w:p>
+      <w:pPr>
+        <w:spacing w:after="140"/>
+      </w:pPr>
+      <w:r>
+        <w:rPr>
+          <w:b/>
+          <w:color w:val="C2410C"/>
+        </w:rPr>
+        <w:t>Result  FusionVI improved biological ranking over same-width totalVI, but not aggregate calibrated RMSLE.</w:t>
+      </w:r>
+    </w:p>
+    <w:p>
+      <w:r>
+        <w:t>FusionVI increased global Spearman by +0.0045 (95% CI +0.0032 to +0.0057; p=0.0016) and within-cell-type Spearman by +0.0074 (95% CI +0.0049 to +0.0098; p=0.0024). FusionVI won all four seeds on both ranking metrics. Pearson correlation also increased by +0.0087, and residual standard deviation decreased by -0.0013. Calibrated RMSLE was effectively tied: 0.5145 for FusionVI and 0.5144 for totalVI (difference +0.0001; 95% CI -0.0017 to +0.0020).</w:t>
+      </w:r>
+    </w:p>
+    <w:p>
+      <w:r>
+        <w:t>The RNA-plus-observed-panel ridge remained the strongest method, reaching 0.5093 calibrated RMSLE and 0.2036 within-cell-type Spearman. The neural comparison therefore supports a specific architectural gain in ranking relative to same-width totalVI, rather than state-of-the-art performance on the task.</w:t>
+      </w:r>
+    </w:p>
+    <w:p>
+      <w:pPr>
+        <w:keepNext/>
+        <w:jc w:val="center"/>
+      </w:pPr>
+      <w:r>
+        <w:drawing>
+          <wp:inline xmlns:a="http://schemas.openxmlformats.org/drawingml/2006/main" xmlns:pic="http://schemas.openxmlformats.org/drawingml/2006/picture">
+            <wp:extent cx="6126480" cy="1983906"/>
+            <wp:docPr id="5" name="Picture 5"/>
+            <wp:cNvGraphicFramePr>
+              <a:graphicFrameLocks noChangeAspect="1"/>
+            </wp:cNvGraphicFramePr>
+            <a:graphic>
+              <a:graphicData uri="http://schemas.openxmlformats.org/drawingml/2006/picture">
+                <pic:pic>
+                  <pic:nvPicPr>
+                    <pic:cNvPr id="0" name="sln206_partial_benchmark.png"/>
+                    <pic:cNvPicPr/>
+                  </pic:nvPicPr>
+                  <pic:blipFill>
+                    <a:blip r:embed="rId15"/>
+                    <a:stretch>
+                      <a:fillRect/>
+                    </a:stretch>
+                  </pic:blipFill>
+                  <pic:spPr>
+                    <a:xfrm>
+                      <a:off x="0" y="0"/>
+                      <a:ext cx="6126480" cy="1983906"/>
+                    </a:xfrm>
+                    <a:prstGeom prst="rect"/>
+                  </pic:spPr>
+                </pic:pic>
+              </a:graphicData>
+            </a:graphic>
+          </wp:inline>
+        </w:drawing>
+      </w:r>
+    </w:p>
+    <w:p>
+      <w:pPr>
+        <w:spacing w:after="140"/>
+        <w:jc w:val="center"/>
+      </w:pPr>
+      <w:r>
+        <w:rPr>
+          <w:i/>
+          <w:sz w:val="17"/>
+        </w:rPr>
+        <w:t>Figure 5. Frozen SLN206 partial-panel benchmark on the untouched D2 target batch.</w:t>
       </w:r>
     </w:p>
     <w:p>
@@ -4043,7 +4225,7 @@
     </w:p>
     <w:p>
       <w:r>
-        <w:t>The experiments support a narrow and biologically coherent contribution. The complete-panel experiment shows that FusionVI's original RMSLE lead is mainly calibration, while scale-free and residual metrics do not support stronger biological recovery. When other proteins remain available, measured protein context often contributes more than the learned latent. The Papalexi result shows that multimodal context can rank unseen PD-L1 perturbation effects, while the CMTM6 failure exposes a post-transcriptional boundary.</w:t>
+        <w:t>The experiments support a narrow and biologically coherent contribution. On the complete-panel experiment, likelihood-consistent totalVI has lower RMSLE and stronger within-cell-type ranking than FusionVI. When a substantial protein panel remains observed, the SLN206 experiment shows a small but consistent FusionVI ranking advantage over same-width totalVI. Measured protein context remains important, and a simple ridge baseline still performs best. The Papalexi result shows that multimodal context can rank unseen PD-L1 perturbation effects, while the CMTM6 failure exposes a post-transcriptional boundary.</w:t>
       </w:r>
     </w:p>
     <w:p>
@@ -4051,7 +4233,7 @@
         <w:pStyle w:val="ListBullet"/>
       </w:pPr>
       <w:r>
-        <w:t>Controlled benchmark result: the raw FusionVI RMSLE lead disappears after D1-only calibration.</w:t>
+        <w:t>Controlled benchmark result: FusionVI does not improve the likelihood-consistent complete-panel benchmark.</w:t>
       </w:r>
     </w:p>
     <w:p>
@@ -4059,7 +4241,23 @@
         <w:pStyle w:val="ListBullet"/>
       </w:pPr>
       <w:r>
-        <w:t>Scale diagnosis: calibration improves both neural models below the RNA ridge aggregate RMSLE.</w:t>
+        <w:t>Positive architectural result: FusionVI improves global and within-cell-type ranking in partial-panel transfer across all four frozen seeds.</w:t>
+      </w:r>
+    </w:p>
+    <w:p>
+      <w:pPr>
+        <w:pStyle w:val="ListBullet"/>
+      </w:pPr>
+      <w:r>
+        <w:t>Hard-baseline result: RNA plus observed-protein ridge remains stronger than both neural models on SLN206.</w:t>
+      </w:r>
+    </w:p>
+    <w:p>
+      <w:pPr>
+        <w:pStyle w:val="ListBullet"/>
+      </w:pPr>
+      <w:r>
+        <w:t>Readout diagnosis: the original apparent advantage came from omitting the learned protein-efficiency factor.</w:t>
       </w:r>
     </w:p>
     <w:p>
@@ -4136,6 +4334,14 @@
         <w:pStyle w:val="ListBullet"/>
       </w:pPr>
       <w:r>
+        <w:t>Partial-panel benchmark: one source-target batch pair and four frozen paired seeds; the small seed count limits precision.</w:t>
+      </w:r>
+    </w:p>
+    <w:p>
+      <w:pPr>
+        <w:pStyle w:val="ListBullet"/>
+      </w:pPr>
+      <w:r>
         <w:t>Same-width, parameter-matched and missingness-aware controls are complete; modality-dropout arms remain pending.</w:t>
       </w:r>
     </w:p>
@@ -4168,12 +4374,20 @@
         <w:pStyle w:val="ListBullet"/>
       </w:pPr>
       <w:r>
-        <w:t>Calibration outputs are stored in results/calibration_summary.csv and calibration_contrasts.csv.</w:t>
+        <w:t>Likelihood-consistent outputs are stored in results/calibration_summary_likelihood_correct.csv and calibration_contrasts_likelihood_correct.csv.</w:t>
+      </w:r>
+    </w:p>
+    <w:p>
+      <w:pPr>
+        <w:pStyle w:val="ListBullet"/>
+      </w:pPr>
+      <w:r>
+        <w:t>Partial-panel outputs are stored in results/calibration_summary_sln206_partial.csv and calibration_contrasts_sln206_partial.csv.</w:t>
       </w:r>
     </w:p>
     <w:p>
       <w:r>
-        <w:t>The current full-panel benchmark is reproduced with .\run_paper_benchmark.ps1. The original Lawlor and Papalexi training pipelines were not retained, so Experiments 1 and 2 are documented from saved held-out predictions, metrics and figures and are not reproducible from a fresh clone. The versioned Papalexi effect table reproduces the target-cluster bootstrap.</w:t>
+        <w:t>The current full-panel benchmark is reproduced with run_paper_benchmark.ps1. The original Lawlor and Papalexi training pipelines were not retained, so Experiments 1 and 2 are documented from saved held-out predictions, metrics and figures and are not reproducible from a fresh clone. The versioned Papalexi effect table reproduces the target-cluster bootstrap.</w:t>
       </w:r>
     </w:p>
     <w:p>

</xml_diff>